<commit_message>
updated readme, updated test procedures because of bug. made winform app, added database connection and DAO classes (DatabaseConnection for connectivity to database, AdminDao for creating players, LoginDao for username and password auth, configured the connection string, set the startup in program.cs to start on LoginForm which isnt yet made)
</commit_message>
<xml_diff>
--- a/DAT602_Assignment_1_Zandi_Galpin.docx
+++ b/DAT602_Assignment_1_Zandi_Galpin.docx
@@ -4175,7 +4175,7 @@
         </w:rPr>
         <w:lastRenderedPageBreak/>
         <w:drawing>
-          <wp:inline distT="0" distB="0" distL="0" distR="0" wp14:anchorId="34D8FA44" wp14:editId="6DEF2618">
+          <wp:inline distT="0" distB="0" distL="0" distR="0" wp14:anchorId="34D8FA44" wp14:editId="1BFB92AF">
             <wp:extent cx="5980527" cy="3831771"/>
             <wp:effectExtent l="0" t="0" r="1270" b="0"/>
             <wp:docPr id="1382950399" name="Picture 1"/>
@@ -4262,7 +4262,7 @@
           <w:noProof/>
         </w:rPr>
         <w:drawing>
-          <wp:inline distT="0" distB="0" distL="0" distR="0" wp14:anchorId="25116A31" wp14:editId="014923CD">
+          <wp:inline distT="0" distB="0" distL="0" distR="0" wp14:anchorId="25116A31" wp14:editId="6B97072F">
             <wp:extent cx="6019800" cy="3823100"/>
             <wp:effectExtent l="0" t="0" r="0" b="6350"/>
             <wp:docPr id="95383020" name="Picture 3"/>
@@ -5702,13 +5702,7 @@
           </w:tcPr>
           <w:p>
             <w:r>
-              <w:t xml:space="preserve">Email, Username, Password, Score, IsAdmin, IsLockedOut, </w:t>
-            </w:r>
-            <w:r>
-              <w:t>FailedLoginAttempts</w:t>
-            </w:r>
-            <w:r>
-              <w:t>, CreatedDate</w:t>
+              <w:t>Email, Username, Password, Score, IsAdmin, IsLockedOut, FailedLoginAttempts, CreatedDate</w:t>
             </w:r>
           </w:p>
         </w:tc>
@@ -5796,7 +5790,15 @@
               <w:t xml:space="preserve">Admin inserts a new tile next to an existing </w:t>
             </w:r>
             <w:r>
-              <w:t>tile to extend the board, or deletes an unoccupied tile</w:t>
+              <w:t xml:space="preserve">tile to extend the </w:t>
+            </w:r>
+            <w:proofErr w:type="gramStart"/>
+            <w:r>
+              <w:t>board, or</w:t>
+            </w:r>
+            <w:proofErr w:type="gramEnd"/>
+            <w:r>
+              <w:t xml:space="preserve"> deletes an unoccupied tile</w:t>
             </w:r>
             <w:r>
               <w:t>.</w:t>
@@ -6291,7 +6293,15 @@
           </w:tcPr>
           <w:p>
             <w:r>
-              <w:t xml:space="preserve">Same as player registration, but </w:t>
+              <w:t xml:space="preserve">Same as player </w:t>
+            </w:r>
+            <w:proofErr w:type="gramStart"/>
+            <w:r>
+              <w:t>registration, but</w:t>
+            </w:r>
+            <w:proofErr w:type="gramEnd"/>
+            <w:r>
+              <w:t xml:space="preserve"> </w:t>
             </w:r>
             <w:r>
               <w:t xml:space="preserve">done by an admin from the player </w:t>
@@ -6478,9 +6488,2129 @@
     </w:p>
     <w:p>
       <w:r>
-        <w:t>in progress</w:t>
-      </w:r>
-    </w:p>
+        <w:t xml:space="preserve">Note: Added “name” and “description” to  ITEMTYPE table. </w:t>
+      </w:r>
+    </w:p>
+    <w:p/>
+    <w:p>
+      <w:r>
+        <w:t>-- DAT602 Assignment 1, Ultimate Goose Fighter</w:t>
+      </w:r>
+    </w:p>
+    <w:p>
+      <w:r>
+        <w:t>-- Zandi Galpin</w:t>
+      </w:r>
+    </w:p>
+    <w:p/>
+    <w:p>
+      <w:r>
+        <w:t>-- one TSQL procedure that creates every table, constraint,</w:t>
+      </w:r>
+    </w:p>
+    <w:p>
+      <w:r>
+        <w:t>-- secondary index, and a set of test data covering all CRUD situations.</w:t>
+      </w:r>
+    </w:p>
+    <w:p/>
+    <w:p>
+      <w:r>
+        <w:t>--Rebuilds the database from scratch each time.</w:t>
+      </w:r>
+    </w:p>
+    <w:p>
+      <w:r>
+        <w:t>-- SINGLE_USER + ROLLBACK IMMEDIATE gets rid of any other open connections</w:t>
+      </w:r>
+    </w:p>
+    <w:p/>
+    <w:p>
+      <w:r>
+        <w:t>USE master;</w:t>
+      </w:r>
+    </w:p>
+    <w:p>
+      <w:r>
+        <w:t>GO</w:t>
+      </w:r>
+    </w:p>
+    <w:p/>
+    <w:p>
+      <w:r>
+        <w:t>IF DB_ID(</w:t>
+      </w:r>
+      <w:proofErr w:type="spellStart"/>
+      <w:r>
+        <w:t>N'GooseFighterDB</w:t>
+      </w:r>
+      <w:proofErr w:type="spellEnd"/>
+      <w:r>
+        <w:t>') IS NOT NULL</w:t>
+      </w:r>
+    </w:p>
+    <w:p>
+      <w:r>
+        <w:t>BEGIN</w:t>
+      </w:r>
+    </w:p>
+    <w:p>
+      <w:r>
+        <w:t xml:space="preserve">    ALTER DATABASE </w:t>
+      </w:r>
+      <w:proofErr w:type="spellStart"/>
+      <w:r>
+        <w:t>GooseFighterDB</w:t>
+      </w:r>
+      <w:proofErr w:type="spellEnd"/>
+      <w:r>
+        <w:t xml:space="preserve"> SET SINGLE_USER WITH ROLLBACK IMMEDIATE;</w:t>
+      </w:r>
+    </w:p>
+    <w:p>
+      <w:r>
+        <w:t xml:space="preserve">    DROP DATABASE </w:t>
+      </w:r>
+      <w:proofErr w:type="spellStart"/>
+      <w:r>
+        <w:t>GooseFighterDB</w:t>
+      </w:r>
+      <w:proofErr w:type="spellEnd"/>
+      <w:r>
+        <w:t>;</w:t>
+      </w:r>
+    </w:p>
+    <w:p>
+      <w:r>
+        <w:t>END</w:t>
+      </w:r>
+    </w:p>
+    <w:p>
+      <w:r>
+        <w:t>GO</w:t>
+      </w:r>
+    </w:p>
+    <w:p/>
+    <w:p>
+      <w:r>
+        <w:t xml:space="preserve">CREATE DATABASE </w:t>
+      </w:r>
+      <w:proofErr w:type="spellStart"/>
+      <w:r>
+        <w:t>GooseFighterDB</w:t>
+      </w:r>
+      <w:proofErr w:type="spellEnd"/>
+      <w:r>
+        <w:t>;</w:t>
+      </w:r>
+    </w:p>
+    <w:p>
+      <w:r>
+        <w:t>GO</w:t>
+      </w:r>
+    </w:p>
+    <w:p/>
+    <w:p>
+      <w:r>
+        <w:t xml:space="preserve">USE </w:t>
+      </w:r>
+      <w:proofErr w:type="spellStart"/>
+      <w:r>
+        <w:t>GooseFighterDB</w:t>
+      </w:r>
+      <w:proofErr w:type="spellEnd"/>
+      <w:r>
+        <w:t>;</w:t>
+      </w:r>
+    </w:p>
+    <w:p>
+      <w:r>
+        <w:lastRenderedPageBreak/>
+        <w:t>GO</w:t>
+      </w:r>
+    </w:p>
+    <w:p/>
+    <w:p>
+      <w:r>
+        <w:t xml:space="preserve">CREATE OR ALTER PROCEDURE </w:t>
+      </w:r>
+      <w:proofErr w:type="spellStart"/>
+      <w:r>
+        <w:t>dbo.usp_CreateGooseFighterDatabase</w:t>
+      </w:r>
+      <w:proofErr w:type="spellEnd"/>
+    </w:p>
+    <w:p>
+      <w:r>
+        <w:t>AS</w:t>
+      </w:r>
+    </w:p>
+    <w:p/>
+    <w:p>
+      <w:r>
+        <w:t>BEGIN</w:t>
+      </w:r>
+    </w:p>
+    <w:p>
+      <w:r>
+        <w:t>    SET NOCOUNT ON;</w:t>
+      </w:r>
+    </w:p>
+    <w:p/>
+    <w:p>
+      <w:r>
+        <w:t>    -- Drop existing tables (child tables first)</w:t>
+      </w:r>
+    </w:p>
+    <w:p>
+      <w:r>
+        <w:t>    IF OBJECT_ID('</w:t>
+      </w:r>
+      <w:proofErr w:type="spellStart"/>
+      <w:r>
+        <w:t>dbo.ChatMessage</w:t>
+      </w:r>
+      <w:proofErr w:type="spellEnd"/>
+      <w:r>
+        <w:t xml:space="preserve">', 'U') IS NOT NULL DROP TABLE </w:t>
+      </w:r>
+      <w:proofErr w:type="spellStart"/>
+      <w:r>
+        <w:t>dbo.ChatMessage</w:t>
+      </w:r>
+      <w:proofErr w:type="spellEnd"/>
+      <w:r>
+        <w:t>;</w:t>
+      </w:r>
+    </w:p>
+    <w:p>
+      <w:r>
+        <w:t>    IF OBJECT_ID('</w:t>
+      </w:r>
+      <w:proofErr w:type="spellStart"/>
+      <w:r>
+        <w:t>dbo.Item</w:t>
+      </w:r>
+      <w:proofErr w:type="spellEnd"/>
+      <w:r>
+        <w:t xml:space="preserve">', 'U')        IS NOT NULL DROP TABLE </w:t>
+      </w:r>
+      <w:proofErr w:type="spellStart"/>
+      <w:r>
+        <w:t>dbo.Item</w:t>
+      </w:r>
+      <w:proofErr w:type="spellEnd"/>
+      <w:r>
+        <w:t>;</w:t>
+      </w:r>
+    </w:p>
+    <w:p>
+      <w:r>
+        <w:t>    IF OBJECT_ID('</w:t>
+      </w:r>
+      <w:proofErr w:type="spellStart"/>
+      <w:r>
+        <w:t>dbo.NPC</w:t>
+      </w:r>
+      <w:proofErr w:type="spellEnd"/>
+      <w:r>
+        <w:t xml:space="preserve">', 'U')         IS NOT NULL DROP TABLE </w:t>
+      </w:r>
+      <w:proofErr w:type="spellStart"/>
+      <w:r>
+        <w:t>dbo.NPC</w:t>
+      </w:r>
+      <w:proofErr w:type="spellEnd"/>
+      <w:r>
+        <w:t>;</w:t>
+      </w:r>
+    </w:p>
+    <w:p>
+      <w:r>
+        <w:t>    IF OBJECT_ID('</w:t>
+      </w:r>
+      <w:proofErr w:type="spellStart"/>
+      <w:r>
+        <w:t>dbo.ItemType</w:t>
+      </w:r>
+      <w:proofErr w:type="spellEnd"/>
+      <w:r>
+        <w:t xml:space="preserve">', 'U')    IS NOT NULL DROP TABLE </w:t>
+      </w:r>
+      <w:proofErr w:type="spellStart"/>
+      <w:r>
+        <w:t>dbo.ItemType</w:t>
+      </w:r>
+      <w:proofErr w:type="spellEnd"/>
+      <w:r>
+        <w:t>;</w:t>
+      </w:r>
+    </w:p>
+    <w:p>
+      <w:r>
+        <w:t>    IF OBJECT_ID('</w:t>
+      </w:r>
+      <w:proofErr w:type="spellStart"/>
+      <w:r>
+        <w:t>dbo.Nest</w:t>
+      </w:r>
+      <w:proofErr w:type="spellEnd"/>
+      <w:r>
+        <w:t xml:space="preserve">', 'U')        IS NOT NULL DROP TABLE </w:t>
+      </w:r>
+      <w:proofErr w:type="spellStart"/>
+      <w:r>
+        <w:t>dbo.Nest</w:t>
+      </w:r>
+      <w:proofErr w:type="spellEnd"/>
+      <w:r>
+        <w:t>;</w:t>
+      </w:r>
+    </w:p>
+    <w:p>
+      <w:r>
+        <w:t>    IF OBJECT_ID('</w:t>
+      </w:r>
+      <w:proofErr w:type="spellStart"/>
+      <w:r>
+        <w:t>dbo.Player</w:t>
+      </w:r>
+      <w:proofErr w:type="spellEnd"/>
+      <w:r>
+        <w:t xml:space="preserve">', 'U')      IS NOT NULL DROP TABLE </w:t>
+      </w:r>
+      <w:proofErr w:type="spellStart"/>
+      <w:r>
+        <w:t>dbo.Player</w:t>
+      </w:r>
+      <w:proofErr w:type="spellEnd"/>
+      <w:r>
+        <w:t>;</w:t>
+      </w:r>
+    </w:p>
+    <w:p>
+      <w:r>
+        <w:t>    IF OBJECT_ID('</w:t>
+      </w:r>
+      <w:proofErr w:type="spellStart"/>
+      <w:r>
+        <w:t>dbo.Tile</w:t>
+      </w:r>
+      <w:proofErr w:type="spellEnd"/>
+      <w:r>
+        <w:t xml:space="preserve">', 'U')        IS NOT NULL DROP TABLE </w:t>
+      </w:r>
+      <w:proofErr w:type="spellStart"/>
+      <w:r>
+        <w:t>dbo.Tile</w:t>
+      </w:r>
+      <w:proofErr w:type="spellEnd"/>
+      <w:r>
+        <w:t>;</w:t>
+      </w:r>
+    </w:p>
+    <w:p/>
+    <w:p>
+      <w:r>
+        <w:t>    --TILE: the game board. No dependencies (made first)</w:t>
+      </w:r>
+    </w:p>
+    <w:p>
+      <w:r>
+        <w:t xml:space="preserve">    CREATE TABLE </w:t>
+      </w:r>
+      <w:proofErr w:type="spellStart"/>
+      <w:r>
+        <w:t>dbo.Tile</w:t>
+      </w:r>
+      <w:proofErr w:type="spellEnd"/>
+      <w:r>
+        <w:t xml:space="preserve"> (</w:t>
+      </w:r>
+    </w:p>
+    <w:p>
+      <w:r>
+        <w:t>        TileID      INT IDENTITY(1,1) NOT NULL,</w:t>
+      </w:r>
+    </w:p>
+    <w:p>
+      <w:r>
+        <w:t>        XPosition   INT NOT NULL,</w:t>
+      </w:r>
+    </w:p>
+    <w:p>
+      <w:r>
+        <w:t>        YPosition   INT NOT NULL,</w:t>
+      </w:r>
+    </w:p>
+    <w:p>
+      <w:r>
+        <w:t xml:space="preserve">        </w:t>
+      </w:r>
+      <w:proofErr w:type="spellStart"/>
+      <w:r>
+        <w:t>IsOccupied</w:t>
+      </w:r>
+      <w:proofErr w:type="spellEnd"/>
+      <w:r>
+        <w:t xml:space="preserve">  BIT NOT NULL DEFAULT (0),</w:t>
+      </w:r>
+    </w:p>
+    <w:p>
+      <w:r>
+        <w:t xml:space="preserve">        CONSTRAINT </w:t>
+      </w:r>
+      <w:proofErr w:type="spellStart"/>
+      <w:r>
+        <w:t>PK_Tile</w:t>
+      </w:r>
+      <w:proofErr w:type="spellEnd"/>
+      <w:r>
+        <w:t xml:space="preserve"> PRIMARY KEY CLUSTERED (TileID),</w:t>
+      </w:r>
+    </w:p>
+    <w:p>
+      <w:r>
+        <w:t xml:space="preserve">        CONSTRAINT </w:t>
+      </w:r>
+      <w:proofErr w:type="spellStart"/>
+      <w:r>
+        <w:t>UQ_Tile_Position</w:t>
+      </w:r>
+      <w:proofErr w:type="spellEnd"/>
+      <w:r>
+        <w:t xml:space="preserve"> UNIQUE (XPosition, YPosition)</w:t>
+      </w:r>
+    </w:p>
+    <w:p>
+      <w:r>
+        <w:t>    );</w:t>
+      </w:r>
+    </w:p>
+    <w:p/>
+    <w:p>
+      <w:r>
+        <w:t>    --PLAYER: accounts and live player state.</w:t>
+      </w:r>
+    </w:p>
+    <w:p>
+      <w:r>
+        <w:lastRenderedPageBreak/>
+        <w:t xml:space="preserve">    CREATE TABLE </w:t>
+      </w:r>
+      <w:proofErr w:type="spellStart"/>
+      <w:r>
+        <w:t>dbo.Player</w:t>
+      </w:r>
+      <w:proofErr w:type="spellEnd"/>
+      <w:r>
+        <w:t xml:space="preserve"> (</w:t>
+      </w:r>
+    </w:p>
+    <w:p>
+      <w:r>
+        <w:t xml:space="preserve">        </w:t>
+      </w:r>
+      <w:proofErr w:type="spellStart"/>
+      <w:r>
+        <w:t>PlayerID</w:t>
+      </w:r>
+      <w:proofErr w:type="spellEnd"/>
+      <w:r>
+        <w:t xml:space="preserve">             INT IDENTITY(1,1) NOT NULL,</w:t>
+      </w:r>
+    </w:p>
+    <w:p>
+      <w:r>
+        <w:t>        Email                VARCHAR(255) NOT NULL,</w:t>
+      </w:r>
+    </w:p>
+    <w:p>
+      <w:r>
+        <w:t>        Username             VARCHAR(100)  NOT NULL,</w:t>
+      </w:r>
+    </w:p>
+    <w:p>
+      <w:r>
+        <w:t>        Password             VARCHAR(100) NOT NULL,</w:t>
+      </w:r>
+    </w:p>
+    <w:p>
+      <w:r>
+        <w:t>        Score                INT NOT NULL DEFAULT (0),</w:t>
+      </w:r>
+    </w:p>
+    <w:p>
+      <w:r>
+        <w:t>        Health               INT NOT NULL DEFAULT (4000),</w:t>
+      </w:r>
+    </w:p>
+    <w:p>
+      <w:r>
+        <w:t>        IsAdmin              BIT NOT NULL DEFAULT (0),</w:t>
+      </w:r>
+    </w:p>
+    <w:p>
+      <w:r>
+        <w:t>        IsOnline             BIT NOT NULL DEFAULT (0),</w:t>
+      </w:r>
+    </w:p>
+    <w:p>
+      <w:r>
+        <w:t>        FailedLoginAttempts  INT NOT NULL DEFAULT (0),</w:t>
+      </w:r>
+    </w:p>
+    <w:p>
+      <w:r>
+        <w:t>        IsLockedOut          BIT NOT NULL DEFAULT (0),</w:t>
+      </w:r>
+    </w:p>
+    <w:p>
+      <w:r>
+        <w:t>        CurrentTileID        INT NULL,</w:t>
+      </w:r>
+    </w:p>
+    <w:p>
+      <w:r>
+        <w:t xml:space="preserve">        </w:t>
+      </w:r>
+      <w:proofErr w:type="spellStart"/>
+      <w:r>
+        <w:t>IsInvincible</w:t>
+      </w:r>
+      <w:proofErr w:type="spellEnd"/>
+      <w:r>
+        <w:t xml:space="preserve">         BIT NOT NULL DEFAULT (0),</w:t>
+      </w:r>
+    </w:p>
+    <w:p>
+      <w:r>
+        <w:t xml:space="preserve">        </w:t>
+      </w:r>
+      <w:proofErr w:type="spellStart"/>
+      <w:r>
+        <w:t>InvincibleUntil</w:t>
+      </w:r>
+      <w:proofErr w:type="spellEnd"/>
+      <w:r>
+        <w:t xml:space="preserve">      DATETIME NULL,</w:t>
+      </w:r>
+    </w:p>
+    <w:p>
+      <w:r>
+        <w:t>        CreatedDate          DATETIME NOT NULL DEFAULT (GETDATE()),</w:t>
+      </w:r>
+    </w:p>
+    <w:p>
+      <w:r>
+        <w:t xml:space="preserve">        CONSTRAINT </w:t>
+      </w:r>
+      <w:proofErr w:type="spellStart"/>
+      <w:r>
+        <w:t>PK_Player</w:t>
+      </w:r>
+      <w:proofErr w:type="spellEnd"/>
+      <w:r>
+        <w:t xml:space="preserve"> PRIMARY KEY CLUSTERED (</w:t>
+      </w:r>
+      <w:proofErr w:type="spellStart"/>
+      <w:r>
+        <w:t>PlayerID</w:t>
+      </w:r>
+      <w:proofErr w:type="spellEnd"/>
+      <w:r>
+        <w:t>),</w:t>
+      </w:r>
+    </w:p>
+    <w:p>
+      <w:r>
+        <w:t xml:space="preserve">        CONSTRAINT </w:t>
+      </w:r>
+      <w:proofErr w:type="spellStart"/>
+      <w:r>
+        <w:t>UQ_Player_Email</w:t>
+      </w:r>
+      <w:proofErr w:type="spellEnd"/>
+      <w:r>
+        <w:t xml:space="preserve"> UNIQUE (Email),</w:t>
+      </w:r>
+    </w:p>
+    <w:p>
+      <w:r>
+        <w:t xml:space="preserve">        CONSTRAINT </w:t>
+      </w:r>
+      <w:proofErr w:type="spellStart"/>
+      <w:r>
+        <w:t>UQ_Player_Username</w:t>
+      </w:r>
+      <w:proofErr w:type="spellEnd"/>
+      <w:r>
+        <w:t xml:space="preserve"> UNIQUE (Username),</w:t>
+      </w:r>
+    </w:p>
+    <w:p>
+      <w:r>
+        <w:t xml:space="preserve">        CONSTRAINT </w:t>
+      </w:r>
+      <w:proofErr w:type="spellStart"/>
+      <w:r>
+        <w:t>FK_Player_Tile</w:t>
+      </w:r>
+      <w:proofErr w:type="spellEnd"/>
+      <w:r>
+        <w:t xml:space="preserve"> FOREIGN KEY (CurrentTileID)</w:t>
+      </w:r>
+    </w:p>
+    <w:p>
+      <w:r>
+        <w:t xml:space="preserve">            REFERENCES </w:t>
+      </w:r>
+      <w:proofErr w:type="spellStart"/>
+      <w:r>
+        <w:t>dbo.Tile</w:t>
+      </w:r>
+      <w:proofErr w:type="spellEnd"/>
+      <w:r>
+        <w:t xml:space="preserve"> (TileID),</w:t>
+      </w:r>
+    </w:p>
+    <w:p>
+      <w:r>
+        <w:t xml:space="preserve">        CONSTRAINT </w:t>
+      </w:r>
+      <w:proofErr w:type="spellStart"/>
+      <w:r>
+        <w:t>CK_Player_FailedLoginAttempts</w:t>
+      </w:r>
+      <w:proofErr w:type="spellEnd"/>
+    </w:p>
+    <w:p>
+      <w:r>
+        <w:t>            CHECK (FailedLoginAttempts BETWEEN 0 AND 5),</w:t>
+      </w:r>
+    </w:p>
+    <w:p>
+      <w:r>
+        <w:t xml:space="preserve">        CONSTRAINT </w:t>
+      </w:r>
+      <w:proofErr w:type="spellStart"/>
+      <w:r>
+        <w:t>CK_Player_Health</w:t>
+      </w:r>
+      <w:proofErr w:type="spellEnd"/>
+    </w:p>
+    <w:p>
+      <w:r>
+        <w:t>            CHECK (Health BETWEEN 0 AND 4000)</w:t>
+      </w:r>
+    </w:p>
+    <w:p>
+      <w:r>
+        <w:t>    );</w:t>
+      </w:r>
+    </w:p>
+    <w:p/>
+    <w:p>
+      <w:r>
+        <w:t xml:space="preserve">    --Secondary index: because the list for who is online is queried very </w:t>
+      </w:r>
+      <w:proofErr w:type="spellStart"/>
+      <w:r>
+        <w:t>very</w:t>
+      </w:r>
+      <w:proofErr w:type="spellEnd"/>
+      <w:r>
+        <w:t xml:space="preserve"> often</w:t>
+      </w:r>
+    </w:p>
+    <w:p>
+      <w:r>
+        <w:t xml:space="preserve">    CREATE NONCLUSTERED INDEX </w:t>
+      </w:r>
+      <w:proofErr w:type="spellStart"/>
+      <w:r>
+        <w:t>IX_Player_IsOnline</w:t>
+      </w:r>
+      <w:proofErr w:type="spellEnd"/>
+      <w:r>
+        <w:t xml:space="preserve"> ON </w:t>
+      </w:r>
+      <w:proofErr w:type="spellStart"/>
+      <w:r>
+        <w:t>dbo.Player</w:t>
+      </w:r>
+      <w:proofErr w:type="spellEnd"/>
+      <w:r>
+        <w:t xml:space="preserve"> (IsOnline);</w:t>
+      </w:r>
+    </w:p>
+    <w:p/>
+    <w:p>
+      <w:r>
+        <w:t>    --NEST: one per player, sits on the tile they spawn in on.</w:t>
+      </w:r>
+    </w:p>
+    <w:p>
+      <w:r>
+        <w:t xml:space="preserve">    CREATE TABLE </w:t>
+      </w:r>
+      <w:proofErr w:type="spellStart"/>
+      <w:r>
+        <w:t>dbo.Nest</w:t>
+      </w:r>
+      <w:proofErr w:type="spellEnd"/>
+      <w:r>
+        <w:t xml:space="preserve"> (</w:t>
+      </w:r>
+    </w:p>
+    <w:p>
+      <w:r>
+        <w:t>        NestID    INT IDENTITY(1,1) NOT NULL,</w:t>
+      </w:r>
+    </w:p>
+    <w:p>
+      <w:r>
+        <w:t xml:space="preserve">        </w:t>
+      </w:r>
+      <w:proofErr w:type="spellStart"/>
+      <w:r>
+        <w:t>PlayerID</w:t>
+      </w:r>
+      <w:proofErr w:type="spellEnd"/>
+      <w:r>
+        <w:t xml:space="preserve">  INT NOT NULL,</w:t>
+      </w:r>
+    </w:p>
+    <w:p>
+      <w:r>
+        <w:t>        TileID    INT NOT NULL,</w:t>
+      </w:r>
+    </w:p>
+    <w:p>
+      <w:r>
+        <w:t xml:space="preserve">        CONSTRAINT </w:t>
+      </w:r>
+      <w:proofErr w:type="spellStart"/>
+      <w:r>
+        <w:t>PK_Nest</w:t>
+      </w:r>
+      <w:proofErr w:type="spellEnd"/>
+      <w:r>
+        <w:t xml:space="preserve"> PRIMARY KEY CLUSTERED (NestID),</w:t>
+      </w:r>
+    </w:p>
+    <w:p>
+      <w:r>
+        <w:t xml:space="preserve">        CONSTRAINT </w:t>
+      </w:r>
+      <w:proofErr w:type="spellStart"/>
+      <w:r>
+        <w:t>UQ_Nest_Player</w:t>
+      </w:r>
+      <w:proofErr w:type="spellEnd"/>
+      <w:r>
+        <w:t xml:space="preserve"> UNIQUE (</w:t>
+      </w:r>
+      <w:proofErr w:type="spellStart"/>
+      <w:r>
+        <w:t>PlayerID</w:t>
+      </w:r>
+      <w:proofErr w:type="spellEnd"/>
+      <w:r>
+        <w:t>),   --1 nest per player</w:t>
+      </w:r>
+    </w:p>
+    <w:p>
+      <w:r>
+        <w:t xml:space="preserve">        CONSTRAINT </w:t>
+      </w:r>
+      <w:proofErr w:type="spellStart"/>
+      <w:r>
+        <w:t>UQ_Nest_Tile</w:t>
+      </w:r>
+      <w:proofErr w:type="spellEnd"/>
+      <w:r>
+        <w:t xml:space="preserve"> UNIQUE (TileID),       --1 nest per tile</w:t>
+      </w:r>
+    </w:p>
+    <w:p>
+      <w:r>
+        <w:t xml:space="preserve">        CONSTRAINT </w:t>
+      </w:r>
+      <w:proofErr w:type="spellStart"/>
+      <w:r>
+        <w:t>FK_Nest_Player</w:t>
+      </w:r>
+      <w:proofErr w:type="spellEnd"/>
+      <w:r>
+        <w:t xml:space="preserve"> FOREIGN KEY (</w:t>
+      </w:r>
+      <w:proofErr w:type="spellStart"/>
+      <w:r>
+        <w:t>PlayerID</w:t>
+      </w:r>
+      <w:proofErr w:type="spellEnd"/>
+      <w:r>
+        <w:t>)</w:t>
+      </w:r>
+    </w:p>
+    <w:p>
+      <w:r>
+        <w:t xml:space="preserve">            REFERENCES </w:t>
+      </w:r>
+      <w:proofErr w:type="spellStart"/>
+      <w:r>
+        <w:t>dbo.Player</w:t>
+      </w:r>
+      <w:proofErr w:type="spellEnd"/>
+      <w:r>
+        <w:t xml:space="preserve"> (</w:t>
+      </w:r>
+      <w:proofErr w:type="spellStart"/>
+      <w:r>
+        <w:t>PlayerID</w:t>
+      </w:r>
+      <w:proofErr w:type="spellEnd"/>
+      <w:r>
+        <w:t>) ON DELETE CASCADE,</w:t>
+      </w:r>
+    </w:p>
+    <w:p>
+      <w:r>
+        <w:t xml:space="preserve">        CONSTRAINT </w:t>
+      </w:r>
+      <w:proofErr w:type="spellStart"/>
+      <w:r>
+        <w:t>FK_Nest_Tile</w:t>
+      </w:r>
+      <w:proofErr w:type="spellEnd"/>
+      <w:r>
+        <w:t xml:space="preserve"> FOREIGN KEY (TileID)</w:t>
+      </w:r>
+    </w:p>
+    <w:p>
+      <w:r>
+        <w:t xml:space="preserve">            REFERENCES </w:t>
+      </w:r>
+      <w:proofErr w:type="spellStart"/>
+      <w:r>
+        <w:t>dbo.Tile</w:t>
+      </w:r>
+      <w:proofErr w:type="spellEnd"/>
+      <w:r>
+        <w:t xml:space="preserve"> (TileID)</w:t>
+      </w:r>
+    </w:p>
+    <w:p>
+      <w:r>
+        <w:t>    );</w:t>
+      </w:r>
+    </w:p>
+    <w:p/>
+    <w:p>
+      <w:r>
+        <w:t>    --ITEMTYPE: lookup table for holdable/consumable items.</w:t>
+      </w:r>
+    </w:p>
+    <w:p>
+      <w:r>
+        <w:t xml:space="preserve">    CREATE TABLE </w:t>
+      </w:r>
+      <w:proofErr w:type="spellStart"/>
+      <w:r>
+        <w:t>dbo.ItemType</w:t>
+      </w:r>
+      <w:proofErr w:type="spellEnd"/>
+      <w:r>
+        <w:t xml:space="preserve"> (</w:t>
+      </w:r>
+    </w:p>
+    <w:p>
+      <w:r>
+        <w:t>        ItemTypeID         INT IDENTITY(1,1) NOT NULL,</w:t>
+      </w:r>
+    </w:p>
+    <w:p>
+      <w:r>
+        <w:t>        Name               VARCHAR(50) NOT NULL,</w:t>
+      </w:r>
+    </w:p>
+    <w:p>
+      <w:r>
+        <w:t>        Category           VARCHAR(20) NOT NULL,</w:t>
+      </w:r>
+    </w:p>
+    <w:p>
+      <w:r>
+        <w:t xml:space="preserve">        </w:t>
+      </w:r>
+      <w:proofErr w:type="spellStart"/>
+      <w:r>
+        <w:t>EffectDescription</w:t>
+      </w:r>
+      <w:proofErr w:type="spellEnd"/>
+      <w:r>
+        <w:t xml:space="preserve">  VARCHAR(200) NULL,</w:t>
+      </w:r>
+    </w:p>
+    <w:p>
+      <w:r>
+        <w:t xml:space="preserve">        </w:t>
+      </w:r>
+      <w:proofErr w:type="spellStart"/>
+      <w:r>
+        <w:t>SpawnRate</w:t>
+      </w:r>
+      <w:proofErr w:type="spellEnd"/>
+      <w:r>
+        <w:t xml:space="preserve">          DECIMAL(5,2) NULL,</w:t>
+      </w:r>
+    </w:p>
+    <w:p>
+      <w:r>
+        <w:t xml:space="preserve">        CONSTRAINT </w:t>
+      </w:r>
+      <w:proofErr w:type="spellStart"/>
+      <w:r>
+        <w:t>PK_ItemType</w:t>
+      </w:r>
+      <w:proofErr w:type="spellEnd"/>
+      <w:r>
+        <w:t xml:space="preserve"> PRIMARY KEY CLUSTERED (ItemTypeID),</w:t>
+      </w:r>
+    </w:p>
+    <w:p>
+      <w:r>
+        <w:t xml:space="preserve">        CONSTRAINT </w:t>
+      </w:r>
+      <w:proofErr w:type="spellStart"/>
+      <w:r>
+        <w:t>UQ_ItemType_Name</w:t>
+      </w:r>
+      <w:proofErr w:type="spellEnd"/>
+      <w:r>
+        <w:t xml:space="preserve"> UNIQUE (Name),</w:t>
+      </w:r>
+    </w:p>
+    <w:p>
+      <w:r>
+        <w:t xml:space="preserve">        CONSTRAINT </w:t>
+      </w:r>
+      <w:proofErr w:type="spellStart"/>
+      <w:r>
+        <w:t>CK_ItemType_Category</w:t>
+      </w:r>
+      <w:proofErr w:type="spellEnd"/>
+    </w:p>
+    <w:p>
+      <w:r>
+        <w:t>            CHECK (Category IN ('Holdable', 'Consumable')),</w:t>
+      </w:r>
+    </w:p>
+    <w:p>
+      <w:r>
+        <w:t xml:space="preserve">        CONSTRAINT </w:t>
+      </w:r>
+      <w:proofErr w:type="spellStart"/>
+      <w:r>
+        <w:t>CK_ItemType_SpawnRate</w:t>
+      </w:r>
+      <w:proofErr w:type="spellEnd"/>
+    </w:p>
+    <w:p>
+      <w:r>
+        <w:t>            CHECK (</w:t>
+      </w:r>
+      <w:proofErr w:type="spellStart"/>
+      <w:r>
+        <w:t>SpawnRate</w:t>
+      </w:r>
+      <w:proofErr w:type="spellEnd"/>
+      <w:r>
+        <w:t xml:space="preserve"> IS NULL OR </w:t>
+      </w:r>
+      <w:proofErr w:type="spellStart"/>
+      <w:r>
+        <w:t>SpawnRate</w:t>
+      </w:r>
+      <w:proofErr w:type="spellEnd"/>
+      <w:r>
+        <w:t xml:space="preserve"> BETWEEN 0 AND 100)</w:t>
+      </w:r>
+    </w:p>
+    <w:p>
+      <w:r>
+        <w:lastRenderedPageBreak/>
+        <w:t>    );</w:t>
+      </w:r>
+    </w:p>
+    <w:p/>
+    <w:p>
+      <w:r>
+        <w:t>    --ITEM: one row per item. Exactly one of TileID/HolderPlayerID/NestID is non null at once.</w:t>
+      </w:r>
+    </w:p>
+    <w:p>
+      <w:r>
+        <w:t xml:space="preserve">    CREATE TABLE </w:t>
+      </w:r>
+      <w:proofErr w:type="spellStart"/>
+      <w:r>
+        <w:t>dbo.Item</w:t>
+      </w:r>
+      <w:proofErr w:type="spellEnd"/>
+      <w:r>
+        <w:t xml:space="preserve"> (</w:t>
+      </w:r>
+    </w:p>
+    <w:p>
+      <w:r>
+        <w:t xml:space="preserve">        </w:t>
+      </w:r>
+      <w:proofErr w:type="spellStart"/>
+      <w:r>
+        <w:t>ItemID</w:t>
+      </w:r>
+      <w:proofErr w:type="spellEnd"/>
+      <w:r>
+        <w:t xml:space="preserve">          INT IDENTITY(1,1) NOT NULL,</w:t>
+      </w:r>
+    </w:p>
+    <w:p>
+      <w:r>
+        <w:t>        ItemTypeID      INT NOT NULL,</w:t>
+      </w:r>
+    </w:p>
+    <w:p>
+      <w:r>
+        <w:t>        TileID          INT NULL,</w:t>
+      </w:r>
+    </w:p>
+    <w:p>
+      <w:r>
+        <w:t>        HolderPlayerID  INT NULL,</w:t>
+      </w:r>
+    </w:p>
+    <w:p>
+      <w:r>
+        <w:t>        NestID          INT NULL,</w:t>
+      </w:r>
+    </w:p>
+    <w:p>
+      <w:r>
+        <w:t>        Ammo            INT NULL,</w:t>
+      </w:r>
+    </w:p>
+    <w:p>
+      <w:r>
+        <w:t xml:space="preserve">        CONSTRAINT </w:t>
+      </w:r>
+      <w:proofErr w:type="spellStart"/>
+      <w:r>
+        <w:t>PK_Item</w:t>
+      </w:r>
+      <w:proofErr w:type="spellEnd"/>
+      <w:r>
+        <w:t xml:space="preserve"> PRIMARY KEY CLUSTERED (</w:t>
+      </w:r>
+      <w:proofErr w:type="spellStart"/>
+      <w:r>
+        <w:t>ItemID</w:t>
+      </w:r>
+      <w:proofErr w:type="spellEnd"/>
+      <w:r>
+        <w:t>),</w:t>
+      </w:r>
+    </w:p>
+    <w:p>
+      <w:r>
+        <w:t xml:space="preserve">        CONSTRAINT </w:t>
+      </w:r>
+      <w:proofErr w:type="spellStart"/>
+      <w:r>
+        <w:t>FK_Item_ItemType</w:t>
+      </w:r>
+      <w:proofErr w:type="spellEnd"/>
+      <w:r>
+        <w:t xml:space="preserve"> FOREIGN KEY (ItemTypeID)</w:t>
+      </w:r>
+    </w:p>
+    <w:p>
+      <w:r>
+        <w:t xml:space="preserve">            REFERENCES </w:t>
+      </w:r>
+      <w:proofErr w:type="spellStart"/>
+      <w:r>
+        <w:t>dbo.ItemType</w:t>
+      </w:r>
+      <w:proofErr w:type="spellEnd"/>
+      <w:r>
+        <w:t xml:space="preserve"> (ItemTypeID),</w:t>
+      </w:r>
+    </w:p>
+    <w:p>
+      <w:r>
+        <w:t xml:space="preserve">        CONSTRAINT </w:t>
+      </w:r>
+      <w:proofErr w:type="spellStart"/>
+      <w:r>
+        <w:t>FK_Item_Tile</w:t>
+      </w:r>
+      <w:proofErr w:type="spellEnd"/>
+      <w:r>
+        <w:t xml:space="preserve"> FOREIGN KEY (TileID)</w:t>
+      </w:r>
+    </w:p>
+    <w:p>
+      <w:r>
+        <w:t xml:space="preserve">            REFERENCES </w:t>
+      </w:r>
+      <w:proofErr w:type="spellStart"/>
+      <w:r>
+        <w:t>dbo.Tile</w:t>
+      </w:r>
+      <w:proofErr w:type="spellEnd"/>
+      <w:r>
+        <w:t xml:space="preserve"> (TileID),</w:t>
+      </w:r>
+    </w:p>
+    <w:p>
+      <w:r>
+        <w:t xml:space="preserve">        CONSTRAINT </w:t>
+      </w:r>
+      <w:proofErr w:type="spellStart"/>
+      <w:r>
+        <w:t>FK_Item_Player</w:t>
+      </w:r>
+      <w:proofErr w:type="spellEnd"/>
+      <w:r>
+        <w:t xml:space="preserve"> FOREIGN KEY (HolderPlayerID)</w:t>
+      </w:r>
+    </w:p>
+    <w:p>
+      <w:r>
+        <w:t xml:space="preserve">            REFERENCES </w:t>
+      </w:r>
+      <w:proofErr w:type="spellStart"/>
+      <w:r>
+        <w:t>dbo.Player</w:t>
+      </w:r>
+      <w:proofErr w:type="spellEnd"/>
+      <w:r>
+        <w:t xml:space="preserve"> (</w:t>
+      </w:r>
+      <w:proofErr w:type="spellStart"/>
+      <w:r>
+        <w:t>PlayerID</w:t>
+      </w:r>
+      <w:proofErr w:type="spellEnd"/>
+      <w:r>
+        <w:t>),</w:t>
+      </w:r>
+    </w:p>
+    <w:p>
+      <w:r>
+        <w:t xml:space="preserve">        CONSTRAINT </w:t>
+      </w:r>
+      <w:proofErr w:type="spellStart"/>
+      <w:r>
+        <w:t>FK_Item_Nest</w:t>
+      </w:r>
+      <w:proofErr w:type="spellEnd"/>
+      <w:r>
+        <w:t xml:space="preserve"> FOREIGN KEY (NestID)</w:t>
+      </w:r>
+    </w:p>
+    <w:p>
+      <w:r>
+        <w:t xml:space="preserve">            REFERENCES </w:t>
+      </w:r>
+      <w:proofErr w:type="spellStart"/>
+      <w:r>
+        <w:t>dbo.Nest</w:t>
+      </w:r>
+      <w:proofErr w:type="spellEnd"/>
+      <w:r>
+        <w:t xml:space="preserve"> (NestID),</w:t>
+      </w:r>
+    </w:p>
+    <w:p>
+      <w:r>
+        <w:t xml:space="preserve">        CONSTRAINT </w:t>
+      </w:r>
+      <w:proofErr w:type="spellStart"/>
+      <w:r>
+        <w:t>CK_Item_Ammo</w:t>
+      </w:r>
+      <w:proofErr w:type="spellEnd"/>
+      <w:r>
+        <w:t xml:space="preserve"> CHECK (Ammo IS NULL OR Ammo &gt;= 0),</w:t>
+      </w:r>
+    </w:p>
+    <w:p>
+      <w:r>
+        <w:t>        CONSTRAINT CK_Item_OneLocation CHECK (</w:t>
+      </w:r>
+    </w:p>
+    <w:p>
+      <w:r>
+        <w:t>            (CASE WHEN TileID IS NOT NULL THEN 1 ELSE 0 END</w:t>
+      </w:r>
+    </w:p>
+    <w:p>
+      <w:r>
+        <w:t>           + CASE WHEN HolderPlayerID IS NOT NULL THEN 1 ELSE 0 END</w:t>
+      </w:r>
+    </w:p>
+    <w:p>
+      <w:r>
+        <w:t>           + CASE WHEN NestID IS NOT NULL THEN 1 ELSE 0 END) = 1</w:t>
+      </w:r>
+    </w:p>
+    <w:p>
+      <w:r>
+        <w:t>        )</w:t>
+      </w:r>
+    </w:p>
+    <w:p>
+      <w:r>
+        <w:t>    );</w:t>
+      </w:r>
+    </w:p>
+    <w:p/>
+    <w:p>
+      <w:r>
+        <w:lastRenderedPageBreak/>
+        <w:t xml:space="preserve">    CREATE NONCLUSTERED INDEX </w:t>
+      </w:r>
+      <w:proofErr w:type="spellStart"/>
+      <w:r>
+        <w:t>IX_Item_TileID</w:t>
+      </w:r>
+      <w:proofErr w:type="spellEnd"/>
+      <w:r>
+        <w:t xml:space="preserve"> ON </w:t>
+      </w:r>
+      <w:proofErr w:type="spellStart"/>
+      <w:r>
+        <w:t>dbo.Item</w:t>
+      </w:r>
+      <w:proofErr w:type="spellEnd"/>
+      <w:r>
+        <w:t xml:space="preserve"> (TileID);</w:t>
+      </w:r>
+    </w:p>
+    <w:p>
+      <w:r>
+        <w:t xml:space="preserve">    CREATE NONCLUSTERED INDEX </w:t>
+      </w:r>
+      <w:proofErr w:type="spellStart"/>
+      <w:r>
+        <w:t>IX_Item_HolderPlayerID</w:t>
+      </w:r>
+      <w:proofErr w:type="spellEnd"/>
+      <w:r>
+        <w:t xml:space="preserve"> ON </w:t>
+      </w:r>
+      <w:proofErr w:type="spellStart"/>
+      <w:r>
+        <w:t>dbo.Item</w:t>
+      </w:r>
+      <w:proofErr w:type="spellEnd"/>
+      <w:r>
+        <w:t xml:space="preserve"> (HolderPlayerID);</w:t>
+      </w:r>
+    </w:p>
+    <w:p>
+      <w:r>
+        <w:t xml:space="preserve">    CREATE NONCLUSTERED INDEX </w:t>
+      </w:r>
+      <w:proofErr w:type="spellStart"/>
+      <w:r>
+        <w:t>IX_Item_NestID</w:t>
+      </w:r>
+      <w:proofErr w:type="spellEnd"/>
+      <w:r>
+        <w:t xml:space="preserve"> ON </w:t>
+      </w:r>
+      <w:proofErr w:type="spellStart"/>
+      <w:r>
+        <w:t>dbo.Item</w:t>
+      </w:r>
+      <w:proofErr w:type="spellEnd"/>
+      <w:r>
+        <w:t xml:space="preserve"> (NestID);</w:t>
+      </w:r>
+    </w:p>
+    <w:p/>
+    <w:p>
+      <w:r>
+        <w:t>    --NPC (grey goose) table</w:t>
+      </w:r>
+    </w:p>
+    <w:p>
+      <w:r>
+        <w:t xml:space="preserve">    CREATE TABLE </w:t>
+      </w:r>
+      <w:proofErr w:type="spellStart"/>
+      <w:r>
+        <w:t>dbo.NPC</w:t>
+      </w:r>
+      <w:proofErr w:type="spellEnd"/>
+      <w:r>
+        <w:t xml:space="preserve"> (</w:t>
+      </w:r>
+    </w:p>
+    <w:p>
+      <w:r>
+        <w:t>        NPCID        INT IDENTITY(1,1) NOT NULL,</w:t>
+      </w:r>
+    </w:p>
+    <w:p>
+      <w:r>
+        <w:t>        TileID       INT NOT NULL,</w:t>
+      </w:r>
+    </w:p>
+    <w:p>
+      <w:r>
+        <w:t>        Health       INT NOT NULL DEFAULT (1000),</w:t>
+      </w:r>
+    </w:p>
+    <w:p>
+      <w:r>
+        <w:t xml:space="preserve">        </w:t>
+      </w:r>
+      <w:proofErr w:type="spellStart"/>
+      <w:r>
+        <w:t>MaxHealth</w:t>
+      </w:r>
+      <w:proofErr w:type="spellEnd"/>
+      <w:r>
+        <w:t xml:space="preserve">    INT NOT NULL DEFAULT (1000),</w:t>
+      </w:r>
+    </w:p>
+    <w:p>
+      <w:r>
+        <w:t>        IsAlive      BIT NOT NULL DEFAULT (1),</w:t>
+      </w:r>
+    </w:p>
+    <w:p>
+      <w:r>
+        <w:t>        RespawnTime  DATETIME NULL,</w:t>
+      </w:r>
+    </w:p>
+    <w:p>
+      <w:r>
+        <w:t>        CONSTRAINT PK_NPC PRIMARY KEY CLUSTERED (NPCID),</w:t>
+      </w:r>
+    </w:p>
+    <w:p>
+      <w:r>
+        <w:t xml:space="preserve">        CONSTRAINT </w:t>
+      </w:r>
+      <w:proofErr w:type="spellStart"/>
+      <w:r>
+        <w:t>FK_NPC_Tile</w:t>
+      </w:r>
+      <w:proofErr w:type="spellEnd"/>
+      <w:r>
+        <w:t xml:space="preserve"> FOREIGN KEY (TileID)</w:t>
+      </w:r>
+    </w:p>
+    <w:p>
+      <w:r>
+        <w:t xml:space="preserve">            REFERENCES </w:t>
+      </w:r>
+      <w:proofErr w:type="spellStart"/>
+      <w:r>
+        <w:t>dbo.Tile</w:t>
+      </w:r>
+      <w:proofErr w:type="spellEnd"/>
+      <w:r>
+        <w:t xml:space="preserve"> (TileID),</w:t>
+      </w:r>
+    </w:p>
+    <w:p>
+      <w:r>
+        <w:t xml:space="preserve">        CONSTRAINT </w:t>
+      </w:r>
+      <w:proofErr w:type="spellStart"/>
+      <w:r>
+        <w:t>CK_NPC_Health</w:t>
+      </w:r>
+      <w:proofErr w:type="spellEnd"/>
+      <w:r>
+        <w:t xml:space="preserve"> CHECK (Health BETWEEN 0 AND </w:t>
+      </w:r>
+      <w:proofErr w:type="spellStart"/>
+      <w:r>
+        <w:t>MaxHealth</w:t>
+      </w:r>
+      <w:proofErr w:type="spellEnd"/>
+      <w:r>
+        <w:t>)</w:t>
+      </w:r>
+    </w:p>
+    <w:p>
+      <w:r>
+        <w:t>    );</w:t>
+      </w:r>
+    </w:p>
+    <w:p/>
+    <w:p>
+      <w:r>
+        <w:t>    --CHATMESSAGE: global broadcast chat</w:t>
+      </w:r>
+    </w:p>
+    <w:p>
+      <w:r>
+        <w:t xml:space="preserve">    CREATE TABLE </w:t>
+      </w:r>
+      <w:proofErr w:type="spellStart"/>
+      <w:r>
+        <w:t>dbo.ChatMessage</w:t>
+      </w:r>
+      <w:proofErr w:type="spellEnd"/>
+      <w:r>
+        <w:t xml:space="preserve"> (</w:t>
+      </w:r>
+    </w:p>
+    <w:p>
+      <w:r>
+        <w:t xml:space="preserve">        </w:t>
+      </w:r>
+      <w:proofErr w:type="spellStart"/>
+      <w:r>
+        <w:t>MessageID</w:t>
+      </w:r>
+      <w:proofErr w:type="spellEnd"/>
+      <w:r>
+        <w:t xml:space="preserve">       INT IDENTITY(1,1) NOT NULL,</w:t>
+      </w:r>
+    </w:p>
+    <w:p>
+      <w:r>
+        <w:t>        SenderPlayerID  INT NOT NULL,</w:t>
+      </w:r>
+    </w:p>
+    <w:p>
+      <w:r>
+        <w:t xml:space="preserve">        </w:t>
+      </w:r>
+      <w:proofErr w:type="spellStart"/>
+      <w:r>
+        <w:t>MessageText</w:t>
+      </w:r>
+      <w:proofErr w:type="spellEnd"/>
+      <w:r>
+        <w:t xml:space="preserve">     VARCHAR(500) NOT NULL,</w:t>
+      </w:r>
+    </w:p>
+    <w:p>
+      <w:r>
+        <w:t xml:space="preserve">        </w:t>
+      </w:r>
+      <w:proofErr w:type="spellStart"/>
+      <w:r>
+        <w:t>SentDate</w:t>
+      </w:r>
+      <w:proofErr w:type="spellEnd"/>
+      <w:r>
+        <w:t xml:space="preserve">        DATETIME NOT NULL DEFAULT (GETDATE()),</w:t>
+      </w:r>
+    </w:p>
+    <w:p>
+      <w:r>
+        <w:t xml:space="preserve">        CONSTRAINT </w:t>
+      </w:r>
+      <w:proofErr w:type="spellStart"/>
+      <w:r>
+        <w:t>PK_ChatMessage</w:t>
+      </w:r>
+      <w:proofErr w:type="spellEnd"/>
+      <w:r>
+        <w:t xml:space="preserve"> PRIMARY KEY CLUSTERED (</w:t>
+      </w:r>
+      <w:proofErr w:type="spellStart"/>
+      <w:r>
+        <w:t>MessageID</w:t>
+      </w:r>
+      <w:proofErr w:type="spellEnd"/>
+      <w:r>
+        <w:t>),</w:t>
+      </w:r>
+    </w:p>
+    <w:p>
+      <w:r>
+        <w:t xml:space="preserve">        CONSTRAINT </w:t>
+      </w:r>
+      <w:proofErr w:type="spellStart"/>
+      <w:r>
+        <w:t>FK_ChatMessage_Player</w:t>
+      </w:r>
+      <w:proofErr w:type="spellEnd"/>
+      <w:r>
+        <w:t xml:space="preserve"> FOREIGN KEY (SenderPlayerID)</w:t>
+      </w:r>
+    </w:p>
+    <w:p>
+      <w:r>
+        <w:t xml:space="preserve">            REFERENCES </w:t>
+      </w:r>
+      <w:proofErr w:type="spellStart"/>
+      <w:r>
+        <w:t>dbo.Player</w:t>
+      </w:r>
+      <w:proofErr w:type="spellEnd"/>
+      <w:r>
+        <w:t xml:space="preserve"> (</w:t>
+      </w:r>
+      <w:proofErr w:type="spellStart"/>
+      <w:r>
+        <w:t>PlayerID</w:t>
+      </w:r>
+      <w:proofErr w:type="spellEnd"/>
+      <w:r>
+        <w:t>) ON DELETE CASCADE</w:t>
+      </w:r>
+    </w:p>
+    <w:p>
+      <w:r>
+        <w:lastRenderedPageBreak/>
+        <w:t>    );</w:t>
+      </w:r>
+    </w:p>
+    <w:p/>
+    <w:p>
+      <w:r>
+        <w:t xml:space="preserve">    CREATE NONCLUSTERED INDEX </w:t>
+      </w:r>
+      <w:proofErr w:type="spellStart"/>
+      <w:r>
+        <w:t>IX_ChatMessage_SentDate</w:t>
+      </w:r>
+      <w:proofErr w:type="spellEnd"/>
+      <w:r>
+        <w:t xml:space="preserve"> ON </w:t>
+      </w:r>
+      <w:proofErr w:type="spellStart"/>
+      <w:r>
+        <w:t>dbo.ChatMessage</w:t>
+      </w:r>
+      <w:proofErr w:type="spellEnd"/>
+      <w:r>
+        <w:t xml:space="preserve"> (</w:t>
+      </w:r>
+      <w:proofErr w:type="spellStart"/>
+      <w:r>
+        <w:t>SentDate</w:t>
+      </w:r>
+      <w:proofErr w:type="spellEnd"/>
+      <w:r>
+        <w:t>);</w:t>
+      </w:r>
+    </w:p>
+    <w:p/>
+    <w:p>
+      <w:r>
+        <w:t>    --TEST DATA: covers every CRUD situation from the CRUD table:</w:t>
+      </w:r>
+    </w:p>
+    <w:p>
+      <w:r>
+        <w:t>    --login/lockout, registration, tile layout, item placement,</w:t>
+      </w:r>
+    </w:p>
+    <w:p>
+      <w:r>
+        <w:t>    --movement, scoring, inventory, NPC/item movement, chat</w:t>
+      </w:r>
+    </w:p>
+    <w:p>
+      <w:r>
+        <w:t>    -- Tiles: a 5x5 board (25 tiles), IDs assigned 1-25 in x-then-y order</w:t>
+      </w:r>
+    </w:p>
+    <w:p>
+      <w:r>
+        <w:t>    DECLARE @x INT = 0, @y INT;</w:t>
+      </w:r>
+    </w:p>
+    <w:p>
+      <w:r>
+        <w:t>    WHILE @x &lt; 5</w:t>
+      </w:r>
+    </w:p>
+    <w:p>
+      <w:r>
+        <w:t>    BEGIN</w:t>
+      </w:r>
+    </w:p>
+    <w:p>
+      <w:r>
+        <w:t>        SET @y = 0;</w:t>
+      </w:r>
+    </w:p>
+    <w:p>
+      <w:r>
+        <w:t>        WHILE @y &lt; 5</w:t>
+      </w:r>
+    </w:p>
+    <w:p>
+      <w:r>
+        <w:t>        BEGIN</w:t>
+      </w:r>
+    </w:p>
+    <w:p>
+      <w:r>
+        <w:t xml:space="preserve">            INSERT INTO </w:t>
+      </w:r>
+      <w:proofErr w:type="spellStart"/>
+      <w:r>
+        <w:t>dbo.Tile</w:t>
+      </w:r>
+      <w:proofErr w:type="spellEnd"/>
+      <w:r>
+        <w:t xml:space="preserve"> (XPosition, YPosition) VALUES (@x, @y);</w:t>
+      </w:r>
+    </w:p>
+    <w:p>
+      <w:r>
+        <w:t>            SET @y += 1;</w:t>
+      </w:r>
+    </w:p>
+    <w:p>
+      <w:r>
+        <w:t>        END</w:t>
+      </w:r>
+    </w:p>
+    <w:p>
+      <w:r>
+        <w:t>        SET @x += 1;</w:t>
+      </w:r>
+    </w:p>
+    <w:p>
+      <w:r>
+        <w:t>    END</w:t>
+      </w:r>
+    </w:p>
+    <w:p/>
+    <w:p>
+      <w:r>
+        <w:t>    --Players: has admin, online player, offline player,</w:t>
+      </w:r>
+    </w:p>
+    <w:p>
+      <w:r>
+        <w:t>    --locked-out player, and an admin created player who has</w:t>
+      </w:r>
+    </w:p>
+    <w:p>
+      <w:r>
+        <w:t>    -- never logged in (no nest and no CurrentTileID yet)</w:t>
+      </w:r>
+    </w:p>
+    <w:p>
+      <w:r>
+        <w:t xml:space="preserve">    INSERT INTO </w:t>
+      </w:r>
+      <w:proofErr w:type="spellStart"/>
+      <w:r>
+        <w:t>dbo.Player</w:t>
+      </w:r>
+      <w:proofErr w:type="spellEnd"/>
+      <w:r>
+        <w:t xml:space="preserve"> (Email, Username, Password, IsAdmin, IsOnline)</w:t>
+      </w:r>
+    </w:p>
+    <w:p>
+      <w:r>
+        <w:t>    VALUES ('admin@goosefighter.com', '</w:t>
+      </w:r>
+      <w:proofErr w:type="spellStart"/>
+      <w:r>
+        <w:t>AdminGoose</w:t>
+      </w:r>
+      <w:proofErr w:type="spellEnd"/>
+      <w:r>
+        <w:t>', 'AdminPass123!', 1, 0);</w:t>
+      </w:r>
+    </w:p>
+    <w:p/>
+    <w:p>
+      <w:r>
+        <w:t xml:space="preserve">    INSERT INTO </w:t>
+      </w:r>
+      <w:proofErr w:type="spellStart"/>
+      <w:r>
+        <w:t>dbo.Player</w:t>
+      </w:r>
+      <w:proofErr w:type="spellEnd"/>
+      <w:r>
+        <w:t xml:space="preserve"> (Email, Username, Password, Score, Health, IsOnline, CurrentTileID)</w:t>
+      </w:r>
+    </w:p>
+    <w:p>
+      <w:r>
+        <w:lastRenderedPageBreak/>
+        <w:t>    VALUES ('zandi@example.com', '</w:t>
+      </w:r>
+      <w:proofErr w:type="spellStart"/>
+      <w:r>
+        <w:t>ZandiGoose</w:t>
+      </w:r>
+      <w:proofErr w:type="spellEnd"/>
+      <w:r>
+        <w:t>', 'Password123', 3, 3100, 1, 13);</w:t>
+      </w:r>
+    </w:p>
+    <w:p/>
+    <w:p>
+      <w:r>
+        <w:t xml:space="preserve">    INSERT INTO </w:t>
+      </w:r>
+      <w:proofErr w:type="spellStart"/>
+      <w:r>
+        <w:t>dbo.Player</w:t>
+      </w:r>
+      <w:proofErr w:type="spellEnd"/>
+      <w:r>
+        <w:t xml:space="preserve"> (Email, Username, Password, Score, Health, IsOnline, CurrentTileID)</w:t>
+      </w:r>
+    </w:p>
+    <w:p>
+      <w:r>
+        <w:t>    VALUES ('mcplayer@example.com', '</w:t>
+      </w:r>
+      <w:proofErr w:type="spellStart"/>
+      <w:r>
+        <w:t>McPlayerTwoington</w:t>
+      </w:r>
+      <w:proofErr w:type="spellEnd"/>
+      <w:r>
+        <w:t>', 'Passw0rd!', 5, 4000, 0, 7);</w:t>
+      </w:r>
+    </w:p>
+    <w:p/>
+    <w:p>
+      <w:r>
+        <w:t xml:space="preserve">    INSERT INTO </w:t>
+      </w:r>
+      <w:proofErr w:type="spellStart"/>
+      <w:r>
+        <w:t>dbo.Player</w:t>
+      </w:r>
+      <w:proofErr w:type="spellEnd"/>
+      <w:r>
+        <w:t xml:space="preserve"> (Email, Username, Password, FailedLoginAttempts, IsLockedOut)</w:t>
+      </w:r>
+    </w:p>
+    <w:p>
+      <w:r>
+        <w:t>    VALUES ('lockedout@example.com', '</w:t>
+      </w:r>
+      <w:proofErr w:type="spellStart"/>
+      <w:r>
+        <w:t>LockedGoose</w:t>
+      </w:r>
+      <w:proofErr w:type="spellEnd"/>
+      <w:r>
+        <w:t>', '</w:t>
+      </w:r>
+      <w:proofErr w:type="spellStart"/>
+      <w:r>
+        <w:t>wrongpass</w:t>
+      </w:r>
+      <w:proofErr w:type="spellEnd"/>
+      <w:r>
+        <w:t>', 5, 1);</w:t>
+      </w:r>
+    </w:p>
+    <w:p/>
+    <w:p>
+      <w:r>
+        <w:t xml:space="preserve">    INSERT INTO </w:t>
+      </w:r>
+      <w:proofErr w:type="spellStart"/>
+      <w:r>
+        <w:t>dbo.Player</w:t>
+      </w:r>
+      <w:proofErr w:type="spellEnd"/>
+      <w:r>
+        <w:t xml:space="preserve"> (Email, Username, Password)</w:t>
+      </w:r>
+    </w:p>
+    <w:p>
+      <w:r>
+        <w:t>    VALUES ('newplayer@example.com', '</w:t>
+      </w:r>
+      <w:proofErr w:type="spellStart"/>
+      <w:r>
+        <w:t>BranfNewGoose</w:t>
+      </w:r>
+      <w:proofErr w:type="spellEnd"/>
+      <w:r>
+        <w:t>', 'TempPass1');</w:t>
+      </w:r>
+    </w:p>
+    <w:p/>
+    <w:p>
+      <w:r>
+        <w:t>    --nests for the two players who have spawned in</w:t>
+      </w:r>
+    </w:p>
+    <w:p>
+      <w:r>
+        <w:t xml:space="preserve">    INSERT INTO </w:t>
+      </w:r>
+      <w:proofErr w:type="spellStart"/>
+      <w:r>
+        <w:t>dbo.Nest</w:t>
+      </w:r>
+      <w:proofErr w:type="spellEnd"/>
+      <w:r>
+        <w:t xml:space="preserve"> (</w:t>
+      </w:r>
+      <w:proofErr w:type="spellStart"/>
+      <w:r>
+        <w:t>PlayerID</w:t>
+      </w:r>
+      <w:proofErr w:type="spellEnd"/>
+      <w:r>
+        <w:t xml:space="preserve">, TileID) VALUES (2, 13); -- </w:t>
+      </w:r>
+      <w:proofErr w:type="spellStart"/>
+      <w:r>
+        <w:t>ZandiGoose</w:t>
+      </w:r>
+      <w:proofErr w:type="spellEnd"/>
+    </w:p>
+    <w:p>
+      <w:r>
+        <w:t xml:space="preserve">    INSERT INTO </w:t>
+      </w:r>
+      <w:proofErr w:type="spellStart"/>
+      <w:r>
+        <w:t>dbo.Nest</w:t>
+      </w:r>
+      <w:proofErr w:type="spellEnd"/>
+      <w:r>
+        <w:t xml:space="preserve"> (</w:t>
+      </w:r>
+      <w:proofErr w:type="spellStart"/>
+      <w:r>
+        <w:t>PlayerID</w:t>
+      </w:r>
+      <w:proofErr w:type="spellEnd"/>
+      <w:r>
+        <w:t xml:space="preserve">, TileID) VALUES (3, 7);  -- </w:t>
+      </w:r>
+      <w:proofErr w:type="spellStart"/>
+      <w:r>
+        <w:t>McPlayerTwoington</w:t>
+      </w:r>
+      <w:proofErr w:type="spellEnd"/>
+    </w:p>
+    <w:p/>
+    <w:p>
+      <w:r>
+        <w:t xml:space="preserve">    --item types: all 4 holdable + 4 </w:t>
+      </w:r>
+      <w:proofErr w:type="gramStart"/>
+      <w:r>
+        <w:t>consumable</w:t>
+      </w:r>
+      <w:proofErr w:type="gramEnd"/>
+    </w:p>
+    <w:p>
+      <w:r>
+        <w:t xml:space="preserve">    INSERT INTO </w:t>
+      </w:r>
+      <w:proofErr w:type="spellStart"/>
+      <w:r>
+        <w:t>dbo.ItemType</w:t>
+      </w:r>
+      <w:proofErr w:type="spellEnd"/>
+      <w:r>
+        <w:t xml:space="preserve"> (Name, Category, </w:t>
+      </w:r>
+      <w:proofErr w:type="spellStart"/>
+      <w:r>
+        <w:t>EffectDescription</w:t>
+      </w:r>
+      <w:proofErr w:type="spellEnd"/>
+      <w:r>
+        <w:t xml:space="preserve">, </w:t>
+      </w:r>
+      <w:proofErr w:type="spellStart"/>
+      <w:r>
+        <w:t>SpawnRate</w:t>
+      </w:r>
+      <w:proofErr w:type="spellEnd"/>
+      <w:r>
+        <w:t>) VALUES</w:t>
+      </w:r>
+    </w:p>
+    <w:p>
+      <w:r>
+        <w:t>        ('Baseball Bat', 'Holdable',   '+50% attack damage',                         15.00),</w:t>
+      </w:r>
+    </w:p>
+    <w:p>
+      <w:r>
+        <w:t>        ('Pellet Gun',   'Holdable',   '-50% attack damage, ranged, 3-10 ammo',      10.00),</w:t>
+      </w:r>
+    </w:p>
+    <w:p>
+      <w:r>
+        <w:t>        ('Shield',       'Holdable',   '-50% incoming damage, -25% outgoing damage', 12.00),</w:t>
+      </w:r>
+    </w:p>
+    <w:p>
+      <w:r>
+        <w:t>        ('Grenade',      'Holdable',   'Thrown 3 tiles, 500% damage in 3x3 area',     5.00),</w:t>
+      </w:r>
+    </w:p>
+    <w:p>
+      <w:r>
+        <w:t>        ('Peas',         'Consumable', 'Regain 200 health',                          30.00),</w:t>
+      </w:r>
+    </w:p>
+    <w:p>
+      <w:r>
+        <w:t>        ('Banana',       'Consumable', 'Regain 400 health',                          15.00),</w:t>
+      </w:r>
+    </w:p>
+    <w:p>
+      <w:r>
+        <w:t>        ('Grapes',       'Consumable', 'Invincibility for 5 seconds',                 5.00),</w:t>
+      </w:r>
+    </w:p>
+    <w:p>
+      <w:r>
+        <w:t>        ('Watermelon',   'Consumable', 'Regain 1000 health',                          5.00);</w:t>
+      </w:r>
+    </w:p>
+    <w:p/>
+    <w:p>
+      <w:r>
+        <w:t>    --Items in all location states</w:t>
+      </w:r>
+    </w:p>
+    <w:p>
+      <w:r>
+        <w:lastRenderedPageBreak/>
+        <w:t xml:space="preserve">    INSERT INTO </w:t>
+      </w:r>
+      <w:proofErr w:type="spellStart"/>
+      <w:r>
+        <w:t>dbo.Item</w:t>
+      </w:r>
+      <w:proofErr w:type="spellEnd"/>
+      <w:r>
+        <w:t xml:space="preserve"> (ItemTypeID, HolderPlayerID) VALUES (1, 2);        --bat held by player</w:t>
+      </w:r>
+    </w:p>
+    <w:p>
+      <w:r>
+        <w:t xml:space="preserve">    INSERT INTO </w:t>
+      </w:r>
+      <w:proofErr w:type="spellStart"/>
+      <w:r>
+        <w:t>dbo.Item</w:t>
+      </w:r>
+      <w:proofErr w:type="spellEnd"/>
+      <w:r>
+        <w:t xml:space="preserve"> (ItemTypeID, NestID)         VALUES (3, 1);        --shield stored in player's nest</w:t>
+      </w:r>
+    </w:p>
+    <w:p>
+      <w:r>
+        <w:t xml:space="preserve">    INSERT INTO </w:t>
+      </w:r>
+      <w:proofErr w:type="spellStart"/>
+      <w:r>
+        <w:t>dbo.Item</w:t>
+      </w:r>
+      <w:proofErr w:type="spellEnd"/>
+      <w:r>
+        <w:t xml:space="preserve"> (ItemTypeID, NestID)         VALUES (5, 1);        --peas stored in player's nest</w:t>
+      </w:r>
+    </w:p>
+    <w:p>
+      <w:r>
+        <w:t xml:space="preserve">    INSERT INTO </w:t>
+      </w:r>
+      <w:proofErr w:type="spellStart"/>
+      <w:r>
+        <w:t>dbo.Item</w:t>
+      </w:r>
+      <w:proofErr w:type="spellEnd"/>
+      <w:r>
+        <w:t xml:space="preserve"> (ItemTypeID, TileID)         VALUES (8, 19);       --watermelon lying on a tile</w:t>
+      </w:r>
+    </w:p>
+    <w:p>
+      <w:r>
+        <w:t xml:space="preserve">    INSERT INTO </w:t>
+      </w:r>
+      <w:proofErr w:type="spellStart"/>
+      <w:r>
+        <w:t>dbo.Item</w:t>
+      </w:r>
+      <w:proofErr w:type="spellEnd"/>
+      <w:r>
+        <w:t xml:space="preserve"> (ItemTypeID, TileID, Ammo)   VALUES (2, 6, 7);     --pellet gun on a tile with ammo</w:t>
+      </w:r>
+    </w:p>
+    <w:p>
+      <w:r>
+        <w:t xml:space="preserve">    </w:t>
+      </w:r>
+    </w:p>
+    <w:p>
+      <w:r>
+        <w:t>    --NPC</w:t>
+      </w:r>
+    </w:p>
+    <w:p>
+      <w:r>
+        <w:t xml:space="preserve">    INSERT INTO </w:t>
+      </w:r>
+      <w:proofErr w:type="spellStart"/>
+      <w:r>
+        <w:t>dbo.NPC</w:t>
+      </w:r>
+      <w:proofErr w:type="spellEnd"/>
+      <w:r>
+        <w:t xml:space="preserve"> (TileID, Health, </w:t>
+      </w:r>
+      <w:proofErr w:type="spellStart"/>
+      <w:r>
+        <w:t>MaxHealth</w:t>
+      </w:r>
+      <w:proofErr w:type="spellEnd"/>
+      <w:r>
+        <w:t>, IsAlive) VALUES (11, 1000, 1000, 1);</w:t>
+      </w:r>
+    </w:p>
+    <w:p/>
+    <w:p>
+      <w:r>
+        <w:t>    --chat messages</w:t>
+      </w:r>
+    </w:p>
+    <w:p>
+      <w:r>
+        <w:t xml:space="preserve">    INSERT INTO </w:t>
+      </w:r>
+      <w:proofErr w:type="spellStart"/>
+      <w:r>
+        <w:t>dbo.ChatMessage</w:t>
+      </w:r>
+      <w:proofErr w:type="spellEnd"/>
+      <w:r>
+        <w:t xml:space="preserve"> (SenderPlayerID, </w:t>
+      </w:r>
+      <w:proofErr w:type="spellStart"/>
+      <w:r>
+        <w:t>MessageText</w:t>
+      </w:r>
+      <w:proofErr w:type="spellEnd"/>
+      <w:r>
+        <w:t>)</w:t>
+      </w:r>
+    </w:p>
+    <w:p>
+      <w:r>
+        <w:t>    VALUES (2, '</w:t>
+      </w:r>
+      <w:proofErr w:type="spellStart"/>
+      <w:r>
+        <w:t>yoooo</w:t>
+      </w:r>
+      <w:proofErr w:type="spellEnd"/>
+      <w:r>
+        <w:t xml:space="preserve"> </w:t>
+      </w:r>
+      <w:proofErr w:type="spellStart"/>
+      <w:r>
+        <w:t>whats</w:t>
+      </w:r>
+      <w:proofErr w:type="spellEnd"/>
+      <w:r>
+        <w:t xml:space="preserve"> up guys????');</w:t>
+      </w:r>
+    </w:p>
+    <w:p>
+      <w:r>
+        <w:t xml:space="preserve">    INSERT INTO </w:t>
+      </w:r>
+      <w:proofErr w:type="spellStart"/>
+      <w:r>
+        <w:t>dbo.ChatMessage</w:t>
+      </w:r>
+      <w:proofErr w:type="spellEnd"/>
+      <w:r>
+        <w:t xml:space="preserve"> (SenderPlayerID, </w:t>
+      </w:r>
+      <w:proofErr w:type="spellStart"/>
+      <w:r>
+        <w:t>MessageText</w:t>
+      </w:r>
+      <w:proofErr w:type="spellEnd"/>
+      <w:r>
+        <w:t>)</w:t>
+      </w:r>
+    </w:p>
+    <w:p>
+      <w:r>
+        <w:t>    VALUES (3, 'WATCH OUT HES GOT A PELLET GUN');</w:t>
+      </w:r>
+    </w:p>
+    <w:p/>
+    <w:p>
+      <w:r>
+        <w:t>END</w:t>
+      </w:r>
+    </w:p>
+    <w:p>
+      <w:r>
+        <w:t>GO</w:t>
+      </w:r>
+    </w:p>
+    <w:p/>
+    <w:p>
+      <w:r>
+        <w:t>--procedure to build the database and populate test data</w:t>
+      </w:r>
+    </w:p>
+    <w:p>
+      <w:r>
+        <w:t xml:space="preserve">EXEC </w:t>
+      </w:r>
+      <w:proofErr w:type="spellStart"/>
+      <w:r>
+        <w:t>dbo.usp_CreateGooseFighterDatabase</w:t>
+      </w:r>
+      <w:proofErr w:type="spellEnd"/>
+      <w:r>
+        <w:t>;</w:t>
+      </w:r>
+    </w:p>
+    <w:p>
+      <w:r>
+        <w:t>GO</w:t>
+      </w:r>
+    </w:p>
+    <w:p>
+      <w:r>
+        <w:br/>
+      </w:r>
+    </w:p>
+    <w:p/>
+    <w:p/>
+    <w:p/>
     <w:p/>
     <w:p/>
     <w:p/>
@@ -7320,7 +9450,6 @@
   <w:style w:type="character" w:default="1" w:styleId="DefaultParagraphFont">
     <w:name w:val="Default Paragraph Font"/>
     <w:uiPriority w:val="1"/>
-    <w:semiHidden/>
     <w:unhideWhenUsed/>
   </w:style>
   <w:style w:type="table" w:default="1" w:styleId="TableNormal">
@@ -7752,6 +9881,20 @@
       </w:tblBorders>
     </w:tblPr>
   </w:style>
+  <w:style w:type="paragraph" w:customStyle="1" w:styleId="msonormal0">
+    <w:name w:val="msonormal"/>
+    <w:basedOn w:val="Normal"/>
+    <w:rsid w:val="00C3577B"/>
+    <w:pPr>
+      <w:spacing w:before="100" w:beforeAutospacing="1" w:after="100" w:afterAutospacing="1" w:line="240" w:lineRule="auto"/>
+    </w:pPr>
+    <w:rPr>
+      <w:rFonts w:ascii="Times New Roman" w:eastAsia="Times New Roman" w:hAnsi="Times New Roman" w:cs="Times New Roman"/>
+      <w:kern w:val="0"/>
+      <w:lang w:eastAsia="en-NZ"/>
+      <w14:ligatures w14:val="none"/>
+    </w:rPr>
+  </w:style>
 </w:styles>
 </file>
 

</xml_diff>

<commit_message>
finished word document, updated readme, re-added DAT602_assignment_1_test_procedures because file itself was corrupted, made all 3 forms and now have a functioning prototype
</commit_message>
<xml_diff>
--- a/DAT602_Assignment_1_Zandi_Galpin.docx
+++ b/DAT602_Assignment_1_Zandi_Galpin.docx
@@ -131,7 +131,7 @@
           <w:r>
             <w:fldChar w:fldCharType="separate"/>
           </w:r>
-          <w:hyperlink w:anchor="_Toc238736566" w:history="1">
+          <w:hyperlink w:anchor="_Toc239371839" w:history="1">
             <w:r>
               <w:rPr>
                 <w:rStyle w:val="Hyperlink"/>
@@ -158,7 +158,7 @@
                 <w:noProof/>
                 <w:webHidden/>
               </w:rPr>
-              <w:instrText xml:space="preserve"> PAGEREF _Toc238736566 \h </w:instrText>
+              <w:instrText xml:space="preserve"> PAGEREF _Toc239371839 \h </w:instrText>
             </w:r>
             <w:r>
               <w:rPr>
@@ -201,7 +201,7 @@
               <w:lang w:eastAsia="en-NZ"/>
             </w:rPr>
           </w:pPr>
-          <w:hyperlink w:anchor="_Toc238736567" w:history="1">
+          <w:hyperlink w:anchor="_Toc239371840" w:history="1">
             <w:r>
               <w:rPr>
                 <w:rStyle w:val="Hyperlink"/>
@@ -228,7 +228,7 @@
                 <w:noProof/>
                 <w:webHidden/>
               </w:rPr>
-              <w:instrText xml:space="preserve"> PAGEREF _Toc238736567 \h </w:instrText>
+              <w:instrText xml:space="preserve"> PAGEREF _Toc239371840 \h </w:instrText>
             </w:r>
             <w:r>
               <w:rPr>
@@ -271,7 +271,7 @@
               <w:lang w:eastAsia="en-NZ"/>
             </w:rPr>
           </w:pPr>
-          <w:hyperlink w:anchor="_Toc238736568" w:history="1">
+          <w:hyperlink w:anchor="_Toc239371841" w:history="1">
             <w:r>
               <w:rPr>
                 <w:rStyle w:val="Hyperlink"/>
@@ -298,7 +298,7 @@
                 <w:noProof/>
                 <w:webHidden/>
               </w:rPr>
-              <w:instrText xml:space="preserve"> PAGEREF _Toc238736568 \h </w:instrText>
+              <w:instrText xml:space="preserve"> PAGEREF _Toc239371841 \h </w:instrText>
             </w:r>
             <w:r>
               <w:rPr>
@@ -341,7 +341,7 @@
               <w:lang w:eastAsia="en-NZ"/>
             </w:rPr>
           </w:pPr>
-          <w:hyperlink w:anchor="_Toc238736569" w:history="1">
+          <w:hyperlink w:anchor="_Toc239371842" w:history="1">
             <w:r>
               <w:rPr>
                 <w:rStyle w:val="Hyperlink"/>
@@ -368,7 +368,7 @@
                 <w:noProof/>
                 <w:webHidden/>
               </w:rPr>
-              <w:instrText xml:space="preserve"> PAGEREF _Toc238736569 \h </w:instrText>
+              <w:instrText xml:space="preserve"> PAGEREF _Toc239371842 \h </w:instrText>
             </w:r>
             <w:r>
               <w:rPr>
@@ -388,7 +388,217 @@
                 <w:noProof/>
                 <w:webHidden/>
               </w:rPr>
-              <w:t>24</w:t>
+              <w:t>26</w:t>
+            </w:r>
+            <w:r>
+              <w:rPr>
+                <w:noProof/>
+                <w:webHidden/>
+              </w:rPr>
+              <w:fldChar w:fldCharType="end"/>
+            </w:r>
+          </w:hyperlink>
+        </w:p>
+        <w:p>
+          <w:pPr>
+            <w:pStyle w:val="TOC1"/>
+            <w:tabs>
+              <w:tab w:val="right" w:leader="dot" w:pos="9016"/>
+            </w:tabs>
+            <w:rPr>
+              <w:rFonts w:eastAsiaTheme="minorEastAsia"/>
+              <w:noProof/>
+              <w:lang w:eastAsia="en-NZ"/>
+            </w:rPr>
+          </w:pPr>
+          <w:hyperlink w:anchor="_Toc239371843" w:history="1">
+            <w:r>
+              <w:rPr>
+                <w:rStyle w:val="Hyperlink"/>
+                <w:noProof/>
+              </w:rPr>
+              <w:t>Task 3, CRUD table as part of analysis for the game system:</w:t>
+            </w:r>
+            <w:r>
+              <w:rPr>
+                <w:noProof/>
+                <w:webHidden/>
+              </w:rPr>
+              <w:tab/>
+            </w:r>
+            <w:r>
+              <w:rPr>
+                <w:noProof/>
+                <w:webHidden/>
+              </w:rPr>
+              <w:fldChar w:fldCharType="begin"/>
+            </w:r>
+            <w:r>
+              <w:rPr>
+                <w:noProof/>
+                <w:webHidden/>
+              </w:rPr>
+              <w:instrText xml:space="preserve"> PAGEREF _Toc239371843 \h </w:instrText>
+            </w:r>
+            <w:r>
+              <w:rPr>
+                <w:noProof/>
+                <w:webHidden/>
+              </w:rPr>
+            </w:r>
+            <w:r>
+              <w:rPr>
+                <w:noProof/>
+                <w:webHidden/>
+              </w:rPr>
+              <w:fldChar w:fldCharType="separate"/>
+            </w:r>
+            <w:r>
+              <w:rPr>
+                <w:noProof/>
+                <w:webHidden/>
+              </w:rPr>
+              <w:t>27</w:t>
+            </w:r>
+            <w:r>
+              <w:rPr>
+                <w:noProof/>
+                <w:webHidden/>
+              </w:rPr>
+              <w:fldChar w:fldCharType="end"/>
+            </w:r>
+          </w:hyperlink>
+        </w:p>
+        <w:p>
+          <w:pPr>
+            <w:pStyle w:val="TOC1"/>
+            <w:tabs>
+              <w:tab w:val="right" w:leader="dot" w:pos="9016"/>
+            </w:tabs>
+            <w:rPr>
+              <w:rFonts w:eastAsiaTheme="minorEastAsia"/>
+              <w:noProof/>
+              <w:lang w:eastAsia="en-NZ"/>
+            </w:rPr>
+          </w:pPr>
+          <w:hyperlink w:anchor="_Toc239371844" w:history="1">
+            <w:r>
+              <w:rPr>
+                <w:rStyle w:val="Hyperlink"/>
+                <w:noProof/>
+              </w:rPr>
+              <w:t>Task 4, DDL SQL script to create tables and relations between tables to support the game:</w:t>
+            </w:r>
+            <w:r>
+              <w:rPr>
+                <w:noProof/>
+                <w:webHidden/>
+              </w:rPr>
+              <w:tab/>
+            </w:r>
+            <w:r>
+              <w:rPr>
+                <w:noProof/>
+                <w:webHidden/>
+              </w:rPr>
+              <w:fldChar w:fldCharType="begin"/>
+            </w:r>
+            <w:r>
+              <w:rPr>
+                <w:noProof/>
+                <w:webHidden/>
+              </w:rPr>
+              <w:instrText xml:space="preserve"> PAGEREF _Toc239371844 \h </w:instrText>
+            </w:r>
+            <w:r>
+              <w:rPr>
+                <w:noProof/>
+                <w:webHidden/>
+              </w:rPr>
+            </w:r>
+            <w:r>
+              <w:rPr>
+                <w:noProof/>
+                <w:webHidden/>
+              </w:rPr>
+              <w:fldChar w:fldCharType="separate"/>
+            </w:r>
+            <w:r>
+              <w:rPr>
+                <w:noProof/>
+                <w:webHidden/>
+              </w:rPr>
+              <w:t>29</w:t>
+            </w:r>
+            <w:r>
+              <w:rPr>
+                <w:noProof/>
+                <w:webHidden/>
+              </w:rPr>
+              <w:fldChar w:fldCharType="end"/>
+            </w:r>
+          </w:hyperlink>
+        </w:p>
+        <w:p>
+          <w:pPr>
+            <w:pStyle w:val="TOC1"/>
+            <w:tabs>
+              <w:tab w:val="right" w:leader="dot" w:pos="9016"/>
+            </w:tabs>
+            <w:rPr>
+              <w:rFonts w:eastAsiaTheme="minorEastAsia"/>
+              <w:noProof/>
+              <w:lang w:eastAsia="en-NZ"/>
+            </w:rPr>
+          </w:pPr>
+          <w:hyperlink w:anchor="_Toc239371845" w:history="1">
+            <w:r>
+              <w:rPr>
+                <w:rStyle w:val="Hyperlink"/>
+                <w:noProof/>
+              </w:rPr>
+              <w:t>5. Create a prototype C# .net application using Visual Studio:</w:t>
+            </w:r>
+            <w:r>
+              <w:rPr>
+                <w:noProof/>
+                <w:webHidden/>
+              </w:rPr>
+              <w:tab/>
+            </w:r>
+            <w:r>
+              <w:rPr>
+                <w:noProof/>
+                <w:webHidden/>
+              </w:rPr>
+              <w:fldChar w:fldCharType="begin"/>
+            </w:r>
+            <w:r>
+              <w:rPr>
+                <w:noProof/>
+                <w:webHidden/>
+              </w:rPr>
+              <w:instrText xml:space="preserve"> PAGEREF _Toc239371845 \h </w:instrText>
+            </w:r>
+            <w:r>
+              <w:rPr>
+                <w:noProof/>
+                <w:webHidden/>
+              </w:rPr>
+            </w:r>
+            <w:r>
+              <w:rPr>
+                <w:noProof/>
+                <w:webHidden/>
+              </w:rPr>
+              <w:fldChar w:fldCharType="separate"/>
+            </w:r>
+            <w:r>
+              <w:rPr>
+                <w:noProof/>
+                <w:webHidden/>
+              </w:rPr>
+              <w:t>29</w:t>
             </w:r>
             <w:r>
               <w:rPr>
@@ -420,7 +630,7 @@
       <w:pPr>
         <w:pStyle w:val="Heading1"/>
       </w:pPr>
-      <w:bookmarkStart w:id="0" w:name="_Toc238736566"/>
+      <w:bookmarkStart w:id="0" w:name="_Toc239371839"/>
       <w:r>
         <w:lastRenderedPageBreak/>
         <w:t xml:space="preserve">Task 1, Description </w:t>
@@ -434,7 +644,7 @@
       <w:pPr>
         <w:pStyle w:val="Heading2"/>
       </w:pPr>
-      <w:bookmarkStart w:id="1" w:name="_Toc238736567"/>
+      <w:bookmarkStart w:id="1" w:name="_Toc239371840"/>
       <w:r>
         <w:t>Description:</w:t>
       </w:r>
@@ -1220,7 +1430,7 @@
       <w:pPr>
         <w:pStyle w:val="Heading2"/>
       </w:pPr>
-      <w:bookmarkStart w:id="2" w:name="_Toc238736568"/>
+      <w:bookmarkStart w:id="2" w:name="_Toc239371841"/>
       <w:r>
         <w:lastRenderedPageBreak/>
         <w:t>Storyboards:</w:t>
@@ -1306,9 +1516,9 @@
           <w:noProof/>
         </w:rPr>
         <w:drawing>
-          <wp:inline distT="0" distB="0" distL="0" distR="0" wp14:anchorId="3E3D1DE5" wp14:editId="2127599D">
-            <wp:extent cx="3924728" cy="3316844"/>
-            <wp:effectExtent l="0" t="0" r="0" b="0"/>
+          <wp:inline distT="0" distB="0" distL="0" distR="0" wp14:anchorId="3E3D1DE5" wp14:editId="10321BDF">
+            <wp:extent cx="6131242" cy="5181600"/>
+            <wp:effectExtent l="0" t="0" r="3175" b="0"/>
             <wp:docPr id="13898931" name="Picture 1"/>
             <wp:cNvGraphicFramePr>
               <a:graphicFrameLocks xmlns:a="http://schemas.openxmlformats.org/drawingml/2006/main" noChangeAspect="1"/>
@@ -1329,7 +1539,7 @@
                   <pic:spPr>
                     <a:xfrm>
                       <a:off x="0" y="0"/>
-                      <a:ext cx="3948118" cy="3336611"/>
+                      <a:ext cx="6183733" cy="5225961"/>
                     </a:xfrm>
                     <a:prstGeom prst="rect">
                       <a:avLst/>
@@ -1373,12 +1583,19 @@
       <w:r>
         <w:t>screen changes to storyboard 2.</w:t>
       </w:r>
+      <w:r>
+        <w:t xml:space="preserve"> Clicking “Next” runs a SELECT against PLAYER on Username to check whether the row exists, which determines whether the user goes to storyboard 2 or 3.</w:t>
+      </w:r>
     </w:p>
     <w:p>
       <w:r>
         <w:t>If the username doesn’t exist in the database, the screen changes to storyboard 3.</w:t>
       </w:r>
     </w:p>
+    <w:p/>
+    <w:p/>
+    <w:p/>
+    <w:p/>
     <w:p>
       <w:pPr>
         <w:rPr>
@@ -1393,6 +1610,7 @@
           <w:bCs/>
           <w:u w:val="single"/>
         </w:rPr>
+        <w:lastRenderedPageBreak/>
         <w:t>Login screen</w:t>
       </w:r>
       <w:r>
@@ -1426,9 +1644,9 @@
           <w:noProof/>
         </w:rPr>
         <w:drawing>
-          <wp:inline distT="0" distB="0" distL="0" distR="0" wp14:anchorId="0082BEC9" wp14:editId="492DD9A8">
-            <wp:extent cx="3708971" cy="3148887"/>
-            <wp:effectExtent l="0" t="0" r="6350" b="0"/>
+          <wp:inline distT="0" distB="0" distL="0" distR="0" wp14:anchorId="0082BEC9" wp14:editId="3E6D29C0">
+            <wp:extent cx="6000660" cy="5094514"/>
+            <wp:effectExtent l="0" t="0" r="635" b="0"/>
             <wp:docPr id="1372982137" name="Picture 1"/>
             <wp:cNvGraphicFramePr>
               <a:graphicFrameLocks xmlns:a="http://schemas.openxmlformats.org/drawingml/2006/main" noChangeAspect="1"/>
@@ -1449,7 +1667,7 @@
                   <pic:spPr>
                     <a:xfrm>
                       <a:off x="0" y="0"/>
-                      <a:ext cx="3760131" cy="3192322"/>
+                      <a:ext cx="6108246" cy="5185854"/>
                     </a:xfrm>
                     <a:prstGeom prst="rect">
                       <a:avLst/>
@@ -1464,165 +1682,161 @@
     </w:p>
     <w:p>
       <w:r>
+        <w:t>When a user has entered an existing username in storyboard 1</w:t>
+      </w:r>
+      <w:r>
+        <w:t>,</w:t>
+      </w:r>
+      <w:r>
+        <w:t xml:space="preserve"> they </w:t>
+      </w:r>
+      <w:r>
+        <w:t>are brought to here.</w:t>
+      </w:r>
+      <w:r>
+        <w:t xml:space="preserve"> The username </w:t>
+      </w:r>
+      <w:r>
+        <w:t xml:space="preserve">is greyed out and can no longer be changed. A “Login” button </w:t>
+      </w:r>
+      <w:r>
+        <w:t xml:space="preserve">appears in place of the “Next” button </w:t>
+      </w:r>
+      <w:r>
+        <w:t xml:space="preserve">and a “Password” field appears </w:t>
+      </w:r>
+      <w:r>
+        <w:t xml:space="preserve">under the Username field </w:t>
+      </w:r>
+      <w:r>
+        <w:t>(</w:t>
+      </w:r>
+      <w:r>
+        <w:t>starting empty until typed in</w:t>
+      </w:r>
+      <w:r>
+        <w:t>, appears as asterisks</w:t>
+      </w:r>
+      <w:r>
+        <w:t>)</w:t>
+      </w:r>
+      <w:r>
+        <w:t xml:space="preserve">, along with a back arrow in the upper left corner. </w:t>
+      </w:r>
+      <w:r>
+        <w:t>If</w:t>
+      </w:r>
+      <w:r>
+        <w:t xml:space="preserve"> </w:t>
+      </w:r>
+      <w:r>
+        <w:t xml:space="preserve">the back arrow is </w:t>
+      </w:r>
+      <w:r>
+        <w:t xml:space="preserve">clicked, this directs the user back to the screen in storyboard 1. </w:t>
+      </w:r>
+      <w:r>
+        <w:t xml:space="preserve">The user types a password </w:t>
+      </w:r>
+      <w:r>
+        <w:t>in and clicks the “Login” button</w:t>
+      </w:r>
+      <w:r>
+        <w:t>.</w:t>
+      </w:r>
+      <w:r>
+        <w:t xml:space="preserve"> If the password is correct</w:t>
+      </w:r>
+      <w:r>
+        <w:t xml:space="preserve"> and the user is a regular user</w:t>
+      </w:r>
+      <w:r>
+        <w:t>, the</w:t>
+      </w:r>
+      <w:r>
+        <w:t xml:space="preserve"> screen changes</w:t>
+      </w:r>
+      <w:r>
+        <w:t xml:space="preserve"> to </w:t>
+      </w:r>
+      <w:r>
+        <w:t xml:space="preserve">Storyboard </w:t>
+      </w:r>
+      <w:r>
+        <w:t>12.</w:t>
+      </w:r>
+      <w:r>
+        <w:t xml:space="preserve"> If the password is correct and the user is an </w:t>
+      </w:r>
+      <w:r>
+        <w:t>admin</w:t>
+      </w:r>
+      <w:r>
+        <w:t xml:space="preserve">, the screen changes to </w:t>
+      </w:r>
+      <w:r>
+        <w:t xml:space="preserve">Storyboard </w:t>
+      </w:r>
+      <w:r>
+        <w:t>17</w:t>
+      </w:r>
+      <w:r>
+        <w:t>.</w:t>
+      </w:r>
+      <w:r>
+        <w:t xml:space="preserve"> </w:t>
+      </w:r>
+      <w:r>
+        <w:t xml:space="preserve">If the user is a new regular user (created by an admin but hasn’t logged in before), they are taken to storyboard 5. </w:t>
+      </w:r>
+      <w:r>
+        <w:t xml:space="preserve">If the password is incorrect, the </w:t>
+      </w:r>
+      <w:r>
+        <w:t>p</w:t>
+      </w:r>
+      <w:r>
+        <w:t>assword field is cleared</w:t>
+      </w:r>
+      <w:r>
+        <w:t xml:space="preserve"> and the text “Incorrect password” appears under the </w:t>
+      </w:r>
+      <w:r>
+        <w:t>p</w:t>
+      </w:r>
+      <w:r>
+        <w:t>assword</w:t>
+      </w:r>
+      <w:r>
+        <w:t xml:space="preserve"> </w:t>
+      </w:r>
+      <w:r>
+        <w:t>field,</w:t>
+      </w:r>
+      <w:r>
+        <w:t xml:space="preserve"> and they are given a chance to try again</w:t>
+      </w:r>
+      <w:r>
+        <w:t>. After 5 incorrect attempts, the</w:t>
+      </w:r>
+      <w:r>
+        <w:t xml:space="preserve"> screen changes to storyboard 4.</w:t>
+      </w:r>
+      <w:r>
+        <w:t xml:space="preserve"> </w:t>
+      </w:r>
+      <w:r>
+        <w:t>Password is checked against the stored PLAYER’s username. A failed attempt increases FailedLoginAttempts by 1. A success resets it to 0. If it gets to 5 then IsLockedOut is set to 1.</w:t>
+      </w:r>
+    </w:p>
+    <w:p>
+      <w:r>
+        <w:rPr>
+          <w:b/>
+          <w:bCs/>
+          <w:u w:val="single"/>
+        </w:rPr>
         <w:lastRenderedPageBreak/>
-        <w:t>When a user has entered an existing username in storyboard 1</w:t>
-      </w:r>
-      <w:r>
-        <w:t>,</w:t>
-      </w:r>
-      <w:r>
-        <w:t xml:space="preserve"> they </w:t>
-      </w:r>
-      <w:r>
-        <w:t>are brought to here.</w:t>
-      </w:r>
-      <w:r>
-        <w:t xml:space="preserve"> The username </w:t>
-      </w:r>
-      <w:r>
-        <w:t xml:space="preserve">is greyed out and can no longer be changed. A “Login” button </w:t>
-      </w:r>
-      <w:r>
-        <w:t xml:space="preserve">appears in place of the “Next” button </w:t>
-      </w:r>
-      <w:r>
-        <w:t xml:space="preserve">and a “Password” field appears </w:t>
-      </w:r>
-      <w:r>
-        <w:t xml:space="preserve">under the Username field </w:t>
-      </w:r>
-      <w:r>
-        <w:t>(</w:t>
-      </w:r>
-      <w:r>
-        <w:t>starting empty until typed in</w:t>
-      </w:r>
-      <w:r>
-        <w:t>, appears as asterisks</w:t>
-      </w:r>
-      <w:r>
-        <w:t>)</w:t>
-      </w:r>
-      <w:r>
-        <w:t xml:space="preserve">, along with a back arrow in the upper left corner. </w:t>
-      </w:r>
-      <w:r>
-        <w:t>If</w:t>
-      </w:r>
-      <w:r>
-        <w:t xml:space="preserve"> </w:t>
-      </w:r>
-      <w:r>
-        <w:t xml:space="preserve">the back arrow is </w:t>
-      </w:r>
-      <w:r>
-        <w:t xml:space="preserve">clicked, this directs the user back to the screen in storyboard 1. </w:t>
-      </w:r>
-      <w:r>
-        <w:t xml:space="preserve">The user types a password </w:t>
-      </w:r>
-      <w:r>
-        <w:t>in and clicks the “Login” button</w:t>
-      </w:r>
-      <w:r>
-        <w:t>.</w:t>
-      </w:r>
-      <w:r>
-        <w:t xml:space="preserve"> If the password is correct</w:t>
-      </w:r>
-      <w:r>
-        <w:t xml:space="preserve"> and the user is a regular user</w:t>
-      </w:r>
-      <w:r>
-        <w:t>, the</w:t>
-      </w:r>
-      <w:r>
-        <w:t xml:space="preserve"> screen changes</w:t>
-      </w:r>
-      <w:r>
-        <w:t xml:space="preserve"> to </w:t>
-      </w:r>
-      <w:r>
-        <w:t xml:space="preserve">Storyboard </w:t>
-      </w:r>
-      <w:r>
-        <w:t>12.</w:t>
-      </w:r>
-      <w:r>
-        <w:t xml:space="preserve"> If the password is correct and the user is an </w:t>
-      </w:r>
-      <w:r>
-        <w:t>admin</w:t>
-      </w:r>
-      <w:r>
-        <w:t xml:space="preserve">, the screen changes to </w:t>
-      </w:r>
-      <w:r>
-        <w:t xml:space="preserve">Storyboard </w:t>
-      </w:r>
-      <w:r>
-        <w:t>17</w:t>
-      </w:r>
-      <w:r>
-        <w:t>.</w:t>
-      </w:r>
-      <w:r>
-        <w:t xml:space="preserve"> </w:t>
-      </w:r>
-      <w:r>
-        <w:t xml:space="preserve">If the user is a new regular user (created by an admin but hasn’t logged in before), they are taken to storyboard 5. </w:t>
-      </w:r>
-      <w:r>
-        <w:t xml:space="preserve">If the password is incorrect, the </w:t>
-      </w:r>
-      <w:r>
-        <w:t>p</w:t>
-      </w:r>
-      <w:r>
-        <w:t>assword field is cleared</w:t>
-      </w:r>
-      <w:r>
-        <w:t xml:space="preserve"> and the text “Incorrect password” appears under the </w:t>
-      </w:r>
-      <w:r>
-        <w:t>p</w:t>
-      </w:r>
-      <w:r>
-        <w:t>assword</w:t>
-      </w:r>
-      <w:r>
-        <w:t xml:space="preserve"> </w:t>
-      </w:r>
-      <w:r>
-        <w:t>field,</w:t>
-      </w:r>
-      <w:r>
-        <w:t xml:space="preserve"> and they are given a chance to try again</w:t>
-      </w:r>
-      <w:r>
-        <w:t>. After 5 incorrect attempts, the</w:t>
-      </w:r>
-      <w:r>
-        <w:t xml:space="preserve"> screen changes to storyboard 4.</w:t>
-      </w:r>
-      <w:r>
-        <w:t xml:space="preserve"> </w:t>
-      </w:r>
-    </w:p>
-    <w:p>
-      <w:pPr>
-        <w:rPr>
-          <w:b/>
-          <w:bCs/>
-          <w:u w:val="single"/>
-        </w:rPr>
-      </w:pPr>
-      <w:r>
-        <w:rPr>
-          <w:b/>
-          <w:bCs/>
-          <w:u w:val="single"/>
-        </w:rPr>
         <w:t>Registration</w:t>
       </w:r>
       <w:r>
@@ -1680,9 +1894,9 @@
           <w:noProof/>
         </w:rPr>
         <w:drawing>
-          <wp:inline distT="0" distB="0" distL="0" distR="0" wp14:anchorId="2B424F9C" wp14:editId="3350364B">
-            <wp:extent cx="4325420" cy="3684226"/>
-            <wp:effectExtent l="0" t="0" r="0" b="0"/>
+          <wp:inline distT="0" distB="0" distL="0" distR="0" wp14:anchorId="2B424F9C" wp14:editId="68FD2FF1">
+            <wp:extent cx="5823857" cy="4960537"/>
+            <wp:effectExtent l="0" t="0" r="5715" b="0"/>
             <wp:docPr id="1879364104" name="Picture 1"/>
             <wp:cNvGraphicFramePr>
               <a:graphicFrameLocks xmlns:a="http://schemas.openxmlformats.org/drawingml/2006/main" noChangeAspect="1"/>
@@ -1703,7 +1917,7 @@
                   <pic:spPr>
                     <a:xfrm>
                       <a:off x="0" y="0"/>
-                      <a:ext cx="4342351" cy="3698647"/>
+                      <a:ext cx="5855001" cy="4987064"/>
                     </a:xfrm>
                     <a:prstGeom prst="rect">
                       <a:avLst/>
@@ -1786,7 +2000,13 @@
       <w:r>
         <w:t>5.</w:t>
       </w:r>
-    </w:p>
+      <w:r>
+        <w:t xml:space="preserve"> “Create account” inserts a new PLAYER row with the entered email, username and password, a score of 0, IsAdmin set to 0, IsLockedOut set to 0.</w:t>
+      </w:r>
+    </w:p>
+    <w:p/>
+    <w:p/>
+    <w:p/>
     <w:p>
       <w:pPr>
         <w:rPr>
@@ -1897,10 +2117,7 @@
         <w:t xml:space="preserve">clicked </w:t>
       </w:r>
       <w:r>
-        <w:rPr>
-          <w:highlight w:val="yellow"/>
-        </w:rPr>
-        <w:t>ASK WHAT TO PUT HERE.</w:t>
+        <w:t>it displays an admin’s contact info. This screen reflects PLAYER.IsLockedOut = 1. Only an admin unticking “Account locked?” on storyboard 11 can set it back to 0.</w:t>
       </w:r>
     </w:p>
     <w:p/>
@@ -1909,7 +2126,6 @@
     <w:p/>
     <w:p/>
     <w:p/>
-    <w:p/>
     <w:p>
       <w:r>
         <w:rPr>
@@ -1917,22 +2133,22 @@
         </w:rPr>
         <w:lastRenderedPageBreak/>
         <w:drawing>
-          <wp:anchor distT="0" distB="0" distL="114300" distR="114300" simplePos="0" relativeHeight="251658240" behindDoc="1" locked="0" layoutInCell="1" allowOverlap="1" wp14:anchorId="0E000A1D" wp14:editId="576C2AD0">
+          <wp:anchor distT="0" distB="0" distL="114300" distR="114300" simplePos="0" relativeHeight="251658240" behindDoc="1" locked="0" layoutInCell="1" allowOverlap="1" wp14:anchorId="0E000A1D" wp14:editId="4626C444">
             <wp:simplePos x="0" y="0"/>
-            <wp:positionH relativeFrom="column">
-              <wp:posOffset>-802005</wp:posOffset>
+            <wp:positionH relativeFrom="margin">
+              <wp:align>center</wp:align>
             </wp:positionH>
             <wp:positionV relativeFrom="paragraph">
-              <wp:posOffset>276860</wp:posOffset>
+              <wp:posOffset>228237</wp:posOffset>
             </wp:positionV>
-            <wp:extent cx="7294245" cy="4677410"/>
-            <wp:effectExtent l="0" t="0" r="1905" b="8890"/>
+            <wp:extent cx="6748780" cy="4327525"/>
+            <wp:effectExtent l="0" t="0" r="0" b="0"/>
             <wp:wrapTight wrapText="bothSides">
               <wp:wrapPolygon edited="0">
                 <wp:start x="0" y="0"/>
-                <wp:lineTo x="0" y="21553"/>
-                <wp:lineTo x="21549" y="21553"/>
-                <wp:lineTo x="21549" y="0"/>
+                <wp:lineTo x="0" y="21489"/>
+                <wp:lineTo x="21523" y="21489"/>
+                <wp:lineTo x="21523" y="0"/>
                 <wp:lineTo x="0" y="0"/>
               </wp:wrapPolygon>
             </wp:wrapTight>
@@ -1965,7 +2181,7 @@
                   <pic:spPr bwMode="auto">
                     <a:xfrm>
                       <a:off x="0" y="0"/>
-                      <a:ext cx="7294245" cy="4677410"/>
+                      <a:ext cx="6748780" cy="4327525"/>
                     </a:xfrm>
                     <a:prstGeom prst="rect">
                       <a:avLst/>
@@ -2198,6 +2414,12 @@
         </w:rPr>
         <w:t xml:space="preserve"> </w:t>
       </w:r>
+      <w:r>
+        <w:rPr>
+          <w:noProof/>
+        </w:rPr>
+        <w:t>A NEST row is inserted (linked to the new PlayerID and a randomly chosen TileID). PLAYER.CurrentTileID is updated to that tile.</w:t>
+      </w:r>
     </w:p>
     <w:p>
       <w:r>
@@ -2458,20 +2680,12 @@
         </w:rPr>
         <w:t xml:space="preserve">no longer be invincible. </w:t>
       </w:r>
-    </w:p>
-    <w:p>
-      <w:pPr>
-        <w:rPr>
-          <w:noProof/>
-        </w:rPr>
-      </w:pPr>
-    </w:p>
-    <w:p>
-      <w:pPr>
-        <w:rPr>
-          <w:noProof/>
-        </w:rPr>
-      </w:pPr>
+      <w:r>
+        <w:rPr>
+          <w:noProof/>
+        </w:rPr>
+        <w:t>“DELETE account” removes the PLAYER row, and deletes their NEST row and any ITEMs they were holding or storing. “Return to title screen” sets IsOnline to 0 for the user’s PLAYER row.</w:t>
+      </w:r>
     </w:p>
     <w:p>
       <w:pPr>
@@ -2567,9 +2781,9 @@
           <w:noProof/>
         </w:rPr>
         <w:drawing>
-          <wp:inline distT="0" distB="0" distL="0" distR="0" wp14:anchorId="562A89B0" wp14:editId="75B1A3C2">
-            <wp:extent cx="5953125" cy="5064048"/>
-            <wp:effectExtent l="0" t="0" r="0" b="3810"/>
+          <wp:inline distT="0" distB="0" distL="0" distR="0" wp14:anchorId="562A89B0" wp14:editId="7B20EBCB">
+            <wp:extent cx="5867400" cy="4991126"/>
+            <wp:effectExtent l="0" t="0" r="0" b="0"/>
             <wp:docPr id="1250267488" name="Picture 1"/>
             <wp:cNvGraphicFramePr>
               <a:graphicFrameLocks xmlns:a="http://schemas.openxmlformats.org/drawingml/2006/main" noChangeAspect="1"/>
@@ -2590,7 +2804,7 @@
                   <pic:spPr>
                     <a:xfrm>
                       <a:off x="0" y="0"/>
-                      <a:ext cx="5956056" cy="5066541"/>
+                      <a:ext cx="5888626" cy="5009182"/>
                     </a:xfrm>
                     <a:prstGeom prst="rect">
                       <a:avLst/>
@@ -2604,6 +2818,11 @@
       </w:r>
     </w:p>
     <w:p>
+      <w:pPr>
+        <w:rPr>
+          <w:noProof/>
+        </w:rPr>
+      </w:pPr>
       <w:r>
         <w:t>When a user who is an administrator clicks the settings button</w:t>
       </w:r>
@@ -2703,9 +2922,25 @@
         </w:rPr>
         <w:t xml:space="preserve"> text goes away. If they click yes, the current game is killed and all players are kicked offline.</w:t>
       </w:r>
-    </w:p>
-    <w:p/>
-    <w:p/>
+      <w:r>
+        <w:rPr>
+          <w:noProof/>
+        </w:rPr>
+        <w:t xml:space="preserve"> Clicking the “Kill current game” button and confirming runs a bulk UPDATE against the PLAYER table. IsOnline is set to 0 for every row that is set to 1. Does not change anything else.</w:t>
+      </w:r>
+      <w:r>
+        <w:rPr>
+          <w:noProof/>
+        </w:rPr>
+        <w:t xml:space="preserve"> </w:t>
+      </w:r>
+      <w:r>
+        <w:rPr>
+          <w:noProof/>
+        </w:rPr>
+        <w:t>“Return to title screen” sets IsOnline to 0 for the user’s PLAYER row.</w:t>
+      </w:r>
+    </w:p>
     <w:p>
       <w:r>
         <w:rPr>
@@ -2884,8 +3119,10 @@
       <w:r>
         <w:t xml:space="preserve"> on screen. </w:t>
       </w:r>
-    </w:p>
-    <w:p/>
+      <w:r>
+        <w:t>The list of players is populated by selecting all usernames from the PLAYER table. “Delete selected player” does the same delete as in storyboard 7.</w:t>
+      </w:r>
+    </w:p>
     <w:p/>
     <w:p/>
     <w:p/>
@@ -2984,8 +3221,13 @@
       <w:r>
         <w:t xml:space="preserve"> and submits, the player will be given administrator privileges. The user submits by clicking the “Add player to database” button at the bottom. This adds the player information to the database, then sends the user back to storyboard 9, where the new player is listed along with the old ones.</w:t>
       </w:r>
-    </w:p>
-    <w:p/>
+      <w:r>
+        <w:t xml:space="preserve"> </w:t>
+      </w:r>
+      <w:r>
+        <w:t>Same INSERT as storyboard 3, but IsAdmin is set based on the tick box instead of automatically being set to 0.</w:t>
+      </w:r>
+    </w:p>
     <w:p/>
     <w:p/>
     <w:p/>
@@ -3181,8 +3423,13 @@
       <w:r>
         <w:t xml:space="preserve"> (not to be implemented in this project, but a good idea would be to send the player an email about their username and/or password getting changed).</w:t>
       </w:r>
-    </w:p>
-    <w:p/>
+      <w:r>
+        <w:t xml:space="preserve"> </w:t>
+      </w:r>
+      <w:r>
+        <w:t>“Update player” runs an UPDATE PLAYER SET … WHERE PlayerID = … for all the edited fields, including IsAdmin and IsLockedOut.</w:t>
+      </w:r>
+    </w:p>
     <w:p/>
     <w:p>
       <w:r>
@@ -3340,8 +3587,10 @@
       <w:r>
         <w:t xml:space="preserve"> to storyboard 13.</w:t>
       </w:r>
-    </w:p>
-    <w:p/>
+      <w:r>
+        <w:t xml:space="preserve"> On login, PLAYER’s saved CurrentTileID, Health, Score and HeldItemID are read to restore the state they had when they left, and IsOnline gets set to 1.</w:t>
+      </w:r>
+    </w:p>
     <w:p/>
     <w:p/>
     <w:p/>
@@ -3735,13 +3984,14 @@
     </w:p>
     <w:p>
       <w:r>
+        <w:t>Damage taken updates PLAYER.Health. When defeated, the attackers SCORE is increased by 1. The defeated player’s NEST row is deleted, and their PLAYER row gets a new random CurrentTileID, a new NestID and a new NEST row is added with a random TileID. The player’s HEALTH is reset to 4000 and IsInvincible is set to 1 and InvincibleUntil is set to 5. 5 seconds later IsInvincible is set to 0.</w:t>
+      </w:r>
+    </w:p>
+    <w:p>
+      <w:r>
         <w:t>Continue to storyboard 14.</w:t>
       </w:r>
     </w:p>
-    <w:p/>
-    <w:p/>
-    <w:p/>
-    <w:p/>
     <w:p/>
     <w:p/>
     <w:p>
@@ -3955,6 +4205,19 @@
     <w:p>
       <w:r>
         <w:lastRenderedPageBreak/>
+        <w:t xml:space="preserve">Each random move updates </w:t>
+      </w:r>
+      <w:proofErr w:type="spellStart"/>
+      <w:r>
+        <w:t>NPC.TileID</w:t>
+      </w:r>
+      <w:proofErr w:type="spellEnd"/>
+      <w:r>
+        <w:t>. When defeated, IsAlive is set to 0 and a new ITEM row is inserted at the last tile the NPC was on with a randomly chosen ItemTypeID. After the 1 minute timer, a new NPC row is placed at a random tile.</w:t>
+      </w:r>
+    </w:p>
+    <w:p>
+      <w:r>
         <w:t>Continue to storyboard 15.</w:t>
       </w:r>
     </w:p>
@@ -4175,9 +4438,9 @@
         </w:rPr>
         <w:lastRenderedPageBreak/>
         <w:drawing>
-          <wp:inline distT="0" distB="0" distL="0" distR="0" wp14:anchorId="34D8FA44" wp14:editId="1BFB92AF">
-            <wp:extent cx="5980527" cy="3831771"/>
-            <wp:effectExtent l="0" t="0" r="1270" b="0"/>
+          <wp:inline distT="0" distB="0" distL="0" distR="0" wp14:anchorId="34D8FA44" wp14:editId="4C4AF7F9">
+            <wp:extent cx="5388429" cy="3452408"/>
+            <wp:effectExtent l="0" t="0" r="3175" b="0"/>
             <wp:docPr id="1382950399" name="Picture 1"/>
             <wp:cNvGraphicFramePr>
               <a:graphicFrameLocks xmlns:a="http://schemas.openxmlformats.org/drawingml/2006/main" noChangeAspect="1"/>
@@ -4207,7 +4470,7 @@
                   <pic:spPr bwMode="auto">
                     <a:xfrm>
                       <a:off x="0" y="0"/>
-                      <a:ext cx="6023144" cy="3859076"/>
+                      <a:ext cx="5461997" cy="3499543"/>
                     </a:xfrm>
                     <a:prstGeom prst="rect">
                       <a:avLst/>
@@ -4262,9 +4525,9 @@
           <w:noProof/>
         </w:rPr>
         <w:drawing>
-          <wp:inline distT="0" distB="0" distL="0" distR="0" wp14:anchorId="25116A31" wp14:editId="6B97072F">
-            <wp:extent cx="6019800" cy="3823100"/>
-            <wp:effectExtent l="0" t="0" r="0" b="6350"/>
+          <wp:inline distT="0" distB="0" distL="0" distR="0" wp14:anchorId="25116A31" wp14:editId="640FC6D0">
+            <wp:extent cx="5442857" cy="3456690"/>
+            <wp:effectExtent l="0" t="0" r="5715" b="0"/>
             <wp:docPr id="95383020" name="Picture 3"/>
             <wp:cNvGraphicFramePr>
               <a:graphicFrameLocks xmlns:a="http://schemas.openxmlformats.org/drawingml/2006/main" noChangeAspect="1"/>
@@ -4294,7 +4557,7 @@
                   <pic:spPr bwMode="auto">
                     <a:xfrm>
                       <a:off x="0" y="0"/>
-                      <a:ext cx="6051750" cy="3843391"/>
+                      <a:ext cx="5493897" cy="3489105"/>
                     </a:xfrm>
                     <a:prstGeom prst="rect">
                       <a:avLst/>
@@ -4314,6 +4577,19 @@
             </a:graphic>
           </wp:inline>
         </w:drawing>
+      </w:r>
+    </w:p>
+    <w:p>
+      <w:pPr>
+        <w:rPr>
+          <w:noProof/>
+        </w:rPr>
+      </w:pPr>
+      <w:r>
+        <w:rPr>
+          <w:noProof/>
+        </w:rPr>
+        <w:t>Pressing L moves the held item’s ITEM row from the player to the nest (HolderPlayerID = NULL, NestID = &lt;nest id&gt;). Walking onto an item tile does the reverse (TileID = NULL, HolderPlayerID = &lt;player id&gt;) and HeldItemID is updated to match.</w:t>
       </w:r>
     </w:p>
     <w:p>
@@ -4633,6 +4909,14 @@
         </w:drawing>
       </w:r>
     </w:p>
+    <w:p>
+      <w:r>
+        <w:t>Item position is in ITEM.TileID, which doesn’t depend on any particular player</w:t>
+      </w:r>
+      <w:r>
+        <w:t>, so it persists even when all PLAYER rows have IsOnline set to 0.</w:t>
+      </w:r>
+    </w:p>
     <w:p/>
     <w:p/>
     <w:p/>
@@ -4641,7 +4925,6 @@
     <w:p/>
     <w:p/>
     <w:p/>
-    <w:p/>
     <w:p>
       <w:r>
         <w:rPr>
@@ -4844,23 +5127,42 @@
         <w:rPr>
           <w:noProof/>
         </w:rPr>
+        <w:t xml:space="preserve">If the admin clicks one of the consumable icons (in this case the </w:t>
+      </w:r>
+      <w:r>
+        <w:rPr>
+          <w:noProof/>
+        </w:rPr>
+        <w:t>banana), they will be brought to storyboard 19.</w:t>
+      </w:r>
+    </w:p>
+    <w:p>
+      <w:pPr>
+        <w:rPr>
+          <w:noProof/>
+        </w:rPr>
+      </w:pPr>
+      <w:r>
+        <w:rPr>
+          <w:noProof/>
+        </w:rPr>
         <w:drawing>
-          <wp:anchor distT="0" distB="0" distL="114300" distR="114300" simplePos="0" relativeHeight="251659268" behindDoc="1" locked="0" layoutInCell="1" allowOverlap="1" wp14:anchorId="457A51B8" wp14:editId="62EB1C5D">
+          <wp:anchor distT="0" distB="0" distL="114300" distR="114300" simplePos="0" relativeHeight="251659268" behindDoc="1" locked="0" layoutInCell="1" allowOverlap="1" wp14:anchorId="457A51B8" wp14:editId="634CB8DB">
             <wp:simplePos x="0" y="0"/>
             <wp:positionH relativeFrom="column">
-              <wp:posOffset>-809625</wp:posOffset>
+              <wp:posOffset>-402681</wp:posOffset>
             </wp:positionH>
             <wp:positionV relativeFrom="paragraph">
-              <wp:posOffset>539115</wp:posOffset>
+              <wp:posOffset>425450</wp:posOffset>
             </wp:positionV>
-            <wp:extent cx="7334250" cy="4717415"/>
-            <wp:effectExtent l="0" t="0" r="0" b="6985"/>
+            <wp:extent cx="6786709" cy="4365171"/>
+            <wp:effectExtent l="0" t="0" r="0" b="0"/>
             <wp:wrapTight wrapText="bothSides">
               <wp:wrapPolygon edited="0">
                 <wp:start x="0" y="0"/>
-                <wp:lineTo x="0" y="21545"/>
-                <wp:lineTo x="21544" y="21545"/>
-                <wp:lineTo x="21544" y="0"/>
+                <wp:lineTo x="0" y="21493"/>
+                <wp:lineTo x="21525" y="21493"/>
+                <wp:lineTo x="21525" y="0"/>
                 <wp:lineTo x="0" y="0"/>
               </wp:wrapPolygon>
             </wp:wrapTight>
@@ -4893,7 +5195,7 @@
                   <pic:spPr bwMode="auto">
                     <a:xfrm>
                       <a:off x="0" y="0"/>
-                      <a:ext cx="7334250" cy="4717415"/>
+                      <a:ext cx="6786709" cy="4365171"/>
                     </a:xfrm>
                     <a:prstGeom prst="rect">
                       <a:avLst/>
@@ -4924,13 +5226,7 @@
         <w:rPr>
           <w:noProof/>
         </w:rPr>
-        <w:t xml:space="preserve">If the admin clicks one of the consumable icons (in this case the </w:t>
-      </w:r>
-      <w:r>
-        <w:rPr>
-          <w:noProof/>
-        </w:rPr>
-        <w:t>banana), they will be brought to storyboard 19.</w:t>
+        <w:t>The admin’s PLAYER row has no linked NEST row. The tile/item edit actions write directly to TILE and ITEM.</w:t>
       </w:r>
     </w:p>
     <w:p>
@@ -5012,8 +5308,8 @@
           <w:noProof/>
         </w:rPr>
         <w:drawing>
-          <wp:inline distT="0" distB="0" distL="0" distR="0" wp14:anchorId="6862B2E4" wp14:editId="22EDE5A5">
-            <wp:extent cx="5377180" cy="3451310"/>
+          <wp:inline distT="0" distB="0" distL="0" distR="0" wp14:anchorId="6862B2E4" wp14:editId="47F9E5C8">
+            <wp:extent cx="5355771" cy="3437567"/>
             <wp:effectExtent l="0" t="0" r="0" b="0"/>
             <wp:docPr id="664331727" name="Picture 8"/>
             <wp:cNvGraphicFramePr>
@@ -5044,7 +5340,7 @@
                   <pic:spPr bwMode="auto">
                     <a:xfrm>
                       <a:off x="0" y="0"/>
-                      <a:ext cx="5408738" cy="3471565"/>
+                      <a:ext cx="5402958" cy="3467854"/>
                     </a:xfrm>
                     <a:prstGeom prst="rect">
                       <a:avLst/>
@@ -5103,9 +5399,9 @@
           <w:noProof/>
         </w:rPr>
         <w:drawing>
-          <wp:inline distT="0" distB="0" distL="0" distR="0" wp14:anchorId="04E5348C" wp14:editId="4221BA1E">
-            <wp:extent cx="5377543" cy="3458349"/>
-            <wp:effectExtent l="0" t="0" r="0" b="8890"/>
+          <wp:inline distT="0" distB="0" distL="0" distR="0" wp14:anchorId="04E5348C" wp14:editId="61E7C460">
+            <wp:extent cx="5388429" cy="3465353"/>
+            <wp:effectExtent l="0" t="0" r="3175" b="1905"/>
             <wp:docPr id="655614207" name="Picture 9"/>
             <wp:cNvGraphicFramePr>
               <a:graphicFrameLocks xmlns:a="http://schemas.openxmlformats.org/drawingml/2006/main" noChangeAspect="1"/>
@@ -5135,7 +5431,7 @@
                   <pic:spPr bwMode="auto">
                     <a:xfrm>
                       <a:off x="0" y="0"/>
-                      <a:ext cx="5402139" cy="3474167"/>
+                      <a:ext cx="5473400" cy="3519999"/>
                     </a:xfrm>
                     <a:prstGeom prst="rect">
                       <a:avLst/>
@@ -5159,12 +5455,17 @@
     </w:p>
     <w:p>
       <w:r>
-        <w:rPr>
-          <w:b/>
-          <w:bCs/>
-          <w:u w:val="single"/>
-        </w:rPr>
         <w:lastRenderedPageBreak/>
+        <w:t xml:space="preserve">Placing inserts a new TILE row, deleting removes it. Can only do this when no PLAYER, ITEM, or NEST reference the TILE row. </w:t>
+      </w:r>
+    </w:p>
+    <w:p>
+      <w:r>
+        <w:rPr>
+          <w:b/>
+          <w:bCs/>
+          <w:u w:val="single"/>
+        </w:rPr>
         <w:t>Admin selecting and placing an item on a tile, storyboard 19, requirement 5</w:t>
       </w:r>
       <w:r>
@@ -5193,9 +5494,9 @@
           <w:noProof/>
         </w:rPr>
         <w:drawing>
-          <wp:inline distT="0" distB="0" distL="0" distR="0" wp14:anchorId="7B1B08BF" wp14:editId="3EB3202C">
-            <wp:extent cx="5399314" cy="3429000"/>
-            <wp:effectExtent l="0" t="0" r="0" b="0"/>
+          <wp:inline distT="0" distB="0" distL="0" distR="0" wp14:anchorId="7B1B08BF" wp14:editId="4E9C818C">
+            <wp:extent cx="6342052" cy="4027714"/>
+            <wp:effectExtent l="0" t="0" r="1905" b="0"/>
             <wp:docPr id="1446191102" name="Picture 11"/>
             <wp:cNvGraphicFramePr>
               <a:graphicFrameLocks xmlns:a="http://schemas.openxmlformats.org/drawingml/2006/main" noChangeAspect="1"/>
@@ -5225,7 +5526,7 @@
                   <pic:spPr bwMode="auto">
                     <a:xfrm>
                       <a:off x="0" y="0"/>
-                      <a:ext cx="5399746" cy="3429274"/>
+                      <a:ext cx="6359325" cy="4038683"/>
                     </a:xfrm>
                     <a:prstGeom prst="rect">
                       <a:avLst/>
@@ -5269,8 +5570,9 @@
         <w:rPr>
           <w:noProof/>
         </w:rPr>
+        <w:lastRenderedPageBreak/>
         <w:drawing>
-          <wp:inline distT="0" distB="0" distL="0" distR="0" wp14:anchorId="769D993D" wp14:editId="2B3AF54C">
+          <wp:inline distT="0" distB="0" distL="0" distR="0" wp14:anchorId="65E15AF0" wp14:editId="116A98D5">
             <wp:extent cx="5486400" cy="3483429"/>
             <wp:effectExtent l="0" t="0" r="0" b="3175"/>
             <wp:docPr id="76937273" name="Picture 12"/>
@@ -5322,6 +5624,12 @@
             </a:graphic>
           </wp:inline>
         </w:drawing>
+      </w:r>
+    </w:p>
+    <w:p/>
+    <w:p>
+      <w:r>
+        <w:t>Placing inserts a new ITEM row. The rubbish bin icon deletes an ITEM row for a tile that has one.</w:t>
       </w:r>
     </w:p>
     <w:p>
@@ -5395,14 +5703,14 @@
         </w:drawing>
       </w:r>
       <w:r>
-        <w:t xml:space="preserve">Requirement 11 has not been considered for this project because there is only one “game” and map shared by all players. Killing this would mean that no one can login. </w:t>
+        <w:t xml:space="preserve"> </w:t>
       </w:r>
     </w:p>
     <w:p>
       <w:pPr>
         <w:pStyle w:val="Heading1"/>
       </w:pPr>
-      <w:bookmarkStart w:id="3" w:name="_Toc238736569"/>
+      <w:bookmarkStart w:id="3" w:name="_Toc239371842"/>
       <w:r>
         <w:t xml:space="preserve">Task 2, </w:t>
       </w:r>
@@ -5437,10 +5745,12 @@
       <w:pPr>
         <w:pStyle w:val="Heading1"/>
       </w:pPr>
+      <w:bookmarkStart w:id="4" w:name="_Toc239371843"/>
       <w:r>
         <w:lastRenderedPageBreak/>
         <w:t>Task 3, CRUD table as part of analysis for the game system:</w:t>
       </w:r>
+      <w:bookmarkEnd w:id="4"/>
     </w:p>
     <w:tbl>
       <w:tblPr>
@@ -6472,6 +6782,7 @@
       <w:pPr>
         <w:pStyle w:val="Heading1"/>
       </w:pPr>
+      <w:bookmarkStart w:id="5" w:name="_Toc239371844"/>
       <w:r>
         <w:lastRenderedPageBreak/>
         <w:t>Task 4</w:t>
@@ -6485,2132 +6796,75 @@
       <w:r>
         <w:t xml:space="preserve"> to create tables and relations between tables to support the game:</w:t>
       </w:r>
+      <w:bookmarkEnd w:id="5"/>
     </w:p>
     <w:p>
       <w:r>
         <w:t xml:space="preserve">Note: Added “name” and “description” to  ITEMTYPE table. </w:t>
       </w:r>
     </w:p>
-    <w:p/>
-    <w:p>
-      <w:r>
-        <w:t>-- DAT602 Assignment 1, Ultimate Goose Fighter</w:t>
-      </w:r>
-    </w:p>
-    <w:p>
-      <w:r>
-        <w:t>-- Zandi Galpin</w:t>
-      </w:r>
-    </w:p>
-    <w:p/>
-    <w:p>
-      <w:r>
-        <w:t>-- one TSQL procedure that creates every table, constraint,</w:t>
-      </w:r>
-    </w:p>
-    <w:p>
-      <w:r>
-        <w:t>-- secondary index, and a set of test data covering all CRUD situations.</w:t>
-      </w:r>
-    </w:p>
-    <w:p/>
-    <w:p>
-      <w:r>
-        <w:t>--Rebuilds the database from scratch each time.</w:t>
-      </w:r>
-    </w:p>
-    <w:p>
-      <w:r>
-        <w:t>-- SINGLE_USER + ROLLBACK IMMEDIATE gets rid of any other open connections</w:t>
-      </w:r>
-    </w:p>
-    <w:p/>
-    <w:p>
-      <w:r>
-        <w:t>USE master;</w:t>
-      </w:r>
-    </w:p>
-    <w:p>
-      <w:r>
-        <w:t>GO</w:t>
-      </w:r>
-    </w:p>
-    <w:p/>
-    <w:p>
-      <w:r>
-        <w:t>IF DB_ID(</w:t>
-      </w:r>
-      <w:proofErr w:type="spellStart"/>
-      <w:r>
-        <w:t>N'GooseFighterDB</w:t>
-      </w:r>
-      <w:proofErr w:type="spellEnd"/>
-      <w:r>
-        <w:t>') IS NOT NULL</w:t>
-      </w:r>
-    </w:p>
-    <w:p>
-      <w:r>
-        <w:t>BEGIN</w:t>
-      </w:r>
-    </w:p>
-    <w:p>
-      <w:r>
-        <w:t xml:space="preserve">    ALTER DATABASE </w:t>
-      </w:r>
-      <w:proofErr w:type="spellStart"/>
-      <w:r>
-        <w:t>GooseFighterDB</w:t>
-      </w:r>
-      <w:proofErr w:type="spellEnd"/>
-      <w:r>
-        <w:t xml:space="preserve"> SET SINGLE_USER WITH ROLLBACK IMMEDIATE;</w:t>
-      </w:r>
-    </w:p>
-    <w:p>
-      <w:r>
-        <w:t xml:space="preserve">    DROP DATABASE </w:t>
-      </w:r>
-      <w:proofErr w:type="spellStart"/>
-      <w:r>
-        <w:t>GooseFighterDB</w:t>
-      </w:r>
-      <w:proofErr w:type="spellEnd"/>
-      <w:r>
-        <w:t>;</w:t>
-      </w:r>
-    </w:p>
-    <w:p>
-      <w:r>
-        <w:t>END</w:t>
-      </w:r>
-    </w:p>
-    <w:p>
-      <w:r>
-        <w:t>GO</w:t>
-      </w:r>
-    </w:p>
-    <w:p/>
-    <w:p>
-      <w:r>
-        <w:t xml:space="preserve">CREATE DATABASE </w:t>
-      </w:r>
-      <w:proofErr w:type="spellStart"/>
-      <w:r>
-        <w:t>GooseFighterDB</w:t>
-      </w:r>
-      <w:proofErr w:type="spellEnd"/>
-      <w:r>
-        <w:t>;</w:t>
-      </w:r>
-    </w:p>
-    <w:p>
-      <w:r>
-        <w:t>GO</w:t>
-      </w:r>
-    </w:p>
-    <w:p/>
-    <w:p>
-      <w:r>
-        <w:t xml:space="preserve">USE </w:t>
-      </w:r>
-      <w:proofErr w:type="spellStart"/>
-      <w:r>
-        <w:t>GooseFighterDB</w:t>
-      </w:r>
-      <w:proofErr w:type="spellEnd"/>
-      <w:r>
-        <w:t>;</w:t>
-      </w:r>
-    </w:p>
-    <w:p>
-      <w:r>
-        <w:lastRenderedPageBreak/>
-        <w:t>GO</w:t>
-      </w:r>
-    </w:p>
-    <w:p/>
-    <w:p>
-      <w:r>
-        <w:t xml:space="preserve">CREATE OR ALTER PROCEDURE </w:t>
-      </w:r>
-      <w:proofErr w:type="spellStart"/>
-      <w:r>
-        <w:t>dbo.usp_CreateGooseFighterDatabase</w:t>
-      </w:r>
-      <w:proofErr w:type="spellEnd"/>
-    </w:p>
-    <w:p>
-      <w:r>
-        <w:t>AS</w:t>
-      </w:r>
-    </w:p>
-    <w:p/>
-    <w:p>
-      <w:r>
-        <w:t>BEGIN</w:t>
-      </w:r>
-    </w:p>
-    <w:p>
-      <w:r>
-        <w:t>    SET NOCOUNT ON;</w:t>
-      </w:r>
-    </w:p>
-    <w:p/>
-    <w:p>
-      <w:r>
-        <w:t>    -- Drop existing tables (child tables first)</w:t>
-      </w:r>
-    </w:p>
-    <w:p>
-      <w:r>
-        <w:t>    IF OBJECT_ID('</w:t>
-      </w:r>
-      <w:proofErr w:type="spellStart"/>
-      <w:r>
-        <w:t>dbo.ChatMessage</w:t>
-      </w:r>
-      <w:proofErr w:type="spellEnd"/>
-      <w:r>
-        <w:t xml:space="preserve">', 'U') IS NOT NULL DROP TABLE </w:t>
-      </w:r>
-      <w:proofErr w:type="spellStart"/>
-      <w:r>
-        <w:t>dbo.ChatMessage</w:t>
-      </w:r>
-      <w:proofErr w:type="spellEnd"/>
-      <w:r>
-        <w:t>;</w:t>
-      </w:r>
-    </w:p>
-    <w:p>
-      <w:r>
-        <w:t>    IF OBJECT_ID('</w:t>
-      </w:r>
-      <w:proofErr w:type="spellStart"/>
-      <w:r>
-        <w:t>dbo.Item</w:t>
-      </w:r>
-      <w:proofErr w:type="spellEnd"/>
-      <w:r>
-        <w:t xml:space="preserve">', 'U')        IS NOT NULL DROP TABLE </w:t>
-      </w:r>
-      <w:proofErr w:type="spellStart"/>
-      <w:r>
-        <w:t>dbo.Item</w:t>
-      </w:r>
-      <w:proofErr w:type="spellEnd"/>
-      <w:r>
-        <w:t>;</w:t>
-      </w:r>
-    </w:p>
-    <w:p>
-      <w:r>
-        <w:t>    IF OBJECT_ID('</w:t>
-      </w:r>
-      <w:proofErr w:type="spellStart"/>
-      <w:r>
-        <w:t>dbo.NPC</w:t>
-      </w:r>
-      <w:proofErr w:type="spellEnd"/>
-      <w:r>
-        <w:t xml:space="preserve">', 'U')         IS NOT NULL DROP TABLE </w:t>
-      </w:r>
-      <w:proofErr w:type="spellStart"/>
-      <w:r>
-        <w:t>dbo.NPC</w:t>
-      </w:r>
-      <w:proofErr w:type="spellEnd"/>
-      <w:r>
-        <w:t>;</w:t>
-      </w:r>
-    </w:p>
-    <w:p>
-      <w:r>
-        <w:t>    IF OBJECT_ID('</w:t>
-      </w:r>
-      <w:proofErr w:type="spellStart"/>
-      <w:r>
-        <w:t>dbo.ItemType</w:t>
-      </w:r>
-      <w:proofErr w:type="spellEnd"/>
-      <w:r>
-        <w:t xml:space="preserve">', 'U')    IS NOT NULL DROP TABLE </w:t>
-      </w:r>
-      <w:proofErr w:type="spellStart"/>
-      <w:r>
-        <w:t>dbo.ItemType</w:t>
-      </w:r>
-      <w:proofErr w:type="spellEnd"/>
-      <w:r>
-        <w:t>;</w:t>
-      </w:r>
-    </w:p>
-    <w:p>
-      <w:r>
-        <w:t>    IF OBJECT_ID('</w:t>
-      </w:r>
-      <w:proofErr w:type="spellStart"/>
-      <w:r>
-        <w:t>dbo.Nest</w:t>
-      </w:r>
-      <w:proofErr w:type="spellEnd"/>
-      <w:r>
-        <w:t xml:space="preserve">', 'U')        IS NOT NULL DROP TABLE </w:t>
-      </w:r>
-      <w:proofErr w:type="spellStart"/>
-      <w:r>
-        <w:t>dbo.Nest</w:t>
-      </w:r>
-      <w:proofErr w:type="spellEnd"/>
-      <w:r>
-        <w:t>;</w:t>
-      </w:r>
-    </w:p>
-    <w:p>
-      <w:r>
-        <w:t>    IF OBJECT_ID('</w:t>
-      </w:r>
-      <w:proofErr w:type="spellStart"/>
-      <w:r>
-        <w:t>dbo.Player</w:t>
-      </w:r>
-      <w:proofErr w:type="spellEnd"/>
-      <w:r>
-        <w:t xml:space="preserve">', 'U')      IS NOT NULL DROP TABLE </w:t>
-      </w:r>
-      <w:proofErr w:type="spellStart"/>
-      <w:r>
-        <w:t>dbo.Player</w:t>
-      </w:r>
-      <w:proofErr w:type="spellEnd"/>
-      <w:r>
-        <w:t>;</w:t>
-      </w:r>
-    </w:p>
-    <w:p>
-      <w:r>
-        <w:t>    IF OBJECT_ID('</w:t>
-      </w:r>
-      <w:proofErr w:type="spellStart"/>
-      <w:r>
-        <w:t>dbo.Tile</w:t>
-      </w:r>
-      <w:proofErr w:type="spellEnd"/>
-      <w:r>
-        <w:t xml:space="preserve">', 'U')        IS NOT NULL DROP TABLE </w:t>
-      </w:r>
-      <w:proofErr w:type="spellStart"/>
-      <w:r>
-        <w:t>dbo.Tile</w:t>
-      </w:r>
-      <w:proofErr w:type="spellEnd"/>
-      <w:r>
-        <w:t>;</w:t>
-      </w:r>
-    </w:p>
-    <w:p/>
-    <w:p>
-      <w:r>
-        <w:t>    --TILE: the game board. No dependencies (made first)</w:t>
-      </w:r>
-    </w:p>
-    <w:p>
-      <w:r>
-        <w:t xml:space="preserve">    CREATE TABLE </w:t>
-      </w:r>
-      <w:proofErr w:type="spellStart"/>
-      <w:r>
-        <w:t>dbo.Tile</w:t>
-      </w:r>
-      <w:proofErr w:type="spellEnd"/>
-      <w:r>
-        <w:t xml:space="preserve"> (</w:t>
-      </w:r>
-    </w:p>
-    <w:p>
-      <w:r>
-        <w:t>        TileID      INT IDENTITY(1,1) NOT NULL,</w:t>
-      </w:r>
-    </w:p>
-    <w:p>
-      <w:r>
-        <w:t>        XPosition   INT NOT NULL,</w:t>
-      </w:r>
-    </w:p>
-    <w:p>
-      <w:r>
-        <w:t>        YPosition   INT NOT NULL,</w:t>
-      </w:r>
-    </w:p>
-    <w:p>
-      <w:r>
-        <w:t xml:space="preserve">        </w:t>
-      </w:r>
-      <w:proofErr w:type="spellStart"/>
-      <w:r>
-        <w:t>IsOccupied</w:t>
-      </w:r>
-      <w:proofErr w:type="spellEnd"/>
-      <w:r>
-        <w:t xml:space="preserve">  BIT NOT NULL DEFAULT (0),</w:t>
-      </w:r>
-    </w:p>
-    <w:p>
-      <w:r>
-        <w:t xml:space="preserve">        CONSTRAINT </w:t>
-      </w:r>
-      <w:proofErr w:type="spellStart"/>
-      <w:r>
-        <w:t>PK_Tile</w:t>
-      </w:r>
-      <w:proofErr w:type="spellEnd"/>
-      <w:r>
-        <w:t xml:space="preserve"> PRIMARY KEY CLUSTERED (TileID),</w:t>
-      </w:r>
-    </w:p>
-    <w:p>
-      <w:r>
-        <w:t xml:space="preserve">        CONSTRAINT </w:t>
-      </w:r>
-      <w:proofErr w:type="spellStart"/>
-      <w:r>
-        <w:t>UQ_Tile_Position</w:t>
-      </w:r>
-      <w:proofErr w:type="spellEnd"/>
-      <w:r>
-        <w:t xml:space="preserve"> UNIQUE (XPosition, YPosition)</w:t>
-      </w:r>
-    </w:p>
-    <w:p>
-      <w:r>
-        <w:t>    );</w:t>
-      </w:r>
-    </w:p>
-    <w:p/>
-    <w:p>
-      <w:r>
-        <w:t>    --PLAYER: accounts and live player state.</w:t>
-      </w:r>
-    </w:p>
-    <w:p>
-      <w:r>
-        <w:lastRenderedPageBreak/>
-        <w:t xml:space="preserve">    CREATE TABLE </w:t>
-      </w:r>
-      <w:proofErr w:type="spellStart"/>
-      <w:r>
-        <w:t>dbo.Player</w:t>
-      </w:r>
-      <w:proofErr w:type="spellEnd"/>
-      <w:r>
-        <w:t xml:space="preserve"> (</w:t>
-      </w:r>
-    </w:p>
-    <w:p>
-      <w:r>
-        <w:t xml:space="preserve">        </w:t>
-      </w:r>
-      <w:proofErr w:type="spellStart"/>
-      <w:r>
-        <w:t>PlayerID</w:t>
-      </w:r>
-      <w:proofErr w:type="spellEnd"/>
-      <w:r>
-        <w:t xml:space="preserve">             INT IDENTITY(1,1) NOT NULL,</w:t>
-      </w:r>
-    </w:p>
-    <w:p>
-      <w:r>
-        <w:t>        Email                VARCHAR(255) NOT NULL,</w:t>
-      </w:r>
-    </w:p>
-    <w:p>
-      <w:r>
-        <w:t>        Username             VARCHAR(100)  NOT NULL,</w:t>
-      </w:r>
-    </w:p>
-    <w:p>
-      <w:r>
-        <w:t>        Password             VARCHAR(100) NOT NULL,</w:t>
-      </w:r>
-    </w:p>
-    <w:p>
-      <w:r>
-        <w:t>        Score                INT NOT NULL DEFAULT (0),</w:t>
-      </w:r>
-    </w:p>
-    <w:p>
-      <w:r>
-        <w:t>        Health               INT NOT NULL DEFAULT (4000),</w:t>
-      </w:r>
-    </w:p>
-    <w:p>
-      <w:r>
-        <w:t>        IsAdmin              BIT NOT NULL DEFAULT (0),</w:t>
-      </w:r>
-    </w:p>
-    <w:p>
-      <w:r>
-        <w:t>        IsOnline             BIT NOT NULL DEFAULT (0),</w:t>
-      </w:r>
-    </w:p>
-    <w:p>
-      <w:r>
-        <w:t>        FailedLoginAttempts  INT NOT NULL DEFAULT (0),</w:t>
-      </w:r>
-    </w:p>
-    <w:p>
-      <w:r>
-        <w:t>        IsLockedOut          BIT NOT NULL DEFAULT (0),</w:t>
-      </w:r>
-    </w:p>
-    <w:p>
-      <w:r>
-        <w:t>        CurrentTileID        INT NULL,</w:t>
-      </w:r>
-    </w:p>
-    <w:p>
-      <w:r>
-        <w:t xml:space="preserve">        </w:t>
-      </w:r>
-      <w:proofErr w:type="spellStart"/>
-      <w:r>
-        <w:t>IsInvincible</w:t>
-      </w:r>
-      <w:proofErr w:type="spellEnd"/>
-      <w:r>
-        <w:t xml:space="preserve">         BIT NOT NULL DEFAULT (0),</w:t>
-      </w:r>
-    </w:p>
-    <w:p>
-      <w:r>
-        <w:t xml:space="preserve">        </w:t>
-      </w:r>
-      <w:proofErr w:type="spellStart"/>
-      <w:r>
-        <w:t>InvincibleUntil</w:t>
-      </w:r>
-      <w:proofErr w:type="spellEnd"/>
-      <w:r>
-        <w:t xml:space="preserve">      DATETIME NULL,</w:t>
-      </w:r>
-    </w:p>
-    <w:p>
-      <w:r>
-        <w:t>        CreatedDate          DATETIME NOT NULL DEFAULT (GETDATE()),</w:t>
-      </w:r>
-    </w:p>
-    <w:p>
-      <w:r>
-        <w:t xml:space="preserve">        CONSTRAINT </w:t>
-      </w:r>
-      <w:proofErr w:type="spellStart"/>
-      <w:r>
-        <w:t>PK_Player</w:t>
-      </w:r>
-      <w:proofErr w:type="spellEnd"/>
-      <w:r>
-        <w:t xml:space="preserve"> PRIMARY KEY CLUSTERED (</w:t>
-      </w:r>
-      <w:proofErr w:type="spellStart"/>
-      <w:r>
-        <w:t>PlayerID</w:t>
-      </w:r>
-      <w:proofErr w:type="spellEnd"/>
-      <w:r>
-        <w:t>),</w:t>
-      </w:r>
-    </w:p>
-    <w:p>
-      <w:r>
-        <w:t xml:space="preserve">        CONSTRAINT </w:t>
-      </w:r>
-      <w:proofErr w:type="spellStart"/>
-      <w:r>
-        <w:t>UQ_Player_Email</w:t>
-      </w:r>
-      <w:proofErr w:type="spellEnd"/>
-      <w:r>
-        <w:t xml:space="preserve"> UNIQUE (Email),</w:t>
-      </w:r>
-    </w:p>
-    <w:p>
-      <w:r>
-        <w:t xml:space="preserve">        CONSTRAINT </w:t>
-      </w:r>
-      <w:proofErr w:type="spellStart"/>
-      <w:r>
-        <w:t>UQ_Player_Username</w:t>
-      </w:r>
-      <w:proofErr w:type="spellEnd"/>
-      <w:r>
-        <w:t xml:space="preserve"> UNIQUE (Username),</w:t>
-      </w:r>
-    </w:p>
-    <w:p>
-      <w:r>
-        <w:t xml:space="preserve">        CONSTRAINT </w:t>
-      </w:r>
-      <w:proofErr w:type="spellStart"/>
-      <w:r>
-        <w:t>FK_Player_Tile</w:t>
-      </w:r>
-      <w:proofErr w:type="spellEnd"/>
-      <w:r>
-        <w:t xml:space="preserve"> FOREIGN KEY (CurrentTileID)</w:t>
-      </w:r>
-    </w:p>
-    <w:p>
-      <w:r>
-        <w:t xml:space="preserve">            REFERENCES </w:t>
-      </w:r>
-      <w:proofErr w:type="spellStart"/>
-      <w:r>
-        <w:t>dbo.Tile</w:t>
-      </w:r>
-      <w:proofErr w:type="spellEnd"/>
-      <w:r>
-        <w:t xml:space="preserve"> (TileID),</w:t>
-      </w:r>
-    </w:p>
-    <w:p>
-      <w:r>
-        <w:t xml:space="preserve">        CONSTRAINT </w:t>
-      </w:r>
-      <w:proofErr w:type="spellStart"/>
-      <w:r>
-        <w:t>CK_Player_FailedLoginAttempts</w:t>
-      </w:r>
-      <w:proofErr w:type="spellEnd"/>
-    </w:p>
-    <w:p>
-      <w:r>
-        <w:t>            CHECK (FailedLoginAttempts BETWEEN 0 AND 5),</w:t>
-      </w:r>
-    </w:p>
-    <w:p>
-      <w:r>
-        <w:t xml:space="preserve">        CONSTRAINT </w:t>
-      </w:r>
-      <w:proofErr w:type="spellStart"/>
-      <w:r>
-        <w:t>CK_Player_Health</w:t>
-      </w:r>
-      <w:proofErr w:type="spellEnd"/>
-    </w:p>
-    <w:p>
-      <w:r>
-        <w:t>            CHECK (Health BETWEEN 0 AND 4000)</w:t>
-      </w:r>
-    </w:p>
-    <w:p>
-      <w:r>
-        <w:t>    );</w:t>
-      </w:r>
-    </w:p>
-    <w:p/>
-    <w:p>
-      <w:r>
-        <w:t xml:space="preserve">    --Secondary index: because the list for who is online is queried very </w:t>
-      </w:r>
-      <w:proofErr w:type="spellStart"/>
-      <w:r>
-        <w:t>very</w:t>
-      </w:r>
-      <w:proofErr w:type="spellEnd"/>
-      <w:r>
-        <w:t xml:space="preserve"> often</w:t>
-      </w:r>
-    </w:p>
-    <w:p>
-      <w:r>
-        <w:t xml:space="preserve">    CREATE NONCLUSTERED INDEX </w:t>
-      </w:r>
-      <w:proofErr w:type="spellStart"/>
-      <w:r>
-        <w:t>IX_Player_IsOnline</w:t>
-      </w:r>
-      <w:proofErr w:type="spellEnd"/>
-      <w:r>
-        <w:t xml:space="preserve"> ON </w:t>
-      </w:r>
-      <w:proofErr w:type="spellStart"/>
-      <w:r>
-        <w:t>dbo.Player</w:t>
-      </w:r>
-      <w:proofErr w:type="spellEnd"/>
-      <w:r>
-        <w:t xml:space="preserve"> (IsOnline);</w:t>
-      </w:r>
-    </w:p>
-    <w:p/>
-    <w:p>
-      <w:r>
-        <w:t>    --NEST: one per player, sits on the tile they spawn in on.</w:t>
-      </w:r>
-    </w:p>
-    <w:p>
-      <w:r>
-        <w:t xml:space="preserve">    CREATE TABLE </w:t>
-      </w:r>
-      <w:proofErr w:type="spellStart"/>
-      <w:r>
-        <w:t>dbo.Nest</w:t>
-      </w:r>
-      <w:proofErr w:type="spellEnd"/>
-      <w:r>
-        <w:t xml:space="preserve"> (</w:t>
-      </w:r>
-    </w:p>
-    <w:p>
-      <w:r>
-        <w:t>        NestID    INT IDENTITY(1,1) NOT NULL,</w:t>
-      </w:r>
-    </w:p>
-    <w:p>
-      <w:r>
-        <w:t xml:space="preserve">        </w:t>
-      </w:r>
-      <w:proofErr w:type="spellStart"/>
-      <w:r>
-        <w:t>PlayerID</w:t>
-      </w:r>
-      <w:proofErr w:type="spellEnd"/>
-      <w:r>
-        <w:t xml:space="preserve">  INT NOT NULL,</w:t>
-      </w:r>
-    </w:p>
-    <w:p>
-      <w:r>
-        <w:t>        TileID    INT NOT NULL,</w:t>
-      </w:r>
-    </w:p>
-    <w:p>
-      <w:r>
-        <w:t xml:space="preserve">        CONSTRAINT </w:t>
-      </w:r>
-      <w:proofErr w:type="spellStart"/>
-      <w:r>
-        <w:t>PK_Nest</w:t>
-      </w:r>
-      <w:proofErr w:type="spellEnd"/>
-      <w:r>
-        <w:t xml:space="preserve"> PRIMARY KEY CLUSTERED (NestID),</w:t>
-      </w:r>
-    </w:p>
-    <w:p>
-      <w:r>
-        <w:t xml:space="preserve">        CONSTRAINT </w:t>
-      </w:r>
-      <w:proofErr w:type="spellStart"/>
-      <w:r>
-        <w:t>UQ_Nest_Player</w:t>
-      </w:r>
-      <w:proofErr w:type="spellEnd"/>
-      <w:r>
-        <w:t xml:space="preserve"> UNIQUE (</w:t>
-      </w:r>
-      <w:proofErr w:type="spellStart"/>
-      <w:r>
-        <w:t>PlayerID</w:t>
-      </w:r>
-      <w:proofErr w:type="spellEnd"/>
-      <w:r>
-        <w:t>),   --1 nest per player</w:t>
-      </w:r>
-    </w:p>
-    <w:p>
-      <w:r>
-        <w:t xml:space="preserve">        CONSTRAINT </w:t>
-      </w:r>
-      <w:proofErr w:type="spellStart"/>
-      <w:r>
-        <w:t>UQ_Nest_Tile</w:t>
-      </w:r>
-      <w:proofErr w:type="spellEnd"/>
-      <w:r>
-        <w:t xml:space="preserve"> UNIQUE (TileID),       --1 nest per tile</w:t>
-      </w:r>
-    </w:p>
-    <w:p>
-      <w:r>
-        <w:t xml:space="preserve">        CONSTRAINT </w:t>
-      </w:r>
-      <w:proofErr w:type="spellStart"/>
-      <w:r>
-        <w:t>FK_Nest_Player</w:t>
-      </w:r>
-      <w:proofErr w:type="spellEnd"/>
-      <w:r>
-        <w:t xml:space="preserve"> FOREIGN KEY (</w:t>
-      </w:r>
-      <w:proofErr w:type="spellStart"/>
-      <w:r>
-        <w:t>PlayerID</w:t>
-      </w:r>
-      <w:proofErr w:type="spellEnd"/>
-      <w:r>
-        <w:t>)</w:t>
-      </w:r>
-    </w:p>
-    <w:p>
-      <w:r>
-        <w:t xml:space="preserve">            REFERENCES </w:t>
-      </w:r>
-      <w:proofErr w:type="spellStart"/>
-      <w:r>
-        <w:t>dbo.Player</w:t>
-      </w:r>
-      <w:proofErr w:type="spellEnd"/>
-      <w:r>
-        <w:t xml:space="preserve"> (</w:t>
-      </w:r>
-      <w:proofErr w:type="spellStart"/>
-      <w:r>
-        <w:t>PlayerID</w:t>
-      </w:r>
-      <w:proofErr w:type="spellEnd"/>
-      <w:r>
-        <w:t>) ON DELETE CASCADE,</w:t>
-      </w:r>
-    </w:p>
-    <w:p>
-      <w:r>
-        <w:t xml:space="preserve">        CONSTRAINT </w:t>
-      </w:r>
-      <w:proofErr w:type="spellStart"/>
-      <w:r>
-        <w:t>FK_Nest_Tile</w:t>
-      </w:r>
-      <w:proofErr w:type="spellEnd"/>
-      <w:r>
-        <w:t xml:space="preserve"> FOREIGN KEY (TileID)</w:t>
-      </w:r>
-    </w:p>
-    <w:p>
-      <w:r>
-        <w:t xml:space="preserve">            REFERENCES </w:t>
-      </w:r>
-      <w:proofErr w:type="spellStart"/>
-      <w:r>
-        <w:t>dbo.Tile</w:t>
-      </w:r>
-      <w:proofErr w:type="spellEnd"/>
-      <w:r>
-        <w:t xml:space="preserve"> (TileID)</w:t>
-      </w:r>
-    </w:p>
-    <w:p>
-      <w:r>
-        <w:t>    );</w:t>
-      </w:r>
-    </w:p>
-    <w:p/>
-    <w:p>
-      <w:r>
-        <w:t>    --ITEMTYPE: lookup table for holdable/consumable items.</w:t>
-      </w:r>
-    </w:p>
-    <w:p>
-      <w:r>
-        <w:t xml:space="preserve">    CREATE TABLE </w:t>
-      </w:r>
-      <w:proofErr w:type="spellStart"/>
-      <w:r>
-        <w:t>dbo.ItemType</w:t>
-      </w:r>
-      <w:proofErr w:type="spellEnd"/>
-      <w:r>
-        <w:t xml:space="preserve"> (</w:t>
-      </w:r>
-    </w:p>
-    <w:p>
-      <w:r>
-        <w:t>        ItemTypeID         INT IDENTITY(1,1) NOT NULL,</w:t>
-      </w:r>
-    </w:p>
-    <w:p>
-      <w:r>
-        <w:t>        Name               VARCHAR(50) NOT NULL,</w:t>
-      </w:r>
-    </w:p>
-    <w:p>
-      <w:r>
-        <w:t>        Category           VARCHAR(20) NOT NULL,</w:t>
-      </w:r>
-    </w:p>
-    <w:p>
-      <w:r>
-        <w:t xml:space="preserve">        </w:t>
-      </w:r>
-      <w:proofErr w:type="spellStart"/>
-      <w:r>
-        <w:t>EffectDescription</w:t>
-      </w:r>
-      <w:proofErr w:type="spellEnd"/>
-      <w:r>
-        <w:t xml:space="preserve">  VARCHAR(200) NULL,</w:t>
-      </w:r>
-    </w:p>
-    <w:p>
-      <w:r>
-        <w:t xml:space="preserve">        </w:t>
-      </w:r>
-      <w:proofErr w:type="spellStart"/>
-      <w:r>
-        <w:t>SpawnRate</w:t>
-      </w:r>
-      <w:proofErr w:type="spellEnd"/>
-      <w:r>
-        <w:t xml:space="preserve">          DECIMAL(5,2) NULL,</w:t>
-      </w:r>
-    </w:p>
-    <w:p>
-      <w:r>
-        <w:t xml:space="preserve">        CONSTRAINT </w:t>
-      </w:r>
-      <w:proofErr w:type="spellStart"/>
-      <w:r>
-        <w:t>PK_ItemType</w:t>
-      </w:r>
-      <w:proofErr w:type="spellEnd"/>
-      <w:r>
-        <w:t xml:space="preserve"> PRIMARY KEY CLUSTERED (ItemTypeID),</w:t>
-      </w:r>
-    </w:p>
-    <w:p>
-      <w:r>
-        <w:t xml:space="preserve">        CONSTRAINT </w:t>
-      </w:r>
-      <w:proofErr w:type="spellStart"/>
-      <w:r>
-        <w:t>UQ_ItemType_Name</w:t>
-      </w:r>
-      <w:proofErr w:type="spellEnd"/>
-      <w:r>
-        <w:t xml:space="preserve"> UNIQUE (Name),</w:t>
-      </w:r>
-    </w:p>
-    <w:p>
-      <w:r>
-        <w:t xml:space="preserve">        CONSTRAINT </w:t>
-      </w:r>
-      <w:proofErr w:type="spellStart"/>
-      <w:r>
-        <w:t>CK_ItemType_Category</w:t>
-      </w:r>
-      <w:proofErr w:type="spellEnd"/>
-    </w:p>
-    <w:p>
-      <w:r>
-        <w:t>            CHECK (Category IN ('Holdable', 'Consumable')),</w:t>
-      </w:r>
-    </w:p>
-    <w:p>
-      <w:r>
-        <w:t xml:space="preserve">        CONSTRAINT </w:t>
-      </w:r>
-      <w:proofErr w:type="spellStart"/>
-      <w:r>
-        <w:t>CK_ItemType_SpawnRate</w:t>
-      </w:r>
-      <w:proofErr w:type="spellEnd"/>
-    </w:p>
-    <w:p>
-      <w:r>
-        <w:t>            CHECK (</w:t>
-      </w:r>
-      <w:proofErr w:type="spellStart"/>
-      <w:r>
-        <w:t>SpawnRate</w:t>
-      </w:r>
-      <w:proofErr w:type="spellEnd"/>
-      <w:r>
-        <w:t xml:space="preserve"> IS NULL OR </w:t>
-      </w:r>
-      <w:proofErr w:type="spellStart"/>
-      <w:r>
-        <w:t>SpawnRate</w:t>
-      </w:r>
-      <w:proofErr w:type="spellEnd"/>
-      <w:r>
-        <w:t xml:space="preserve"> BETWEEN 0 AND 100)</w:t>
-      </w:r>
-    </w:p>
-    <w:p>
-      <w:r>
-        <w:lastRenderedPageBreak/>
-        <w:t>    );</w:t>
-      </w:r>
-    </w:p>
-    <w:p/>
-    <w:p>
-      <w:r>
-        <w:t>    --ITEM: one row per item. Exactly one of TileID/HolderPlayerID/NestID is non null at once.</w:t>
-      </w:r>
-    </w:p>
-    <w:p>
-      <w:r>
-        <w:t xml:space="preserve">    CREATE TABLE </w:t>
-      </w:r>
-      <w:proofErr w:type="spellStart"/>
-      <w:r>
-        <w:t>dbo.Item</w:t>
-      </w:r>
-      <w:proofErr w:type="spellEnd"/>
-      <w:r>
-        <w:t xml:space="preserve"> (</w:t>
-      </w:r>
-    </w:p>
-    <w:p>
-      <w:r>
-        <w:t xml:space="preserve">        </w:t>
-      </w:r>
-      <w:proofErr w:type="spellStart"/>
-      <w:r>
-        <w:t>ItemID</w:t>
-      </w:r>
-      <w:proofErr w:type="spellEnd"/>
-      <w:r>
-        <w:t xml:space="preserve">          INT IDENTITY(1,1) NOT NULL,</w:t>
-      </w:r>
-    </w:p>
-    <w:p>
-      <w:r>
-        <w:t>        ItemTypeID      INT NOT NULL,</w:t>
-      </w:r>
-    </w:p>
-    <w:p>
-      <w:r>
-        <w:t>        TileID          INT NULL,</w:t>
-      </w:r>
-    </w:p>
-    <w:p>
-      <w:r>
-        <w:t>        HolderPlayerID  INT NULL,</w:t>
-      </w:r>
-    </w:p>
-    <w:p>
-      <w:r>
-        <w:t>        NestID          INT NULL,</w:t>
-      </w:r>
-    </w:p>
-    <w:p>
-      <w:r>
-        <w:t>        Ammo            INT NULL,</w:t>
-      </w:r>
-    </w:p>
-    <w:p>
-      <w:r>
-        <w:t xml:space="preserve">        CONSTRAINT </w:t>
-      </w:r>
-      <w:proofErr w:type="spellStart"/>
-      <w:r>
-        <w:t>PK_Item</w:t>
-      </w:r>
-      <w:proofErr w:type="spellEnd"/>
-      <w:r>
-        <w:t xml:space="preserve"> PRIMARY KEY CLUSTERED (</w:t>
-      </w:r>
-      <w:proofErr w:type="spellStart"/>
-      <w:r>
-        <w:t>ItemID</w:t>
-      </w:r>
-      <w:proofErr w:type="spellEnd"/>
-      <w:r>
-        <w:t>),</w:t>
-      </w:r>
-    </w:p>
-    <w:p>
-      <w:r>
-        <w:t xml:space="preserve">        CONSTRAINT </w:t>
-      </w:r>
-      <w:proofErr w:type="spellStart"/>
-      <w:r>
-        <w:t>FK_Item_ItemType</w:t>
-      </w:r>
-      <w:proofErr w:type="spellEnd"/>
-      <w:r>
-        <w:t xml:space="preserve"> FOREIGN KEY (ItemTypeID)</w:t>
-      </w:r>
-    </w:p>
-    <w:p>
-      <w:r>
-        <w:t xml:space="preserve">            REFERENCES </w:t>
-      </w:r>
-      <w:proofErr w:type="spellStart"/>
-      <w:r>
-        <w:t>dbo.ItemType</w:t>
-      </w:r>
-      <w:proofErr w:type="spellEnd"/>
-      <w:r>
-        <w:t xml:space="preserve"> (ItemTypeID),</w:t>
-      </w:r>
-    </w:p>
-    <w:p>
-      <w:r>
-        <w:t xml:space="preserve">        CONSTRAINT </w:t>
-      </w:r>
-      <w:proofErr w:type="spellStart"/>
-      <w:r>
-        <w:t>FK_Item_Tile</w:t>
-      </w:r>
-      <w:proofErr w:type="spellEnd"/>
-      <w:r>
-        <w:t xml:space="preserve"> FOREIGN KEY (TileID)</w:t>
-      </w:r>
-    </w:p>
-    <w:p>
-      <w:r>
-        <w:t xml:space="preserve">            REFERENCES </w:t>
-      </w:r>
-      <w:proofErr w:type="spellStart"/>
-      <w:r>
-        <w:t>dbo.Tile</w:t>
-      </w:r>
-      <w:proofErr w:type="spellEnd"/>
-      <w:r>
-        <w:t xml:space="preserve"> (TileID),</w:t>
-      </w:r>
-    </w:p>
-    <w:p>
-      <w:r>
-        <w:t xml:space="preserve">        CONSTRAINT </w:t>
-      </w:r>
-      <w:proofErr w:type="spellStart"/>
-      <w:r>
-        <w:t>FK_Item_Player</w:t>
-      </w:r>
-      <w:proofErr w:type="spellEnd"/>
-      <w:r>
-        <w:t xml:space="preserve"> FOREIGN KEY (HolderPlayerID)</w:t>
-      </w:r>
-    </w:p>
-    <w:p>
-      <w:r>
-        <w:t xml:space="preserve">            REFERENCES </w:t>
-      </w:r>
-      <w:proofErr w:type="spellStart"/>
-      <w:r>
-        <w:t>dbo.Player</w:t>
-      </w:r>
-      <w:proofErr w:type="spellEnd"/>
-      <w:r>
-        <w:t xml:space="preserve"> (</w:t>
-      </w:r>
-      <w:proofErr w:type="spellStart"/>
-      <w:r>
-        <w:t>PlayerID</w:t>
-      </w:r>
-      <w:proofErr w:type="spellEnd"/>
-      <w:r>
-        <w:t>),</w:t>
-      </w:r>
-    </w:p>
-    <w:p>
-      <w:r>
-        <w:t xml:space="preserve">        CONSTRAINT </w:t>
-      </w:r>
-      <w:proofErr w:type="spellStart"/>
-      <w:r>
-        <w:t>FK_Item_Nest</w:t>
-      </w:r>
-      <w:proofErr w:type="spellEnd"/>
-      <w:r>
-        <w:t xml:space="preserve"> FOREIGN KEY (NestID)</w:t>
-      </w:r>
-    </w:p>
-    <w:p>
-      <w:r>
-        <w:t xml:space="preserve">            REFERENCES </w:t>
-      </w:r>
-      <w:proofErr w:type="spellStart"/>
-      <w:r>
-        <w:t>dbo.Nest</w:t>
-      </w:r>
-      <w:proofErr w:type="spellEnd"/>
-      <w:r>
-        <w:t xml:space="preserve"> (NestID),</w:t>
-      </w:r>
-    </w:p>
-    <w:p>
-      <w:r>
-        <w:t xml:space="preserve">        CONSTRAINT </w:t>
-      </w:r>
-      <w:proofErr w:type="spellStart"/>
-      <w:r>
-        <w:t>CK_Item_Ammo</w:t>
-      </w:r>
-      <w:proofErr w:type="spellEnd"/>
-      <w:r>
-        <w:t xml:space="preserve"> CHECK (Ammo IS NULL OR Ammo &gt;= 0),</w:t>
-      </w:r>
-    </w:p>
-    <w:p>
-      <w:r>
-        <w:t>        CONSTRAINT CK_Item_OneLocation CHECK (</w:t>
-      </w:r>
-    </w:p>
-    <w:p>
-      <w:r>
-        <w:t>            (CASE WHEN TileID IS NOT NULL THEN 1 ELSE 0 END</w:t>
-      </w:r>
-    </w:p>
-    <w:p>
-      <w:r>
-        <w:t>           + CASE WHEN HolderPlayerID IS NOT NULL THEN 1 ELSE 0 END</w:t>
-      </w:r>
-    </w:p>
-    <w:p>
-      <w:r>
-        <w:t>           + CASE WHEN NestID IS NOT NULL THEN 1 ELSE 0 END) = 1</w:t>
-      </w:r>
-    </w:p>
-    <w:p>
-      <w:r>
-        <w:t>        )</w:t>
-      </w:r>
-    </w:p>
-    <w:p>
-      <w:r>
-        <w:t>    );</w:t>
-      </w:r>
-    </w:p>
-    <w:p/>
-    <w:p>
-      <w:r>
-        <w:lastRenderedPageBreak/>
-        <w:t xml:space="preserve">    CREATE NONCLUSTERED INDEX </w:t>
-      </w:r>
-      <w:proofErr w:type="spellStart"/>
-      <w:r>
-        <w:t>IX_Item_TileID</w:t>
-      </w:r>
-      <w:proofErr w:type="spellEnd"/>
-      <w:r>
-        <w:t xml:space="preserve"> ON </w:t>
-      </w:r>
-      <w:proofErr w:type="spellStart"/>
-      <w:r>
-        <w:t>dbo.Item</w:t>
-      </w:r>
-      <w:proofErr w:type="spellEnd"/>
-      <w:r>
-        <w:t xml:space="preserve"> (TileID);</w:t>
-      </w:r>
-    </w:p>
-    <w:p>
-      <w:r>
-        <w:t xml:space="preserve">    CREATE NONCLUSTERED INDEX </w:t>
-      </w:r>
-      <w:proofErr w:type="spellStart"/>
-      <w:r>
-        <w:t>IX_Item_HolderPlayerID</w:t>
-      </w:r>
-      <w:proofErr w:type="spellEnd"/>
-      <w:r>
-        <w:t xml:space="preserve"> ON </w:t>
-      </w:r>
-      <w:proofErr w:type="spellStart"/>
-      <w:r>
-        <w:t>dbo.Item</w:t>
-      </w:r>
-      <w:proofErr w:type="spellEnd"/>
-      <w:r>
-        <w:t xml:space="preserve"> (HolderPlayerID);</w:t>
-      </w:r>
-    </w:p>
-    <w:p>
-      <w:r>
-        <w:t xml:space="preserve">    CREATE NONCLUSTERED INDEX </w:t>
-      </w:r>
-      <w:proofErr w:type="spellStart"/>
-      <w:r>
-        <w:t>IX_Item_NestID</w:t>
-      </w:r>
-      <w:proofErr w:type="spellEnd"/>
-      <w:r>
-        <w:t xml:space="preserve"> ON </w:t>
-      </w:r>
-      <w:proofErr w:type="spellStart"/>
-      <w:r>
-        <w:t>dbo.Item</w:t>
-      </w:r>
-      <w:proofErr w:type="spellEnd"/>
-      <w:r>
-        <w:t xml:space="preserve"> (NestID);</w:t>
-      </w:r>
-    </w:p>
-    <w:p/>
-    <w:p>
-      <w:r>
-        <w:t>    --NPC (grey goose) table</w:t>
-      </w:r>
-    </w:p>
-    <w:p>
-      <w:r>
-        <w:t xml:space="preserve">    CREATE TABLE </w:t>
-      </w:r>
-      <w:proofErr w:type="spellStart"/>
-      <w:r>
-        <w:t>dbo.NPC</w:t>
-      </w:r>
-      <w:proofErr w:type="spellEnd"/>
-      <w:r>
-        <w:t xml:space="preserve"> (</w:t>
-      </w:r>
-    </w:p>
-    <w:p>
-      <w:r>
-        <w:t>        NPCID        INT IDENTITY(1,1) NOT NULL,</w:t>
-      </w:r>
-    </w:p>
-    <w:p>
-      <w:r>
-        <w:t>        TileID       INT NOT NULL,</w:t>
-      </w:r>
-    </w:p>
-    <w:p>
-      <w:r>
-        <w:t>        Health       INT NOT NULL DEFAULT (1000),</w:t>
-      </w:r>
-    </w:p>
-    <w:p>
-      <w:r>
-        <w:t xml:space="preserve">        </w:t>
-      </w:r>
-      <w:proofErr w:type="spellStart"/>
-      <w:r>
-        <w:t>MaxHealth</w:t>
-      </w:r>
-      <w:proofErr w:type="spellEnd"/>
-      <w:r>
-        <w:t xml:space="preserve">    INT NOT NULL DEFAULT (1000),</w:t>
-      </w:r>
-    </w:p>
-    <w:p>
-      <w:r>
-        <w:t>        IsAlive      BIT NOT NULL DEFAULT (1),</w:t>
-      </w:r>
-    </w:p>
-    <w:p>
-      <w:r>
-        <w:t>        RespawnTime  DATETIME NULL,</w:t>
-      </w:r>
-    </w:p>
-    <w:p>
-      <w:r>
-        <w:t>        CONSTRAINT PK_NPC PRIMARY KEY CLUSTERED (NPCID),</w:t>
-      </w:r>
-    </w:p>
-    <w:p>
-      <w:r>
-        <w:t xml:space="preserve">        CONSTRAINT </w:t>
-      </w:r>
-      <w:proofErr w:type="spellStart"/>
-      <w:r>
-        <w:t>FK_NPC_Tile</w:t>
-      </w:r>
-      <w:proofErr w:type="spellEnd"/>
-      <w:r>
-        <w:t xml:space="preserve"> FOREIGN KEY (TileID)</w:t>
-      </w:r>
-    </w:p>
-    <w:p>
-      <w:r>
-        <w:t xml:space="preserve">            REFERENCES </w:t>
-      </w:r>
-      <w:proofErr w:type="spellStart"/>
-      <w:r>
-        <w:t>dbo.Tile</w:t>
-      </w:r>
-      <w:proofErr w:type="spellEnd"/>
-      <w:r>
-        <w:t xml:space="preserve"> (TileID),</w:t>
-      </w:r>
-    </w:p>
-    <w:p>
-      <w:r>
-        <w:t xml:space="preserve">        CONSTRAINT </w:t>
-      </w:r>
-      <w:proofErr w:type="spellStart"/>
-      <w:r>
-        <w:t>CK_NPC_Health</w:t>
-      </w:r>
-      <w:proofErr w:type="spellEnd"/>
-      <w:r>
-        <w:t xml:space="preserve"> CHECK (Health BETWEEN 0 AND </w:t>
-      </w:r>
-      <w:proofErr w:type="spellStart"/>
-      <w:r>
-        <w:t>MaxHealth</w:t>
-      </w:r>
-      <w:proofErr w:type="spellEnd"/>
-      <w:r>
-        <w:t>)</w:t>
-      </w:r>
-    </w:p>
-    <w:p>
-      <w:r>
-        <w:t>    );</w:t>
-      </w:r>
-    </w:p>
-    <w:p/>
-    <w:p>
-      <w:r>
-        <w:t>    --CHATMESSAGE: global broadcast chat</w:t>
-      </w:r>
-    </w:p>
-    <w:p>
-      <w:r>
-        <w:t xml:space="preserve">    CREATE TABLE </w:t>
-      </w:r>
-      <w:proofErr w:type="spellStart"/>
-      <w:r>
-        <w:t>dbo.ChatMessage</w:t>
-      </w:r>
-      <w:proofErr w:type="spellEnd"/>
-      <w:r>
-        <w:t xml:space="preserve"> (</w:t>
-      </w:r>
-    </w:p>
-    <w:p>
-      <w:r>
-        <w:t xml:space="preserve">        </w:t>
-      </w:r>
-      <w:proofErr w:type="spellStart"/>
-      <w:r>
-        <w:t>MessageID</w:t>
-      </w:r>
-      <w:proofErr w:type="spellEnd"/>
-      <w:r>
-        <w:t xml:space="preserve">       INT IDENTITY(1,1) NOT NULL,</w:t>
-      </w:r>
-    </w:p>
-    <w:p>
-      <w:r>
-        <w:t>        SenderPlayerID  INT NOT NULL,</w:t>
-      </w:r>
-    </w:p>
-    <w:p>
-      <w:r>
-        <w:t xml:space="preserve">        </w:t>
-      </w:r>
-      <w:proofErr w:type="spellStart"/>
-      <w:r>
-        <w:t>MessageText</w:t>
-      </w:r>
-      <w:proofErr w:type="spellEnd"/>
-      <w:r>
-        <w:t xml:space="preserve">     VARCHAR(500) NOT NULL,</w:t>
-      </w:r>
-    </w:p>
-    <w:p>
-      <w:r>
-        <w:t xml:space="preserve">        </w:t>
-      </w:r>
-      <w:proofErr w:type="spellStart"/>
-      <w:r>
-        <w:t>SentDate</w:t>
-      </w:r>
-      <w:proofErr w:type="spellEnd"/>
-      <w:r>
-        <w:t xml:space="preserve">        DATETIME NOT NULL DEFAULT (GETDATE()),</w:t>
-      </w:r>
-    </w:p>
-    <w:p>
-      <w:r>
-        <w:t xml:space="preserve">        CONSTRAINT </w:t>
-      </w:r>
-      <w:proofErr w:type="spellStart"/>
-      <w:r>
-        <w:t>PK_ChatMessage</w:t>
-      </w:r>
-      <w:proofErr w:type="spellEnd"/>
-      <w:r>
-        <w:t xml:space="preserve"> PRIMARY KEY CLUSTERED (</w:t>
-      </w:r>
-      <w:proofErr w:type="spellStart"/>
-      <w:r>
-        <w:t>MessageID</w:t>
-      </w:r>
-      <w:proofErr w:type="spellEnd"/>
-      <w:r>
-        <w:t>),</w:t>
-      </w:r>
-    </w:p>
-    <w:p>
-      <w:r>
-        <w:t xml:space="preserve">        CONSTRAINT </w:t>
-      </w:r>
-      <w:proofErr w:type="spellStart"/>
-      <w:r>
-        <w:t>FK_ChatMessage_Player</w:t>
-      </w:r>
-      <w:proofErr w:type="spellEnd"/>
-      <w:r>
-        <w:t xml:space="preserve"> FOREIGN KEY (SenderPlayerID)</w:t>
-      </w:r>
-    </w:p>
-    <w:p>
-      <w:r>
-        <w:t xml:space="preserve">            REFERENCES </w:t>
-      </w:r>
-      <w:proofErr w:type="spellStart"/>
-      <w:r>
-        <w:t>dbo.Player</w:t>
-      </w:r>
-      <w:proofErr w:type="spellEnd"/>
-      <w:r>
-        <w:t xml:space="preserve"> (</w:t>
-      </w:r>
-      <w:proofErr w:type="spellStart"/>
-      <w:r>
-        <w:t>PlayerID</w:t>
-      </w:r>
-      <w:proofErr w:type="spellEnd"/>
-      <w:r>
-        <w:t>) ON DELETE CASCADE</w:t>
-      </w:r>
-    </w:p>
-    <w:p>
-      <w:r>
-        <w:lastRenderedPageBreak/>
-        <w:t>    );</w:t>
-      </w:r>
-    </w:p>
-    <w:p/>
-    <w:p>
-      <w:r>
-        <w:t xml:space="preserve">    CREATE NONCLUSTERED INDEX </w:t>
-      </w:r>
-      <w:proofErr w:type="spellStart"/>
-      <w:r>
-        <w:t>IX_ChatMessage_SentDate</w:t>
-      </w:r>
-      <w:proofErr w:type="spellEnd"/>
-      <w:r>
-        <w:t xml:space="preserve"> ON </w:t>
-      </w:r>
-      <w:proofErr w:type="spellStart"/>
-      <w:r>
-        <w:t>dbo.ChatMessage</w:t>
-      </w:r>
-      <w:proofErr w:type="spellEnd"/>
-      <w:r>
-        <w:t xml:space="preserve"> (</w:t>
-      </w:r>
-      <w:proofErr w:type="spellStart"/>
-      <w:r>
-        <w:t>SentDate</w:t>
-      </w:r>
-      <w:proofErr w:type="spellEnd"/>
-      <w:r>
-        <w:t>);</w:t>
-      </w:r>
-    </w:p>
-    <w:p/>
-    <w:p>
-      <w:r>
-        <w:t>    --TEST DATA: covers every CRUD situation from the CRUD table:</w:t>
-      </w:r>
-    </w:p>
-    <w:p>
-      <w:r>
-        <w:t>    --login/lockout, registration, tile layout, item placement,</w:t>
-      </w:r>
-    </w:p>
-    <w:p>
-      <w:r>
-        <w:t>    --movement, scoring, inventory, NPC/item movement, chat</w:t>
-      </w:r>
-    </w:p>
-    <w:p>
-      <w:r>
-        <w:t>    -- Tiles: a 5x5 board (25 tiles), IDs assigned 1-25 in x-then-y order</w:t>
-      </w:r>
-    </w:p>
-    <w:p>
-      <w:r>
-        <w:t>    DECLARE @x INT = 0, @y INT;</w:t>
-      </w:r>
-    </w:p>
-    <w:p>
-      <w:r>
-        <w:t>    WHILE @x &lt; 5</w:t>
-      </w:r>
-    </w:p>
-    <w:p>
-      <w:r>
-        <w:t>    BEGIN</w:t>
-      </w:r>
-    </w:p>
-    <w:p>
-      <w:r>
-        <w:t>        SET @y = 0;</w:t>
-      </w:r>
-    </w:p>
-    <w:p>
-      <w:r>
-        <w:t>        WHILE @y &lt; 5</w:t>
-      </w:r>
-    </w:p>
-    <w:p>
-      <w:r>
-        <w:t>        BEGIN</w:t>
-      </w:r>
-    </w:p>
-    <w:p>
-      <w:r>
-        <w:t xml:space="preserve">            INSERT INTO </w:t>
-      </w:r>
-      <w:proofErr w:type="spellStart"/>
-      <w:r>
-        <w:t>dbo.Tile</w:t>
-      </w:r>
-      <w:proofErr w:type="spellEnd"/>
-      <w:r>
-        <w:t xml:space="preserve"> (XPosition, YPosition) VALUES (@x, @y);</w:t>
-      </w:r>
-    </w:p>
-    <w:p>
-      <w:r>
-        <w:t>            SET @y += 1;</w:t>
-      </w:r>
-    </w:p>
-    <w:p>
-      <w:r>
-        <w:t>        END</w:t>
-      </w:r>
-    </w:p>
-    <w:p>
-      <w:r>
-        <w:t>        SET @x += 1;</w:t>
-      </w:r>
-    </w:p>
-    <w:p>
-      <w:r>
-        <w:t>    END</w:t>
-      </w:r>
-    </w:p>
-    <w:p/>
-    <w:p>
-      <w:r>
-        <w:t>    --Players: has admin, online player, offline player,</w:t>
-      </w:r>
-    </w:p>
-    <w:p>
-      <w:r>
-        <w:t>    --locked-out player, and an admin created player who has</w:t>
-      </w:r>
-    </w:p>
-    <w:p>
-      <w:r>
-        <w:t>    -- never logged in (no nest and no CurrentTileID yet)</w:t>
-      </w:r>
-    </w:p>
-    <w:p>
-      <w:r>
-        <w:t xml:space="preserve">    INSERT INTO </w:t>
-      </w:r>
-      <w:proofErr w:type="spellStart"/>
-      <w:r>
-        <w:t>dbo.Player</w:t>
-      </w:r>
-      <w:proofErr w:type="spellEnd"/>
-      <w:r>
-        <w:t xml:space="preserve"> (Email, Username, Password, IsAdmin, IsOnline)</w:t>
-      </w:r>
-    </w:p>
-    <w:p>
-      <w:r>
-        <w:t>    VALUES ('admin@goosefighter.com', '</w:t>
-      </w:r>
-      <w:proofErr w:type="spellStart"/>
-      <w:r>
-        <w:t>AdminGoose</w:t>
-      </w:r>
-      <w:proofErr w:type="spellEnd"/>
-      <w:r>
-        <w:t>', 'AdminPass123!', 1, 0);</w:t>
-      </w:r>
-    </w:p>
-    <w:p/>
-    <w:p>
-      <w:r>
-        <w:t xml:space="preserve">    INSERT INTO </w:t>
-      </w:r>
-      <w:proofErr w:type="spellStart"/>
-      <w:r>
-        <w:t>dbo.Player</w:t>
-      </w:r>
-      <w:proofErr w:type="spellEnd"/>
-      <w:r>
-        <w:t xml:space="preserve"> (Email, Username, Password, Score, Health, IsOnline, CurrentTileID)</w:t>
-      </w:r>
-    </w:p>
-    <w:p>
-      <w:r>
-        <w:lastRenderedPageBreak/>
-        <w:t>    VALUES ('zandi@example.com', '</w:t>
-      </w:r>
-      <w:proofErr w:type="spellStart"/>
-      <w:r>
-        <w:t>ZandiGoose</w:t>
-      </w:r>
-      <w:proofErr w:type="spellEnd"/>
-      <w:r>
-        <w:t>', 'Password123', 3, 3100, 1, 13);</w:t>
-      </w:r>
-    </w:p>
-    <w:p/>
-    <w:p>
-      <w:r>
-        <w:t xml:space="preserve">    INSERT INTO </w:t>
-      </w:r>
-      <w:proofErr w:type="spellStart"/>
-      <w:r>
-        <w:t>dbo.Player</w:t>
-      </w:r>
-      <w:proofErr w:type="spellEnd"/>
-      <w:r>
-        <w:t xml:space="preserve"> (Email, Username, Password, Score, Health, IsOnline, CurrentTileID)</w:t>
-      </w:r>
-    </w:p>
-    <w:p>
-      <w:r>
-        <w:t>    VALUES ('mcplayer@example.com', '</w:t>
-      </w:r>
-      <w:proofErr w:type="spellStart"/>
-      <w:r>
-        <w:t>McPlayerTwoington</w:t>
-      </w:r>
-      <w:proofErr w:type="spellEnd"/>
-      <w:r>
-        <w:t>', 'Passw0rd!', 5, 4000, 0, 7);</w:t>
-      </w:r>
-    </w:p>
-    <w:p/>
-    <w:p>
-      <w:r>
-        <w:t xml:space="preserve">    INSERT INTO </w:t>
-      </w:r>
-      <w:proofErr w:type="spellStart"/>
-      <w:r>
-        <w:t>dbo.Player</w:t>
-      </w:r>
-      <w:proofErr w:type="spellEnd"/>
-      <w:r>
-        <w:t xml:space="preserve"> (Email, Username, Password, FailedLoginAttempts, IsLockedOut)</w:t>
-      </w:r>
-    </w:p>
-    <w:p>
-      <w:r>
-        <w:t>    VALUES ('lockedout@example.com', '</w:t>
-      </w:r>
-      <w:proofErr w:type="spellStart"/>
-      <w:r>
-        <w:t>LockedGoose</w:t>
-      </w:r>
-      <w:proofErr w:type="spellEnd"/>
-      <w:r>
-        <w:t>', '</w:t>
-      </w:r>
-      <w:proofErr w:type="spellStart"/>
-      <w:r>
-        <w:t>wrongpass</w:t>
-      </w:r>
-      <w:proofErr w:type="spellEnd"/>
-      <w:r>
-        <w:t>', 5, 1);</w:t>
-      </w:r>
-    </w:p>
-    <w:p/>
-    <w:p>
-      <w:r>
-        <w:t xml:space="preserve">    INSERT INTO </w:t>
-      </w:r>
-      <w:proofErr w:type="spellStart"/>
-      <w:r>
-        <w:t>dbo.Player</w:t>
-      </w:r>
-      <w:proofErr w:type="spellEnd"/>
-      <w:r>
-        <w:t xml:space="preserve"> (Email, Username, Password)</w:t>
-      </w:r>
-    </w:p>
-    <w:p>
-      <w:r>
-        <w:t>    VALUES ('newplayer@example.com', '</w:t>
-      </w:r>
-      <w:proofErr w:type="spellStart"/>
-      <w:r>
-        <w:t>BranfNewGoose</w:t>
-      </w:r>
-      <w:proofErr w:type="spellEnd"/>
-      <w:r>
-        <w:t>', 'TempPass1');</w:t>
-      </w:r>
-    </w:p>
-    <w:p/>
-    <w:p>
-      <w:r>
-        <w:t>    --nests for the two players who have spawned in</w:t>
-      </w:r>
-    </w:p>
-    <w:p>
-      <w:r>
-        <w:t xml:space="preserve">    INSERT INTO </w:t>
-      </w:r>
-      <w:proofErr w:type="spellStart"/>
-      <w:r>
-        <w:t>dbo.Nest</w:t>
-      </w:r>
-      <w:proofErr w:type="spellEnd"/>
-      <w:r>
-        <w:t xml:space="preserve"> (</w:t>
-      </w:r>
-      <w:proofErr w:type="spellStart"/>
-      <w:r>
-        <w:t>PlayerID</w:t>
-      </w:r>
-      <w:proofErr w:type="spellEnd"/>
-      <w:r>
-        <w:t xml:space="preserve">, TileID) VALUES (2, 13); -- </w:t>
-      </w:r>
-      <w:proofErr w:type="spellStart"/>
-      <w:r>
-        <w:t>ZandiGoose</w:t>
-      </w:r>
-      <w:proofErr w:type="spellEnd"/>
-    </w:p>
-    <w:p>
-      <w:r>
-        <w:t xml:space="preserve">    INSERT INTO </w:t>
-      </w:r>
-      <w:proofErr w:type="spellStart"/>
-      <w:r>
-        <w:t>dbo.Nest</w:t>
-      </w:r>
-      <w:proofErr w:type="spellEnd"/>
-      <w:r>
-        <w:t xml:space="preserve"> (</w:t>
-      </w:r>
-      <w:proofErr w:type="spellStart"/>
-      <w:r>
-        <w:t>PlayerID</w:t>
-      </w:r>
-      <w:proofErr w:type="spellEnd"/>
-      <w:r>
-        <w:t xml:space="preserve">, TileID) VALUES (3, 7);  -- </w:t>
-      </w:r>
-      <w:proofErr w:type="spellStart"/>
-      <w:r>
-        <w:t>McPlayerTwoington</w:t>
-      </w:r>
-      <w:proofErr w:type="spellEnd"/>
-    </w:p>
-    <w:p/>
-    <w:p>
-      <w:r>
-        <w:t xml:space="preserve">    --item types: all 4 holdable + 4 </w:t>
+    <w:p>
+      <w:r>
+        <w:t>The DDL SQL script itself is provided as a separate file (it is also in the GitHub repository).</w:t>
+      </w:r>
+    </w:p>
+    <w:p>
+      <w:r>
+        <w:t xml:space="preserve">The DDL is implemented as a single T-SQL procedure (usp_CreateGooseFighterDatabase), which builds the entire database from scratch, including all 7 tables with constraints and indexes, and some test data which covers everything in the CRUD table. The script can be run repeatedly without error by checking if each part exists (dropping first if it does) before creating it. It kicks anyone connected to it first before doing this. This is good for repeated testing. </w:t>
+      </w:r>
+    </w:p>
+    <w:p>
+      <w:r>
+        <w:t xml:space="preserve">Tables were created in dependency order (because foreign keys </w:t>
       </w:r>
       <w:proofErr w:type="gramStart"/>
       <w:r>
-        <w:t>consumable</w:t>
+        <w:t>cant</w:t>
       </w:r>
       <w:proofErr w:type="gramEnd"/>
-    </w:p>
-    <w:p>
-      <w:r>
-        <w:t xml:space="preserve">    INSERT INTO </w:t>
-      </w:r>
-      <w:proofErr w:type="spellStart"/>
-      <w:r>
-        <w:t>dbo.ItemType</w:t>
-      </w:r>
-      <w:proofErr w:type="spellEnd"/>
-      <w:r>
-        <w:t xml:space="preserve"> (Name, Category, </w:t>
-      </w:r>
-      <w:proofErr w:type="spellStart"/>
-      <w:r>
-        <w:t>EffectDescription</w:t>
-      </w:r>
-      <w:proofErr w:type="spellEnd"/>
-      <w:r>
-        <w:t xml:space="preserve">, </w:t>
-      </w:r>
-      <w:proofErr w:type="spellStart"/>
-      <w:r>
-        <w:t>SpawnRate</w:t>
-      </w:r>
-      <w:proofErr w:type="spellEnd"/>
-      <w:r>
-        <w:t>) VALUES</w:t>
-      </w:r>
-    </w:p>
-    <w:p>
-      <w:r>
-        <w:t>        ('Baseball Bat', 'Holdable',   '+50% attack damage',                         15.00),</w:t>
-      </w:r>
-    </w:p>
-    <w:p>
-      <w:r>
-        <w:t>        ('Pellet Gun',   'Holdable',   '-50% attack damage, ranged, 3-10 ammo',      10.00),</w:t>
-      </w:r>
-    </w:p>
-    <w:p>
-      <w:r>
-        <w:t>        ('Shield',       'Holdable',   '-50% incoming damage, -25% outgoing damage', 12.00),</w:t>
-      </w:r>
-    </w:p>
-    <w:p>
-      <w:r>
-        <w:t>        ('Grenade',      'Holdable',   'Thrown 3 tiles, 500% damage in 3x3 area',     5.00),</w:t>
-      </w:r>
-    </w:p>
-    <w:p>
-      <w:r>
-        <w:t>        ('Peas',         'Consumable', 'Regain 200 health',                          30.00),</w:t>
-      </w:r>
-    </w:p>
-    <w:p>
-      <w:r>
-        <w:t>        ('Banana',       'Consumable', 'Regain 400 health',                          15.00),</w:t>
-      </w:r>
-    </w:p>
-    <w:p>
-      <w:r>
-        <w:t>        ('Grapes',       'Consumable', 'Invincibility for 5 seconds',                 5.00),</w:t>
-      </w:r>
-    </w:p>
-    <w:p>
-      <w:r>
-        <w:t>        ('Watermelon',   'Consumable', 'Regain 1000 health',                          5.00);</w:t>
-      </w:r>
-    </w:p>
-    <w:p/>
-    <w:p>
-      <w:r>
-        <w:t>    --Items in all location states</w:t>
-      </w:r>
-    </w:p>
-    <w:p>
-      <w:r>
-        <w:lastRenderedPageBreak/>
-        <w:t xml:space="preserve">    INSERT INTO </w:t>
-      </w:r>
-      <w:proofErr w:type="spellStart"/>
-      <w:r>
-        <w:t>dbo.Item</w:t>
-      </w:r>
-      <w:proofErr w:type="spellEnd"/>
-      <w:r>
-        <w:t xml:space="preserve"> (ItemTypeID, HolderPlayerID) VALUES (1, 2);        --bat held by player</w:t>
-      </w:r>
-    </w:p>
-    <w:p>
-      <w:r>
-        <w:t xml:space="preserve">    INSERT INTO </w:t>
-      </w:r>
-      <w:proofErr w:type="spellStart"/>
-      <w:r>
-        <w:t>dbo.Item</w:t>
-      </w:r>
-      <w:proofErr w:type="spellEnd"/>
-      <w:r>
-        <w:t xml:space="preserve"> (ItemTypeID, NestID)         VALUES (3, 1);        --shield stored in player's nest</w:t>
-      </w:r>
-    </w:p>
-    <w:p>
-      <w:r>
-        <w:t xml:space="preserve">    INSERT INTO </w:t>
-      </w:r>
-      <w:proofErr w:type="spellStart"/>
-      <w:r>
-        <w:t>dbo.Item</w:t>
-      </w:r>
-      <w:proofErr w:type="spellEnd"/>
-      <w:r>
-        <w:t xml:space="preserve"> (ItemTypeID, NestID)         VALUES (5, 1);        --peas stored in player's nest</w:t>
-      </w:r>
-    </w:p>
-    <w:p>
-      <w:r>
-        <w:t xml:space="preserve">    INSERT INTO </w:t>
-      </w:r>
-      <w:proofErr w:type="spellStart"/>
-      <w:r>
-        <w:t>dbo.Item</w:t>
-      </w:r>
-      <w:proofErr w:type="spellEnd"/>
-      <w:r>
-        <w:t xml:space="preserve"> (ItemTypeID, TileID)         VALUES (8, 19);       --watermelon lying on a tile</w:t>
-      </w:r>
-    </w:p>
-    <w:p>
-      <w:r>
-        <w:t xml:space="preserve">    INSERT INTO </w:t>
-      </w:r>
-      <w:proofErr w:type="spellStart"/>
-      <w:r>
-        <w:t>dbo.Item</w:t>
-      </w:r>
-      <w:proofErr w:type="spellEnd"/>
-      <w:r>
-        <w:t xml:space="preserve"> (ItemTypeID, TileID, Ammo)   VALUES (2, 6, 7);     --pellet gun on a tile with ammo</w:t>
-      </w:r>
-    </w:p>
-    <w:p>
-      <w:r>
-        <w:t xml:space="preserve">    </w:t>
-      </w:r>
-    </w:p>
-    <w:p>
-      <w:r>
-        <w:t>    --NPC</w:t>
-      </w:r>
-    </w:p>
-    <w:p>
-      <w:r>
-        <w:t xml:space="preserve">    INSERT INTO </w:t>
-      </w:r>
-      <w:proofErr w:type="spellStart"/>
-      <w:r>
-        <w:t>dbo.NPC</w:t>
-      </w:r>
-      <w:proofErr w:type="spellEnd"/>
-      <w:r>
-        <w:t xml:space="preserve"> (TileID, Health, </w:t>
-      </w:r>
-      <w:proofErr w:type="spellStart"/>
-      <w:r>
-        <w:t>MaxHealth</w:t>
-      </w:r>
-      <w:proofErr w:type="spellEnd"/>
-      <w:r>
-        <w:t>, IsAlive) VALUES (11, 1000, 1000, 1);</w:t>
-      </w:r>
-    </w:p>
-    <w:p/>
-    <w:p>
-      <w:r>
-        <w:t>    --chat messages</w:t>
-      </w:r>
-    </w:p>
-    <w:p>
-      <w:r>
-        <w:t xml:space="preserve">    INSERT INTO </w:t>
-      </w:r>
-      <w:proofErr w:type="spellStart"/>
-      <w:r>
-        <w:t>dbo.ChatMessage</w:t>
-      </w:r>
-      <w:proofErr w:type="spellEnd"/>
-      <w:r>
-        <w:t xml:space="preserve"> (SenderPlayerID, </w:t>
-      </w:r>
-      <w:proofErr w:type="spellStart"/>
-      <w:r>
-        <w:t>MessageText</w:t>
-      </w:r>
-      <w:proofErr w:type="spellEnd"/>
-      <w:r>
-        <w:t>)</w:t>
-      </w:r>
-    </w:p>
-    <w:p>
-      <w:r>
-        <w:t>    VALUES (2, '</w:t>
-      </w:r>
-      <w:proofErr w:type="spellStart"/>
-      <w:r>
-        <w:t>yoooo</w:t>
-      </w:r>
-      <w:proofErr w:type="spellEnd"/>
-      <w:r>
-        <w:t xml:space="preserve"> </w:t>
-      </w:r>
-      <w:proofErr w:type="spellStart"/>
-      <w:r>
-        <w:t>whats</w:t>
-      </w:r>
-      <w:proofErr w:type="spellEnd"/>
-      <w:r>
-        <w:t xml:space="preserve"> up guys????');</w:t>
-      </w:r>
-    </w:p>
-    <w:p>
-      <w:r>
-        <w:t xml:space="preserve">    INSERT INTO </w:t>
-      </w:r>
-      <w:proofErr w:type="spellStart"/>
-      <w:r>
-        <w:t>dbo.ChatMessage</w:t>
-      </w:r>
-      <w:proofErr w:type="spellEnd"/>
-      <w:r>
-        <w:t xml:space="preserve"> (SenderPlayerID, </w:t>
-      </w:r>
-      <w:proofErr w:type="spellStart"/>
-      <w:r>
-        <w:t>MessageText</w:t>
-      </w:r>
-      <w:proofErr w:type="spellEnd"/>
-      <w:r>
-        <w:t>)</w:t>
-      </w:r>
-    </w:p>
-    <w:p>
-      <w:r>
-        <w:t>    VALUES (3, 'WATCH OUT HES GOT A PELLET GUN');</w:t>
-      </w:r>
-    </w:p>
-    <w:p/>
-    <w:p>
-      <w:r>
-        <w:t>END</w:t>
-      </w:r>
-    </w:p>
-    <w:p>
-      <w:r>
-        <w:t>GO</w:t>
-      </w:r>
-    </w:p>
-    <w:p/>
-    <w:p>
-      <w:r>
-        <w:t>--procedure to build the database and populate test data</w:t>
-      </w:r>
-    </w:p>
-    <w:p>
-      <w:r>
-        <w:t xml:space="preserve">EXEC </w:t>
-      </w:r>
-      <w:proofErr w:type="spellStart"/>
-      <w:r>
-        <w:t>dbo.usp_CreateGooseFighterDatabase</w:t>
-      </w:r>
-      <w:proofErr w:type="spellEnd"/>
-      <w:r>
-        <w:t>;</w:t>
-      </w:r>
-    </w:p>
-    <w:p>
-      <w:r>
-        <w:t>GO</w:t>
-      </w:r>
-    </w:p>
-    <w:p>
-      <w:r>
-        <w:br/>
-      </w:r>
-    </w:p>
-    <w:p/>
-    <w:p/>
-    <w:p/>
+      <w:r>
+        <w:t xml:space="preserve"> reference something that doesn’t exist). Every table has a primary key, and foreign keys enforce the relationships from the ERD. UNIQUE constraints enforce other rules (e.g. UQ_Tile_Position stops 2 tiles occupying the same space, UQ_Nest_Player ensures there is only one nest per player, CK_Item_OneLocation makes sure that an item is always on a tile, held by a player or in a nest, etc.).</w:t>
+      </w:r>
+    </w:p>
+    <w:p>
+      <w:r>
+        <w:t xml:space="preserve">Only 2 relationships cascade when deleting. Deleting a player removes their nest and chatmessage rows. All other foreign keys use NO ACTION. This is because ITEM is reachable from PLAYER through 2 cascading paths (through HolderPlayerID and through NEST.PlayerID -&gt; NEST -&gt; ITEM.NestID). </w:t>
+      </w:r>
+      <w:proofErr w:type="gramStart"/>
+      <w:r>
+        <w:t>So</w:t>
+      </w:r>
+      <w:proofErr w:type="gramEnd"/>
+      <w:r>
+        <w:t xml:space="preserve"> there isn’t a single </w:t>
+      </w:r>
+      <w:r>
+        <w:t xml:space="preserve">order of deletes. Instead, item deletion is done by the application/procedure logic. </w:t>
+      </w:r>
+    </w:p>
+    <w:p>
+      <w:r>
+        <w:t>Indexes were made on columns that will be queried often during the gameplay.</w:t>
+      </w:r>
+    </w:p>
+    <w:p>
+      <w:pPr>
+        <w:pStyle w:val="Heading1"/>
+      </w:pPr>
+      <w:bookmarkStart w:id="6" w:name="_Toc239371845"/>
+      <w:r>
+        <w:t>5. Create a prototype C# .net application using Visual Studio</w:t>
+      </w:r>
+      <w:r>
+        <w:t>:</w:t>
+      </w:r>
+      <w:bookmarkEnd w:id="6"/>
+    </w:p>
+    <w:p>
+      <w:r>
+        <w:t>Instructions for how to set up and test the application are in the README in the same folder that this word document is in.</w:t>
+      </w:r>
+    </w:p>
     <w:p/>
     <w:p/>
     <w:p/>
@@ -9450,6 +7704,7 @@
   <w:style w:type="character" w:default="1" w:styleId="DefaultParagraphFont">
     <w:name w:val="Default Paragraph Font"/>
     <w:uiPriority w:val="1"/>
+    <w:semiHidden/>
     <w:unhideWhenUsed/>
   </w:style>
   <w:style w:type="table" w:default="1" w:styleId="TableNormal">
@@ -9881,20 +8136,6 @@
       </w:tblBorders>
     </w:tblPr>
   </w:style>
-  <w:style w:type="paragraph" w:customStyle="1" w:styleId="msonormal0">
-    <w:name w:val="msonormal"/>
-    <w:basedOn w:val="Normal"/>
-    <w:rsid w:val="00C3577B"/>
-    <w:pPr>
-      <w:spacing w:before="100" w:beforeAutospacing="1" w:after="100" w:afterAutospacing="1" w:line="240" w:lineRule="auto"/>
-    </w:pPr>
-    <w:rPr>
-      <w:rFonts w:ascii="Times New Roman" w:eastAsia="Times New Roman" w:hAnsi="Times New Roman" w:cs="Times New Roman"/>
-      <w:kern w:val="0"/>
-      <w:lang w:eastAsia="en-NZ"/>
-      <w14:ligatures w14:val="none"/>
-    </w:rPr>
-  </w:style>
 </w:styles>
 </file>
 

</xml_diff>